<commit_message>
Rebuild the table of contents in college dotted-leader format.
Use the chapter page map from the black-book (1–91), start references at 92, and list annexures as 95–102. Export a standalone Word TOC for Google Docs.

Co-authored-by: omkeluskar <omkeluskar@users.noreply.github.com>
</commit_message>
<xml_diff>
--- a/cep-iot-bus-stop/chapters/Front_Matter.docx
+++ b/cep-iot-bus-stop/chapters/Front_Matter.docx
@@ -556,7 +556,7 @@
     </w:p>
     <w:p>
       <w:pPr>
-        <w:spacing w:before="0" w:after="240" w:line="320" w:lineRule="exact"/>
+        <w:spacing w:before="0" w:after="280" w:line="440" w:lineRule="exact"/>
         <w:jc w:val="center"/>
       </w:pPr>
       <w:r>
@@ -572,9 +572,9 @@
     <w:p>
       <w:pPr>
         <w:tabs>
-          <w:tab w:pos="9071" w:val="right" w:leader="dot"/>
+          <w:tab w:pos="9184" w:val="right" w:leader="dot"/>
         </w:tabs>
-        <w:spacing w:before="20" w:after="20" w:line="320" w:lineRule="exact"/>
+        <w:spacing w:before="0" w:after="40" w:line="360" w:lineRule="exact"/>
         <w:jc w:val="left"/>
       </w:pPr>
       <w:r>
@@ -600,20 +600,29 @@
     <w:p>
       <w:pPr>
         <w:tabs>
-          <w:tab w:pos="9071" w:val="right" w:leader="dot"/>
+          <w:tab w:pos="9184" w:val="right" w:leader="dot"/>
         </w:tabs>
-        <w:spacing w:before="20" w:after="20" w:line="320" w:lineRule="exact"/>
-        <w:ind w:left="340"/>
+        <w:spacing w:before="0" w:after="40" w:line="360" w:lineRule="exact"/>
+        <w:ind w:left="397"/>
         <w:jc w:val="left"/>
       </w:pPr>
       <w:r>
         <w:rPr>
           <w:rFonts w:ascii="Times New Roman" w:hAnsi="Times New Roman" w:eastAsia="Times New Roman"/>
+          <w:b/>
+          <w:i w:val="0"/>
+          <w:sz w:val="24"/>
+        </w:rPr>
+        <w:t xml:space="preserve">1.1. </w:t>
+      </w:r>
+      <w:r>
+        <w:rPr>
+          <w:rFonts w:ascii="Times New Roman" w:hAnsi="Times New Roman" w:eastAsia="Times New Roman"/>
           <w:b w:val="0"/>
           <w:i w:val="0"/>
           <w:sz w:val="24"/>
         </w:rPr>
-        <w:t>1.1. Project Background</w:t>
+        <w:t>Project Background</w:t>
       </w:r>
       <w:r>
         <w:rPr>
@@ -629,20 +638,29 @@
     <w:p>
       <w:pPr>
         <w:tabs>
-          <w:tab w:pos="9071" w:val="right" w:leader="dot"/>
+          <w:tab w:pos="9184" w:val="right" w:leader="dot"/>
         </w:tabs>
-        <w:spacing w:before="20" w:after="20" w:line="320" w:lineRule="exact"/>
-        <w:ind w:left="340"/>
+        <w:spacing w:before="0" w:after="40" w:line="360" w:lineRule="exact"/>
+        <w:ind w:left="397"/>
         <w:jc w:val="left"/>
       </w:pPr>
       <w:r>
         <w:rPr>
           <w:rFonts w:ascii="Times New Roman" w:hAnsi="Times New Roman" w:eastAsia="Times New Roman"/>
+          <w:b/>
+          <w:i w:val="0"/>
+          <w:sz w:val="24"/>
+        </w:rPr>
+        <w:t xml:space="preserve">1.2. </w:t>
+      </w:r>
+      <w:r>
+        <w:rPr>
+          <w:rFonts w:ascii="Times New Roman" w:hAnsi="Times New Roman" w:eastAsia="Times New Roman"/>
           <w:b w:val="0"/>
           <w:i w:val="0"/>
           <w:sz w:val="24"/>
         </w:rPr>
-        <w:t>1.2. Community Problem Identification</w:t>
+        <w:t>Community Problem Identification</w:t>
       </w:r>
       <w:r>
         <w:rPr>
@@ -658,20 +676,29 @@
     <w:p>
       <w:pPr>
         <w:tabs>
-          <w:tab w:pos="9071" w:val="right" w:leader="dot"/>
+          <w:tab w:pos="9184" w:val="right" w:leader="dot"/>
         </w:tabs>
-        <w:spacing w:before="20" w:after="20" w:line="320" w:lineRule="exact"/>
-        <w:ind w:left="340"/>
+        <w:spacing w:before="0" w:after="40" w:line="360" w:lineRule="exact"/>
+        <w:ind w:left="397"/>
         <w:jc w:val="left"/>
       </w:pPr>
       <w:r>
         <w:rPr>
           <w:rFonts w:ascii="Times New Roman" w:hAnsi="Times New Roman" w:eastAsia="Times New Roman"/>
+          <w:b/>
+          <w:i w:val="0"/>
+          <w:sz w:val="24"/>
+        </w:rPr>
+        <w:t xml:space="preserve">1.3. </w:t>
+      </w:r>
+      <w:r>
+        <w:rPr>
+          <w:rFonts w:ascii="Times New Roman" w:hAnsi="Times New Roman" w:eastAsia="Times New Roman"/>
           <w:b w:val="0"/>
           <w:i w:val="0"/>
           <w:sz w:val="24"/>
         </w:rPr>
-        <w:t>1.3. Community Need Assessment</w:t>
+        <w:t>Community Need Assessment</w:t>
       </w:r>
       <w:r>
         <w:rPr>
@@ -687,20 +714,29 @@
     <w:p>
       <w:pPr>
         <w:tabs>
-          <w:tab w:pos="9071" w:val="right" w:leader="dot"/>
+          <w:tab w:pos="9184" w:val="right" w:leader="dot"/>
         </w:tabs>
-        <w:spacing w:before="20" w:after="20" w:line="320" w:lineRule="exact"/>
-        <w:ind w:left="340"/>
+        <w:spacing w:before="0" w:after="40" w:line="360" w:lineRule="exact"/>
+        <w:ind w:left="397"/>
         <w:jc w:val="left"/>
       </w:pPr>
       <w:r>
         <w:rPr>
           <w:rFonts w:ascii="Times New Roman" w:hAnsi="Times New Roman" w:eastAsia="Times New Roman"/>
+          <w:b/>
+          <w:i w:val="0"/>
+          <w:sz w:val="24"/>
+        </w:rPr>
+        <w:t xml:space="preserve">1.4. </w:t>
+      </w:r>
+      <w:r>
+        <w:rPr>
+          <w:rFonts w:ascii="Times New Roman" w:hAnsi="Times New Roman" w:eastAsia="Times New Roman"/>
           <w:b w:val="0"/>
           <w:i w:val="0"/>
           <w:sz w:val="24"/>
         </w:rPr>
-        <w:t>1.4. Existing System Analysis</w:t>
+        <w:t>Existing System Analysis</w:t>
       </w:r>
       <w:r>
         <w:rPr>
@@ -716,20 +752,29 @@
     <w:p>
       <w:pPr>
         <w:tabs>
-          <w:tab w:pos="9071" w:val="right" w:leader="dot"/>
+          <w:tab w:pos="9184" w:val="right" w:leader="dot"/>
         </w:tabs>
-        <w:spacing w:before="20" w:after="20" w:line="320" w:lineRule="exact"/>
-        <w:ind w:left="340"/>
+        <w:spacing w:before="0" w:after="40" w:line="360" w:lineRule="exact"/>
+        <w:ind w:left="397"/>
         <w:jc w:val="left"/>
       </w:pPr>
       <w:r>
         <w:rPr>
           <w:rFonts w:ascii="Times New Roman" w:hAnsi="Times New Roman" w:eastAsia="Times New Roman"/>
+          <w:b/>
+          <w:i w:val="0"/>
+          <w:sz w:val="24"/>
+        </w:rPr>
+        <w:t xml:space="preserve">1.5. </w:t>
+      </w:r>
+      <w:r>
+        <w:rPr>
+          <w:rFonts w:ascii="Times New Roman" w:hAnsi="Times New Roman" w:eastAsia="Times New Roman"/>
           <w:b w:val="0"/>
           <w:i w:val="0"/>
           <w:sz w:val="24"/>
         </w:rPr>
-        <w:t>1.5. Problem Statement</w:t>
+        <w:t>Problem Statement</w:t>
       </w:r>
       <w:r>
         <w:rPr>
@@ -745,20 +790,29 @@
     <w:p>
       <w:pPr>
         <w:tabs>
-          <w:tab w:pos="9071" w:val="right" w:leader="dot"/>
+          <w:tab w:pos="9184" w:val="right" w:leader="dot"/>
         </w:tabs>
-        <w:spacing w:before="20" w:after="20" w:line="320" w:lineRule="exact"/>
-        <w:ind w:left="340"/>
+        <w:spacing w:before="0" w:after="40" w:line="360" w:lineRule="exact"/>
+        <w:ind w:left="397"/>
         <w:jc w:val="left"/>
       </w:pPr>
       <w:r>
         <w:rPr>
           <w:rFonts w:ascii="Times New Roman" w:hAnsi="Times New Roman" w:eastAsia="Times New Roman"/>
+          <w:b/>
+          <w:i w:val="0"/>
+          <w:sz w:val="24"/>
+        </w:rPr>
+        <w:t xml:space="preserve">1.6. </w:t>
+      </w:r>
+      <w:r>
+        <w:rPr>
+          <w:rFonts w:ascii="Times New Roman" w:hAnsi="Times New Roman" w:eastAsia="Times New Roman"/>
           <w:b w:val="0"/>
           <w:i w:val="0"/>
           <w:sz w:val="24"/>
         </w:rPr>
-        <w:t>1.6. Proposed Solution</w:t>
+        <w:t>Proposed Solution</w:t>
       </w:r>
       <w:r>
         <w:rPr>
@@ -774,20 +828,29 @@
     <w:p>
       <w:pPr>
         <w:tabs>
-          <w:tab w:pos="9071" w:val="right" w:leader="dot"/>
+          <w:tab w:pos="9184" w:val="right" w:leader="dot"/>
         </w:tabs>
-        <w:spacing w:before="20" w:after="20" w:line="320" w:lineRule="exact"/>
-        <w:ind w:left="340"/>
+        <w:spacing w:before="0" w:after="40" w:line="360" w:lineRule="exact"/>
+        <w:ind w:left="397"/>
         <w:jc w:val="left"/>
       </w:pPr>
       <w:r>
         <w:rPr>
           <w:rFonts w:ascii="Times New Roman" w:hAnsi="Times New Roman" w:eastAsia="Times New Roman"/>
+          <w:b/>
+          <w:i w:val="0"/>
+          <w:sz w:val="24"/>
+        </w:rPr>
+        <w:t xml:space="preserve">1.7. </w:t>
+      </w:r>
+      <w:r>
+        <w:rPr>
+          <w:rFonts w:ascii="Times New Roman" w:hAnsi="Times New Roman" w:eastAsia="Times New Roman"/>
           <w:b w:val="0"/>
           <w:i w:val="0"/>
           <w:sz w:val="24"/>
         </w:rPr>
-        <w:t>1.7. Aim and Objectives</w:t>
+        <w:t>Aim and Objectives</w:t>
       </w:r>
       <w:r>
         <w:rPr>
@@ -803,20 +866,29 @@
     <w:p>
       <w:pPr>
         <w:tabs>
-          <w:tab w:pos="9071" w:val="right" w:leader="dot"/>
+          <w:tab w:pos="9184" w:val="right" w:leader="dot"/>
         </w:tabs>
-        <w:spacing w:before="20" w:after="20" w:line="320" w:lineRule="exact"/>
-        <w:ind w:left="340"/>
+        <w:spacing w:before="0" w:after="40" w:line="360" w:lineRule="exact"/>
+        <w:ind w:left="397"/>
         <w:jc w:val="left"/>
       </w:pPr>
       <w:r>
         <w:rPr>
           <w:rFonts w:ascii="Times New Roman" w:hAnsi="Times New Roman" w:eastAsia="Times New Roman"/>
+          <w:b/>
+          <w:i w:val="0"/>
+          <w:sz w:val="24"/>
+        </w:rPr>
+        <w:t xml:space="preserve">1.8. </w:t>
+      </w:r>
+      <w:r>
+        <w:rPr>
+          <w:rFonts w:ascii="Times New Roman" w:hAnsi="Times New Roman" w:eastAsia="Times New Roman"/>
           <w:b w:val="0"/>
           <w:i w:val="0"/>
           <w:sz w:val="24"/>
         </w:rPr>
-        <w:t>1.8. Scope of Project</w:t>
+        <w:t>Scope of Project</w:t>
       </w:r>
       <w:r>
         <w:rPr>
@@ -832,20 +904,29 @@
     <w:p>
       <w:pPr>
         <w:tabs>
-          <w:tab w:pos="9071" w:val="right" w:leader="dot"/>
+          <w:tab w:pos="9184" w:val="right" w:leader="dot"/>
         </w:tabs>
-        <w:spacing w:before="20" w:after="20" w:line="320" w:lineRule="exact"/>
-        <w:ind w:left="340"/>
+        <w:spacing w:before="0" w:after="40" w:line="360" w:lineRule="exact"/>
+        <w:ind w:left="397"/>
         <w:jc w:val="left"/>
       </w:pPr>
       <w:r>
         <w:rPr>
           <w:rFonts w:ascii="Times New Roman" w:hAnsi="Times New Roman" w:eastAsia="Times New Roman"/>
+          <w:b/>
+          <w:i w:val="0"/>
+          <w:sz w:val="24"/>
+        </w:rPr>
+        <w:t xml:space="preserve">1.9. </w:t>
+      </w:r>
+      <w:r>
+        <w:rPr>
+          <w:rFonts w:ascii="Times New Roman" w:hAnsi="Times New Roman" w:eastAsia="Times New Roman"/>
           <w:b w:val="0"/>
           <w:i w:val="0"/>
           <w:sz w:val="24"/>
         </w:rPr>
-        <w:t>1.9. Limitations</w:t>
+        <w:t>Limitations</w:t>
       </w:r>
       <w:r>
         <w:rPr>
@@ -861,20 +942,29 @@
     <w:p>
       <w:pPr>
         <w:tabs>
-          <w:tab w:pos="9071" w:val="right" w:leader="dot"/>
+          <w:tab w:pos="9184" w:val="right" w:leader="dot"/>
         </w:tabs>
-        <w:spacing w:before="20" w:after="20" w:line="320" w:lineRule="exact"/>
-        <w:ind w:left="340"/>
+        <w:spacing w:before="0" w:after="40" w:line="360" w:lineRule="exact"/>
+        <w:ind w:left="397"/>
         <w:jc w:val="left"/>
       </w:pPr>
       <w:r>
         <w:rPr>
           <w:rFonts w:ascii="Times New Roman" w:hAnsi="Times New Roman" w:eastAsia="Times New Roman"/>
+          <w:b/>
+          <w:i w:val="0"/>
+          <w:sz w:val="24"/>
+        </w:rPr>
+        <w:t xml:space="preserve">1.10. </w:t>
+      </w:r>
+      <w:r>
+        <w:rPr>
+          <w:rFonts w:ascii="Times New Roman" w:hAnsi="Times New Roman" w:eastAsia="Times New Roman"/>
           <w:b w:val="0"/>
           <w:i w:val="0"/>
           <w:sz w:val="24"/>
         </w:rPr>
-        <w:t>1.10. Major Modules</w:t>
+        <w:t>Major Modules</w:t>
       </w:r>
       <w:r>
         <w:rPr>
@@ -890,20 +980,29 @@
     <w:p>
       <w:pPr>
         <w:tabs>
-          <w:tab w:pos="9071" w:val="right" w:leader="dot"/>
+          <w:tab w:pos="9184" w:val="right" w:leader="dot"/>
         </w:tabs>
-        <w:spacing w:before="20" w:after="20" w:line="320" w:lineRule="exact"/>
-        <w:ind w:left="340"/>
+        <w:spacing w:before="0" w:after="40" w:line="360" w:lineRule="exact"/>
+        <w:ind w:left="397"/>
         <w:jc w:val="left"/>
       </w:pPr>
       <w:r>
         <w:rPr>
           <w:rFonts w:ascii="Times New Roman" w:hAnsi="Times New Roman" w:eastAsia="Times New Roman"/>
+          <w:b/>
+          <w:i w:val="0"/>
+          <w:sz w:val="24"/>
+        </w:rPr>
+        <w:t xml:space="preserve">1.11. </w:t>
+      </w:r>
+      <w:r>
+        <w:rPr>
+          <w:rFonts w:ascii="Times New Roman" w:hAnsi="Times New Roman" w:eastAsia="Times New Roman"/>
           <w:b w:val="0"/>
           <w:i w:val="0"/>
           <w:sz w:val="24"/>
         </w:rPr>
-        <w:t>1.11. Success Criteria</w:t>
+        <w:t>Success Criteria</w:t>
       </w:r>
       <w:r>
         <w:rPr>
@@ -919,20 +1018,29 @@
     <w:p>
       <w:pPr>
         <w:tabs>
-          <w:tab w:pos="9071" w:val="right" w:leader="dot"/>
+          <w:tab w:pos="9184" w:val="right" w:leader="dot"/>
         </w:tabs>
-        <w:spacing w:before="20" w:after="20" w:line="320" w:lineRule="exact"/>
-        <w:ind w:left="340"/>
+        <w:spacing w:before="0" w:after="40" w:line="360" w:lineRule="exact"/>
+        <w:ind w:left="397"/>
         <w:jc w:val="left"/>
       </w:pPr>
       <w:r>
         <w:rPr>
           <w:rFonts w:ascii="Times New Roman" w:hAnsi="Times New Roman" w:eastAsia="Times New Roman"/>
+          <w:b/>
+          <w:i w:val="0"/>
+          <w:sz w:val="24"/>
+        </w:rPr>
+        <w:t xml:space="preserve">1.12. </w:t>
+      </w:r>
+      <w:r>
+        <w:rPr>
+          <w:rFonts w:ascii="Times New Roman" w:hAnsi="Times New Roman" w:eastAsia="Times New Roman"/>
           <w:b w:val="0"/>
           <w:i w:val="0"/>
           <w:sz w:val="24"/>
         </w:rPr>
-        <w:t>1.12. Expected Outcomes</w:t>
+        <w:t>Expected Outcomes</w:t>
       </w:r>
       <w:r>
         <w:rPr>
@@ -948,20 +1056,29 @@
     <w:p>
       <w:pPr>
         <w:tabs>
-          <w:tab w:pos="9071" w:val="right" w:leader="dot"/>
+          <w:tab w:pos="9184" w:val="right" w:leader="dot"/>
         </w:tabs>
-        <w:spacing w:before="20" w:after="20" w:line="320" w:lineRule="exact"/>
-        <w:ind w:left="340"/>
+        <w:spacing w:before="0" w:after="40" w:line="360" w:lineRule="exact"/>
+        <w:ind w:left="397"/>
         <w:jc w:val="left"/>
       </w:pPr>
       <w:r>
         <w:rPr>
           <w:rFonts w:ascii="Times New Roman" w:hAnsi="Times New Roman" w:eastAsia="Times New Roman"/>
+          <w:b/>
+          <w:i w:val="0"/>
+          <w:sz w:val="24"/>
+        </w:rPr>
+        <w:t xml:space="preserve">1.13. </w:t>
+      </w:r>
+      <w:r>
+        <w:rPr>
+          <w:rFonts w:ascii="Times New Roman" w:hAnsi="Times New Roman" w:eastAsia="Times New Roman"/>
           <w:b w:val="0"/>
           <w:i w:val="0"/>
           <w:sz w:val="24"/>
         </w:rPr>
-        <w:t>1.13. Chapter Summary</w:t>
+        <w:t>Chapter Summary</w:t>
       </w:r>
       <w:r>
         <w:rPr>
@@ -972,14 +1089,28 @@
         </w:rPr>
         <w:tab/>
         <w:t>10</w:t>
+      </w:r>
+    </w:p>
+    <w:p>
+      <w:pPr>
+        <w:spacing w:before="0" w:after="80" w:line="160" w:lineRule="exact"/>
+        <w:jc w:val="center"/>
+      </w:pPr>
+      <w:r>
+        <w:rPr>
+          <w:rFonts w:ascii="Times New Roman" w:hAnsi="Times New Roman" w:eastAsia="Times New Roman"/>
+          <w:b w:val="0"/>
+          <w:i w:val="0"/>
+          <w:sz w:val="12"/>
+        </w:rPr>
       </w:r>
     </w:p>
     <w:p>
       <w:pPr>
         <w:tabs>
-          <w:tab w:pos="9071" w:val="right" w:leader="dot"/>
+          <w:tab w:pos="9184" w:val="right" w:leader="dot"/>
         </w:tabs>
-        <w:spacing w:before="20" w:after="20" w:line="320" w:lineRule="exact"/>
+        <w:spacing w:before="0" w:after="40" w:line="360" w:lineRule="exact"/>
         <w:jc w:val="left"/>
       </w:pPr>
       <w:r>
@@ -1005,20 +1136,29 @@
     <w:p>
       <w:pPr>
         <w:tabs>
-          <w:tab w:pos="9071" w:val="right" w:leader="dot"/>
+          <w:tab w:pos="9184" w:val="right" w:leader="dot"/>
         </w:tabs>
-        <w:spacing w:before="20" w:after="20" w:line="320" w:lineRule="exact"/>
-        <w:ind w:left="340"/>
+        <w:spacing w:before="0" w:after="40" w:line="360" w:lineRule="exact"/>
+        <w:ind w:left="397"/>
         <w:jc w:val="left"/>
       </w:pPr>
       <w:r>
         <w:rPr>
           <w:rFonts w:ascii="Times New Roman" w:hAnsi="Times New Roman" w:eastAsia="Times New Roman"/>
+          <w:b/>
+          <w:i w:val="0"/>
+          <w:sz w:val="24"/>
+        </w:rPr>
+        <w:t xml:space="preserve">2.1. </w:t>
+      </w:r>
+      <w:r>
+        <w:rPr>
+          <w:rFonts w:ascii="Times New Roman" w:hAnsi="Times New Roman" w:eastAsia="Times New Roman"/>
           <w:b w:val="0"/>
           <w:i w:val="0"/>
           <w:sz w:val="24"/>
         </w:rPr>
-        <w:t>2.1. Introduction</w:t>
+        <w:t>Introduction</w:t>
       </w:r>
       <w:r>
         <w:rPr>
@@ -1034,20 +1174,29 @@
     <w:p>
       <w:pPr>
         <w:tabs>
-          <w:tab w:pos="9071" w:val="right" w:leader="dot"/>
+          <w:tab w:pos="9184" w:val="right" w:leader="dot"/>
         </w:tabs>
-        <w:spacing w:before="20" w:after="20" w:line="320" w:lineRule="exact"/>
-        <w:ind w:left="340"/>
+        <w:spacing w:before="0" w:after="40" w:line="360" w:lineRule="exact"/>
+        <w:ind w:left="397"/>
         <w:jc w:val="left"/>
       </w:pPr>
       <w:r>
         <w:rPr>
           <w:rFonts w:ascii="Times New Roman" w:hAnsi="Times New Roman" w:eastAsia="Times New Roman"/>
+          <w:b/>
+          <w:i w:val="0"/>
+          <w:sz w:val="24"/>
+        </w:rPr>
+        <w:t xml:space="preserve">2.2. </w:t>
+      </w:r>
+      <w:r>
+        <w:rPr>
+          <w:rFonts w:ascii="Times New Roman" w:hAnsi="Times New Roman" w:eastAsia="Times New Roman"/>
           <w:b w:val="0"/>
           <w:i w:val="0"/>
           <w:sz w:val="24"/>
         </w:rPr>
-        <w:t>2.2. Literature Review</w:t>
+        <w:t>Literature Review</w:t>
       </w:r>
       <w:r>
         <w:rPr>
@@ -1063,20 +1212,29 @@
     <w:p>
       <w:pPr>
         <w:tabs>
-          <w:tab w:pos="9071" w:val="right" w:leader="dot"/>
+          <w:tab w:pos="9184" w:val="right" w:leader="dot"/>
         </w:tabs>
-        <w:spacing w:before="20" w:after="20" w:line="320" w:lineRule="exact"/>
-        <w:ind w:left="340"/>
+        <w:spacing w:before="0" w:after="40" w:line="360" w:lineRule="exact"/>
+        <w:ind w:left="397"/>
         <w:jc w:val="left"/>
       </w:pPr>
       <w:r>
         <w:rPr>
           <w:rFonts w:ascii="Times New Roman" w:hAnsi="Times New Roman" w:eastAsia="Times New Roman"/>
+          <w:b/>
+          <w:i w:val="0"/>
+          <w:sz w:val="24"/>
+        </w:rPr>
+        <w:t xml:space="preserve">2.3. </w:t>
+      </w:r>
+      <w:r>
+        <w:rPr>
+          <w:rFonts w:ascii="Times New Roman" w:hAnsi="Times New Roman" w:eastAsia="Times New Roman"/>
           <w:b w:val="0"/>
           <w:i w:val="0"/>
           <w:sz w:val="24"/>
         </w:rPr>
-        <w:t>2.3. Comparative Analysis</w:t>
+        <w:t>Comparative Analysis</w:t>
       </w:r>
       <w:r>
         <w:rPr>
@@ -1092,20 +1250,29 @@
     <w:p>
       <w:pPr>
         <w:tabs>
-          <w:tab w:pos="9071" w:val="right" w:leader="dot"/>
+          <w:tab w:pos="9184" w:val="right" w:leader="dot"/>
         </w:tabs>
-        <w:spacing w:before="20" w:after="20" w:line="320" w:lineRule="exact"/>
-        <w:ind w:left="340"/>
+        <w:spacing w:before="0" w:after="40" w:line="360" w:lineRule="exact"/>
+        <w:ind w:left="397"/>
         <w:jc w:val="left"/>
       </w:pPr>
       <w:r>
         <w:rPr>
           <w:rFonts w:ascii="Times New Roman" w:hAnsi="Times New Roman" w:eastAsia="Times New Roman"/>
+          <w:b/>
+          <w:i w:val="0"/>
+          <w:sz w:val="24"/>
+        </w:rPr>
+        <w:t xml:space="preserve">2.4. </w:t>
+      </w:r>
+      <w:r>
+        <w:rPr>
+          <w:rFonts w:ascii="Times New Roman" w:hAnsi="Times New Roman" w:eastAsia="Times New Roman"/>
           <w:b w:val="0"/>
           <w:i w:val="0"/>
           <w:sz w:val="24"/>
         </w:rPr>
-        <w:t>2.4. Research Gap Identification</w:t>
+        <w:t>Research Gap Identification</w:t>
       </w:r>
       <w:r>
         <w:rPr>
@@ -1121,20 +1288,29 @@
     <w:p>
       <w:pPr>
         <w:tabs>
-          <w:tab w:pos="9071" w:val="right" w:leader="dot"/>
+          <w:tab w:pos="9184" w:val="right" w:leader="dot"/>
         </w:tabs>
-        <w:spacing w:before="20" w:after="20" w:line="320" w:lineRule="exact"/>
-        <w:ind w:left="340"/>
+        <w:spacing w:before="0" w:after="40" w:line="360" w:lineRule="exact"/>
+        <w:ind w:left="397"/>
         <w:jc w:val="left"/>
       </w:pPr>
       <w:r>
         <w:rPr>
           <w:rFonts w:ascii="Times New Roman" w:hAnsi="Times New Roman" w:eastAsia="Times New Roman"/>
+          <w:b/>
+          <w:i w:val="0"/>
+          <w:sz w:val="24"/>
+        </w:rPr>
+        <w:t xml:space="preserve">2.5. </w:t>
+      </w:r>
+      <w:r>
+        <w:rPr>
+          <w:rFonts w:ascii="Times New Roman" w:hAnsi="Times New Roman" w:eastAsia="Times New Roman"/>
           <w:b w:val="0"/>
           <w:i w:val="0"/>
           <w:sz w:val="24"/>
         </w:rPr>
-        <w:t>2.5. Requirement Gathering</w:t>
+        <w:t>Requirement Gathering</w:t>
       </w:r>
       <w:r>
         <w:rPr>
@@ -1150,20 +1326,29 @@
     <w:p>
       <w:pPr>
         <w:tabs>
-          <w:tab w:pos="9071" w:val="right" w:leader="dot"/>
+          <w:tab w:pos="9184" w:val="right" w:leader="dot"/>
         </w:tabs>
-        <w:spacing w:before="20" w:after="20" w:line="320" w:lineRule="exact"/>
-        <w:ind w:left="340"/>
+        <w:spacing w:before="0" w:after="40" w:line="360" w:lineRule="exact"/>
+        <w:ind w:left="397"/>
         <w:jc w:val="left"/>
       </w:pPr>
       <w:r>
         <w:rPr>
           <w:rFonts w:ascii="Times New Roman" w:hAnsi="Times New Roman" w:eastAsia="Times New Roman"/>
+          <w:b/>
+          <w:i w:val="0"/>
+          <w:sz w:val="24"/>
+        </w:rPr>
+        <w:t xml:space="preserve">2.6. </w:t>
+      </w:r>
+      <w:r>
+        <w:rPr>
+          <w:rFonts w:ascii="Times New Roman" w:hAnsi="Times New Roman" w:eastAsia="Times New Roman"/>
           <w:b w:val="0"/>
           <w:i w:val="0"/>
           <w:sz w:val="24"/>
         </w:rPr>
-        <w:t>2.6. Stakeholder Analysis</w:t>
+        <w:t>Stakeholder Analysis</w:t>
       </w:r>
       <w:r>
         <w:rPr>
@@ -1179,20 +1364,29 @@
     <w:p>
       <w:pPr>
         <w:tabs>
-          <w:tab w:pos="9071" w:val="right" w:leader="dot"/>
+          <w:tab w:pos="9184" w:val="right" w:leader="dot"/>
         </w:tabs>
-        <w:spacing w:before="20" w:after="20" w:line="320" w:lineRule="exact"/>
-        <w:ind w:left="340"/>
+        <w:spacing w:before="0" w:after="40" w:line="360" w:lineRule="exact"/>
+        <w:ind w:left="397"/>
         <w:jc w:val="left"/>
       </w:pPr>
       <w:r>
         <w:rPr>
           <w:rFonts w:ascii="Times New Roman" w:hAnsi="Times New Roman" w:eastAsia="Times New Roman"/>
+          <w:b/>
+          <w:i w:val="0"/>
+          <w:sz w:val="24"/>
+        </w:rPr>
+        <w:t xml:space="preserve">2.7. </w:t>
+      </w:r>
+      <w:r>
+        <w:rPr>
+          <w:rFonts w:ascii="Times New Roman" w:hAnsi="Times New Roman" w:eastAsia="Times New Roman"/>
           <w:b w:val="0"/>
           <w:i w:val="0"/>
           <w:sz w:val="24"/>
         </w:rPr>
-        <w:t>2.7. Functional Requirements</w:t>
+        <w:t>Functional Requirements</w:t>
       </w:r>
       <w:r>
         <w:rPr>
@@ -1208,20 +1402,29 @@
     <w:p>
       <w:pPr>
         <w:tabs>
-          <w:tab w:pos="9071" w:val="right" w:leader="dot"/>
+          <w:tab w:pos="9184" w:val="right" w:leader="dot"/>
         </w:tabs>
-        <w:spacing w:before="20" w:after="20" w:line="320" w:lineRule="exact"/>
-        <w:ind w:left="340"/>
+        <w:spacing w:before="0" w:after="40" w:line="360" w:lineRule="exact"/>
+        <w:ind w:left="397"/>
         <w:jc w:val="left"/>
       </w:pPr>
       <w:r>
         <w:rPr>
           <w:rFonts w:ascii="Times New Roman" w:hAnsi="Times New Roman" w:eastAsia="Times New Roman"/>
+          <w:b/>
+          <w:i w:val="0"/>
+          <w:sz w:val="24"/>
+        </w:rPr>
+        <w:t xml:space="preserve">2.8. </w:t>
+      </w:r>
+      <w:r>
+        <w:rPr>
+          <w:rFonts w:ascii="Times New Roman" w:hAnsi="Times New Roman" w:eastAsia="Times New Roman"/>
           <w:b w:val="0"/>
           <w:i w:val="0"/>
           <w:sz w:val="24"/>
         </w:rPr>
-        <w:t>2.8. Nonfunctional Requirements</w:t>
+        <w:t>Nonfunctional Requirements</w:t>
       </w:r>
       <w:r>
         <w:rPr>
@@ -1237,20 +1440,29 @@
     <w:p>
       <w:pPr>
         <w:tabs>
-          <w:tab w:pos="9071" w:val="right" w:leader="dot"/>
+          <w:tab w:pos="9184" w:val="right" w:leader="dot"/>
         </w:tabs>
-        <w:spacing w:before="20" w:after="20" w:line="320" w:lineRule="exact"/>
-        <w:ind w:left="340"/>
+        <w:spacing w:before="0" w:after="40" w:line="360" w:lineRule="exact"/>
+        <w:ind w:left="397"/>
         <w:jc w:val="left"/>
       </w:pPr>
       <w:r>
         <w:rPr>
           <w:rFonts w:ascii="Times New Roman" w:hAnsi="Times New Roman" w:eastAsia="Times New Roman"/>
+          <w:b/>
+          <w:i w:val="0"/>
+          <w:sz w:val="24"/>
+        </w:rPr>
+        <w:t xml:space="preserve">2.9. </w:t>
+      </w:r>
+      <w:r>
+        <w:rPr>
+          <w:rFonts w:ascii="Times New Roman" w:hAnsi="Times New Roman" w:eastAsia="Times New Roman"/>
           <w:b w:val="0"/>
           <w:i w:val="0"/>
           <w:sz w:val="24"/>
         </w:rPr>
-        <w:t>2.9. Feasibility Study</w:t>
+        <w:t>Feasibility Study</w:t>
       </w:r>
       <w:r>
         <w:rPr>
@@ -1266,20 +1478,29 @@
     <w:p>
       <w:pPr>
         <w:tabs>
-          <w:tab w:pos="9071" w:val="right" w:leader="dot"/>
+          <w:tab w:pos="9184" w:val="right" w:leader="dot"/>
         </w:tabs>
-        <w:spacing w:before="20" w:after="20" w:line="320" w:lineRule="exact"/>
-        <w:ind w:left="340"/>
+        <w:spacing w:before="0" w:after="40" w:line="360" w:lineRule="exact"/>
+        <w:ind w:left="397"/>
         <w:jc w:val="left"/>
       </w:pPr>
       <w:r>
         <w:rPr>
           <w:rFonts w:ascii="Times New Roman" w:hAnsi="Times New Roman" w:eastAsia="Times New Roman"/>
+          <w:b/>
+          <w:i w:val="0"/>
+          <w:sz w:val="24"/>
+        </w:rPr>
+        <w:t xml:space="preserve">2.10. </w:t>
+      </w:r>
+      <w:r>
+        <w:rPr>
+          <w:rFonts w:ascii="Times New Roman" w:hAnsi="Times New Roman" w:eastAsia="Times New Roman"/>
           <w:b w:val="0"/>
           <w:i w:val="0"/>
           <w:sz w:val="24"/>
         </w:rPr>
-        <w:t>2.10. Software Requirements</w:t>
+        <w:t>Software Requirements</w:t>
       </w:r>
       <w:r>
         <w:rPr>
@@ -1295,20 +1516,29 @@
     <w:p>
       <w:pPr>
         <w:tabs>
-          <w:tab w:pos="9071" w:val="right" w:leader="dot"/>
+          <w:tab w:pos="9184" w:val="right" w:leader="dot"/>
         </w:tabs>
-        <w:spacing w:before="20" w:after="20" w:line="320" w:lineRule="exact"/>
-        <w:ind w:left="340"/>
+        <w:spacing w:before="0" w:after="40" w:line="360" w:lineRule="exact"/>
+        <w:ind w:left="397"/>
         <w:jc w:val="left"/>
       </w:pPr>
       <w:r>
         <w:rPr>
           <w:rFonts w:ascii="Times New Roman" w:hAnsi="Times New Roman" w:eastAsia="Times New Roman"/>
+          <w:b/>
+          <w:i w:val="0"/>
+          <w:sz w:val="24"/>
+        </w:rPr>
+        <w:t xml:space="preserve">2.11. </w:t>
+      </w:r>
+      <w:r>
+        <w:rPr>
+          <w:rFonts w:ascii="Times New Roman" w:hAnsi="Times New Roman" w:eastAsia="Times New Roman"/>
           <w:b w:val="0"/>
           <w:i w:val="0"/>
           <w:sz w:val="24"/>
         </w:rPr>
-        <w:t>2.11. Hardware Requirements</w:t>
+        <w:t>Hardware Requirements</w:t>
       </w:r>
       <w:r>
         <w:rPr>
@@ -1324,20 +1554,29 @@
     <w:p>
       <w:pPr>
         <w:tabs>
-          <w:tab w:pos="9071" w:val="right" w:leader="dot"/>
+          <w:tab w:pos="9184" w:val="right" w:leader="dot"/>
         </w:tabs>
-        <w:spacing w:before="20" w:after="20" w:line="320" w:lineRule="exact"/>
-        <w:ind w:left="340"/>
+        <w:spacing w:before="0" w:after="40" w:line="360" w:lineRule="exact"/>
+        <w:ind w:left="397"/>
         <w:jc w:val="left"/>
       </w:pPr>
       <w:r>
         <w:rPr>
           <w:rFonts w:ascii="Times New Roman" w:hAnsi="Times New Roman" w:eastAsia="Times New Roman"/>
+          <w:b/>
+          <w:i w:val="0"/>
+          <w:sz w:val="24"/>
+        </w:rPr>
+        <w:t xml:space="preserve">2.12. </w:t>
+      </w:r>
+      <w:r>
+        <w:rPr>
+          <w:rFonts w:ascii="Times New Roman" w:hAnsi="Times New Roman" w:eastAsia="Times New Roman"/>
           <w:b w:val="0"/>
           <w:i w:val="0"/>
           <w:sz w:val="24"/>
         </w:rPr>
-        <w:t>2.12. Project Schedule</w:t>
+        <w:t>Project Schedule</w:t>
       </w:r>
       <w:r>
         <w:rPr>
@@ -1353,20 +1592,29 @@
     <w:p>
       <w:pPr>
         <w:tabs>
-          <w:tab w:pos="9071" w:val="right" w:leader="dot"/>
+          <w:tab w:pos="9184" w:val="right" w:leader="dot"/>
         </w:tabs>
-        <w:spacing w:before="20" w:after="20" w:line="320" w:lineRule="exact"/>
-        <w:ind w:left="340"/>
+        <w:spacing w:before="0" w:after="40" w:line="360" w:lineRule="exact"/>
+        <w:ind w:left="397"/>
         <w:jc w:val="left"/>
       </w:pPr>
       <w:r>
         <w:rPr>
           <w:rFonts w:ascii="Times New Roman" w:hAnsi="Times New Roman" w:eastAsia="Times New Roman"/>
+          <w:b/>
+          <w:i w:val="0"/>
+          <w:sz w:val="24"/>
+        </w:rPr>
+        <w:t xml:space="preserve">2.13. </w:t>
+      </w:r>
+      <w:r>
+        <w:rPr>
+          <w:rFonts w:ascii="Times New Roman" w:hAnsi="Times New Roman" w:eastAsia="Times New Roman"/>
           <w:b w:val="0"/>
           <w:i w:val="0"/>
           <w:sz w:val="24"/>
         </w:rPr>
-        <w:t>2.13. Development Methodology</w:t>
+        <w:t>Development Methodology</w:t>
       </w:r>
       <w:r>
         <w:rPr>
@@ -1377,14 +1625,33 @@
         </w:rPr>
         <w:tab/>
         <w:t>26</w:t>
+      </w:r>
+    </w:p>
+    <w:p>
+      <w:pPr>
+        <w:spacing w:before="0" w:after="80" w:line="160" w:lineRule="exact"/>
+        <w:jc w:val="center"/>
+      </w:pPr>
+      <w:r>
+        <w:rPr>
+          <w:rFonts w:ascii="Times New Roman" w:hAnsi="Times New Roman" w:eastAsia="Times New Roman"/>
+          <w:b w:val="0"/>
+          <w:i w:val="0"/>
+          <w:sz w:val="12"/>
+        </w:rPr>
+      </w:r>
+    </w:p>
+    <w:p>
+      <w:r>
+        <w:br w:type="page"/>
       </w:r>
     </w:p>
     <w:p>
       <w:pPr>
         <w:tabs>
-          <w:tab w:pos="9071" w:val="right" w:leader="dot"/>
+          <w:tab w:pos="9184" w:val="right" w:leader="dot"/>
         </w:tabs>
-        <w:spacing w:before="20" w:after="20" w:line="320" w:lineRule="exact"/>
+        <w:spacing w:before="0" w:after="40" w:line="360" w:lineRule="exact"/>
         <w:jc w:val="left"/>
       </w:pPr>
       <w:r>
@@ -1410,20 +1677,29 @@
     <w:p>
       <w:pPr>
         <w:tabs>
-          <w:tab w:pos="9071" w:val="right" w:leader="dot"/>
+          <w:tab w:pos="9184" w:val="right" w:leader="dot"/>
         </w:tabs>
-        <w:spacing w:before="20" w:after="20" w:line="320" w:lineRule="exact"/>
-        <w:ind w:left="340"/>
+        <w:spacing w:before="0" w:after="40" w:line="360" w:lineRule="exact"/>
+        <w:ind w:left="397"/>
         <w:jc w:val="left"/>
       </w:pPr>
       <w:r>
         <w:rPr>
           <w:rFonts w:ascii="Times New Roman" w:hAnsi="Times New Roman" w:eastAsia="Times New Roman"/>
+          <w:b/>
+          <w:i w:val="0"/>
+          <w:sz w:val="24"/>
+        </w:rPr>
+        <w:t xml:space="preserve">3.1. </w:t>
+      </w:r>
+      <w:r>
+        <w:rPr>
+          <w:rFonts w:ascii="Times New Roman" w:hAnsi="Times New Roman" w:eastAsia="Times New Roman"/>
           <w:b w:val="0"/>
           <w:i w:val="0"/>
           <w:sz w:val="24"/>
         </w:rPr>
-        <w:t>3.1. System Architecture</w:t>
+        <w:t>System Architecture</w:t>
       </w:r>
       <w:r>
         <w:rPr>
@@ -1439,20 +1715,29 @@
     <w:p>
       <w:pPr>
         <w:tabs>
-          <w:tab w:pos="9071" w:val="right" w:leader="dot"/>
+          <w:tab w:pos="9184" w:val="right" w:leader="dot"/>
         </w:tabs>
-        <w:spacing w:before="20" w:after="20" w:line="320" w:lineRule="exact"/>
-        <w:ind w:left="340"/>
+        <w:spacing w:before="0" w:after="40" w:line="360" w:lineRule="exact"/>
+        <w:ind w:left="397"/>
         <w:jc w:val="left"/>
       </w:pPr>
       <w:r>
         <w:rPr>
           <w:rFonts w:ascii="Times New Roman" w:hAnsi="Times New Roman" w:eastAsia="Times New Roman"/>
+          <w:b/>
+          <w:i w:val="0"/>
+          <w:sz w:val="24"/>
+        </w:rPr>
+        <w:t xml:space="preserve">3.2. </w:t>
+      </w:r>
+      <w:r>
+        <w:rPr>
+          <w:rFonts w:ascii="Times New Roman" w:hAnsi="Times New Roman" w:eastAsia="Times New Roman"/>
           <w:b w:val="0"/>
           <w:i w:val="0"/>
           <w:sz w:val="24"/>
         </w:rPr>
-        <w:t>3.2. System Workflow</w:t>
+        <w:t>System Workflow</w:t>
       </w:r>
       <w:r>
         <w:rPr>
@@ -1468,20 +1753,29 @@
     <w:p>
       <w:pPr>
         <w:tabs>
-          <w:tab w:pos="9071" w:val="right" w:leader="dot"/>
+          <w:tab w:pos="9184" w:val="right" w:leader="dot"/>
         </w:tabs>
-        <w:spacing w:before="20" w:after="20" w:line="320" w:lineRule="exact"/>
-        <w:ind w:left="340"/>
+        <w:spacing w:before="0" w:after="40" w:line="360" w:lineRule="exact"/>
+        <w:ind w:left="397"/>
         <w:jc w:val="left"/>
       </w:pPr>
       <w:r>
         <w:rPr>
           <w:rFonts w:ascii="Times New Roman" w:hAnsi="Times New Roman" w:eastAsia="Times New Roman"/>
+          <w:b/>
+          <w:i w:val="0"/>
+          <w:sz w:val="24"/>
+        </w:rPr>
+        <w:t xml:space="preserve">3.3. </w:t>
+      </w:r>
+      <w:r>
+        <w:rPr>
+          <w:rFonts w:ascii="Times New Roman" w:hAnsi="Times New Roman" w:eastAsia="Times New Roman"/>
           <w:b w:val="0"/>
           <w:i w:val="0"/>
           <w:sz w:val="24"/>
         </w:rPr>
-        <w:t>3.3. Block Diagram</w:t>
+        <w:t>Block Diagram</w:t>
       </w:r>
       <w:r>
         <w:rPr>
@@ -1497,20 +1791,29 @@
     <w:p>
       <w:pPr>
         <w:tabs>
-          <w:tab w:pos="9071" w:val="right" w:leader="dot"/>
+          <w:tab w:pos="9184" w:val="right" w:leader="dot"/>
         </w:tabs>
-        <w:spacing w:before="20" w:after="20" w:line="320" w:lineRule="exact"/>
-        <w:ind w:left="340"/>
+        <w:spacing w:before="0" w:after="40" w:line="360" w:lineRule="exact"/>
+        <w:ind w:left="397"/>
         <w:jc w:val="left"/>
       </w:pPr>
       <w:r>
         <w:rPr>
           <w:rFonts w:ascii="Times New Roman" w:hAnsi="Times New Roman" w:eastAsia="Times New Roman"/>
+          <w:b/>
+          <w:i w:val="0"/>
+          <w:sz w:val="24"/>
+        </w:rPr>
+        <w:t xml:space="preserve">3.4. </w:t>
+      </w:r>
+      <w:r>
+        <w:rPr>
+          <w:rFonts w:ascii="Times New Roman" w:hAnsi="Times New Roman" w:eastAsia="Times New Roman"/>
           <w:b w:val="0"/>
           <w:i w:val="0"/>
           <w:sz w:val="24"/>
         </w:rPr>
-        <w:t>3.4. Functional Flow Diagram</w:t>
+        <w:t>Functional Flow Diagram</w:t>
       </w:r>
       <w:r>
         <w:rPr>
@@ -1526,20 +1829,29 @@
     <w:p>
       <w:pPr>
         <w:tabs>
-          <w:tab w:pos="9071" w:val="right" w:leader="dot"/>
+          <w:tab w:pos="9184" w:val="right" w:leader="dot"/>
         </w:tabs>
-        <w:spacing w:before="20" w:after="20" w:line="320" w:lineRule="exact"/>
-        <w:ind w:left="340"/>
+        <w:spacing w:before="0" w:after="40" w:line="360" w:lineRule="exact"/>
+        <w:ind w:left="397"/>
         <w:jc w:val="left"/>
       </w:pPr>
       <w:r>
         <w:rPr>
           <w:rFonts w:ascii="Times New Roman" w:hAnsi="Times New Roman" w:eastAsia="Times New Roman"/>
+          <w:b/>
+          <w:i w:val="0"/>
+          <w:sz w:val="24"/>
+        </w:rPr>
+        <w:t xml:space="preserve">3.5. </w:t>
+      </w:r>
+      <w:r>
+        <w:rPr>
+          <w:rFonts w:ascii="Times New Roman" w:hAnsi="Times New Roman" w:eastAsia="Times New Roman"/>
           <w:b w:val="0"/>
           <w:i w:val="0"/>
           <w:sz w:val="24"/>
         </w:rPr>
-        <w:t>3.5. Circuit Diagram</w:t>
+        <w:t>Circuit Diagram</w:t>
       </w:r>
       <w:r>
         <w:rPr>
@@ -1555,20 +1867,29 @@
     <w:p>
       <w:pPr>
         <w:tabs>
-          <w:tab w:pos="9071" w:val="right" w:leader="dot"/>
+          <w:tab w:pos="9184" w:val="right" w:leader="dot"/>
         </w:tabs>
-        <w:spacing w:before="20" w:after="20" w:line="320" w:lineRule="exact"/>
-        <w:ind w:left="340"/>
+        <w:spacing w:before="0" w:after="40" w:line="360" w:lineRule="exact"/>
+        <w:ind w:left="397"/>
         <w:jc w:val="left"/>
       </w:pPr>
       <w:r>
         <w:rPr>
           <w:rFonts w:ascii="Times New Roman" w:hAnsi="Times New Roman" w:eastAsia="Times New Roman"/>
+          <w:b/>
+          <w:i w:val="0"/>
+          <w:sz w:val="24"/>
+        </w:rPr>
+        <w:t xml:space="preserve">3.6. </w:t>
+      </w:r>
+      <w:r>
+        <w:rPr>
+          <w:rFonts w:ascii="Times New Roman" w:hAnsi="Times New Roman" w:eastAsia="Times New Roman"/>
           <w:b w:val="0"/>
           <w:i w:val="0"/>
           <w:sz w:val="24"/>
         </w:rPr>
-        <w:t>3.6. Component Interconnection Diagram</w:t>
+        <w:t>Component Interconnection Diagram</w:t>
       </w:r>
       <w:r>
         <w:rPr>
@@ -1584,20 +1905,29 @@
     <w:p>
       <w:pPr>
         <w:tabs>
-          <w:tab w:pos="9071" w:val="right" w:leader="dot"/>
+          <w:tab w:pos="9184" w:val="right" w:leader="dot"/>
         </w:tabs>
-        <w:spacing w:before="20" w:after="20" w:line="320" w:lineRule="exact"/>
-        <w:ind w:left="340"/>
+        <w:spacing w:before="0" w:after="40" w:line="360" w:lineRule="exact"/>
+        <w:ind w:left="397"/>
         <w:jc w:val="left"/>
       </w:pPr>
       <w:r>
         <w:rPr>
           <w:rFonts w:ascii="Times New Roman" w:hAnsi="Times New Roman" w:eastAsia="Times New Roman"/>
+          <w:b/>
+          <w:i w:val="0"/>
+          <w:sz w:val="24"/>
+        </w:rPr>
+        <w:t xml:space="preserve">3.7. </w:t>
+      </w:r>
+      <w:r>
+        <w:rPr>
+          <w:rFonts w:ascii="Times New Roman" w:hAnsi="Times New Roman" w:eastAsia="Times New Roman"/>
           <w:b w:val="0"/>
           <w:i w:val="0"/>
           <w:sz w:val="24"/>
         </w:rPr>
-        <w:t>3.7. Hardware Module Design</w:t>
+        <w:t>Hardware Module Design</w:t>
       </w:r>
       <w:r>
         <w:rPr>
@@ -1613,20 +1943,29 @@
     <w:p>
       <w:pPr>
         <w:tabs>
-          <w:tab w:pos="9071" w:val="right" w:leader="dot"/>
+          <w:tab w:pos="9184" w:val="right" w:leader="dot"/>
         </w:tabs>
-        <w:spacing w:before="20" w:after="20" w:line="320" w:lineRule="exact"/>
-        <w:ind w:left="340"/>
+        <w:spacing w:before="0" w:after="40" w:line="360" w:lineRule="exact"/>
+        <w:ind w:left="397"/>
         <w:jc w:val="left"/>
       </w:pPr>
       <w:r>
         <w:rPr>
           <w:rFonts w:ascii="Times New Roman" w:hAnsi="Times New Roman" w:eastAsia="Times New Roman"/>
+          <w:b/>
+          <w:i w:val="0"/>
+          <w:sz w:val="24"/>
+        </w:rPr>
+        <w:t xml:space="preserve">3.8. </w:t>
+      </w:r>
+      <w:r>
+        <w:rPr>
+          <w:rFonts w:ascii="Times New Roman" w:hAnsi="Times New Roman" w:eastAsia="Times New Roman"/>
           <w:b w:val="0"/>
           <w:i w:val="0"/>
           <w:sz w:val="24"/>
         </w:rPr>
-        <w:t>3.8. Data Flow &amp; Processing Logic</w:t>
+        <w:t>Data Flow &amp; Processing Logic</w:t>
       </w:r>
       <w:r>
         <w:rPr>
@@ -1642,20 +1981,29 @@
     <w:p>
       <w:pPr>
         <w:tabs>
-          <w:tab w:pos="9071" w:val="right" w:leader="dot"/>
+          <w:tab w:pos="9184" w:val="right" w:leader="dot"/>
         </w:tabs>
-        <w:spacing w:before="20" w:after="20" w:line="320" w:lineRule="exact"/>
-        <w:ind w:left="340"/>
+        <w:spacing w:before="0" w:after="40" w:line="360" w:lineRule="exact"/>
+        <w:ind w:left="397"/>
         <w:jc w:val="left"/>
       </w:pPr>
       <w:r>
         <w:rPr>
           <w:rFonts w:ascii="Times New Roman" w:hAnsi="Times New Roman" w:eastAsia="Times New Roman"/>
+          <w:b/>
+          <w:i w:val="0"/>
+          <w:sz w:val="24"/>
+        </w:rPr>
+        <w:t xml:space="preserve">3.9. </w:t>
+      </w:r>
+      <w:r>
+        <w:rPr>
+          <w:rFonts w:ascii="Times New Roman" w:hAnsi="Times New Roman" w:eastAsia="Times New Roman"/>
           <w:b w:val="0"/>
           <w:i w:val="0"/>
           <w:sz w:val="24"/>
         </w:rPr>
-        <w:t>3.9. Database Design (if applicable)</w:t>
+        <w:t>Database Design (if applicable)</w:t>
       </w:r>
       <w:r>
         <w:rPr>
@@ -1671,20 +2019,29 @@
     <w:p>
       <w:pPr>
         <w:tabs>
-          <w:tab w:pos="9071" w:val="right" w:leader="dot"/>
+          <w:tab w:pos="9184" w:val="right" w:leader="dot"/>
         </w:tabs>
-        <w:spacing w:before="20" w:after="20" w:line="320" w:lineRule="exact"/>
-        <w:ind w:left="340"/>
+        <w:spacing w:before="0" w:after="40" w:line="360" w:lineRule="exact"/>
+        <w:ind w:left="397"/>
         <w:jc w:val="left"/>
       </w:pPr>
       <w:r>
         <w:rPr>
           <w:rFonts w:ascii="Times New Roman" w:hAnsi="Times New Roman" w:eastAsia="Times New Roman"/>
+          <w:b/>
+          <w:i w:val="0"/>
+          <w:sz w:val="24"/>
+        </w:rPr>
+        <w:t xml:space="preserve">3.10. </w:t>
+      </w:r>
+      <w:r>
+        <w:rPr>
+          <w:rFonts w:ascii="Times New Roman" w:hAnsi="Times New Roman" w:eastAsia="Times New Roman"/>
           <w:b w:val="0"/>
           <w:i w:val="0"/>
           <w:sz w:val="24"/>
         </w:rPr>
-        <w:t>3.10. Dashboard/UI Design</w:t>
+        <w:t>Dashboard/UI Design</w:t>
       </w:r>
       <w:r>
         <w:rPr>
@@ -1700,20 +2057,29 @@
     <w:p>
       <w:pPr>
         <w:tabs>
-          <w:tab w:pos="9071" w:val="right" w:leader="dot"/>
+          <w:tab w:pos="9184" w:val="right" w:leader="dot"/>
         </w:tabs>
-        <w:spacing w:before="20" w:after="20" w:line="320" w:lineRule="exact"/>
-        <w:ind w:left="340"/>
+        <w:spacing w:before="0" w:after="40" w:line="360" w:lineRule="exact"/>
+        <w:ind w:left="397"/>
         <w:jc w:val="left"/>
       </w:pPr>
       <w:r>
         <w:rPr>
           <w:rFonts w:ascii="Times New Roman" w:hAnsi="Times New Roman" w:eastAsia="Times New Roman"/>
+          <w:b/>
+          <w:i w:val="0"/>
+          <w:sz w:val="24"/>
+        </w:rPr>
+        <w:t xml:space="preserve">3.11. </w:t>
+      </w:r>
+      <w:r>
+        <w:rPr>
+          <w:rFonts w:ascii="Times New Roman" w:hAnsi="Times New Roman" w:eastAsia="Times New Roman"/>
           <w:b w:val="0"/>
           <w:i w:val="0"/>
           <w:sz w:val="24"/>
         </w:rPr>
-        <w:t>3.11. Technology Stack</w:t>
+        <w:t>Technology Stack</w:t>
       </w:r>
       <w:r>
         <w:rPr>
@@ -1729,20 +2095,29 @@
     <w:p>
       <w:pPr>
         <w:tabs>
-          <w:tab w:pos="9071" w:val="right" w:leader="dot"/>
+          <w:tab w:pos="9184" w:val="right" w:leader="dot"/>
         </w:tabs>
-        <w:spacing w:before="20" w:after="20" w:line="320" w:lineRule="exact"/>
-        <w:ind w:left="340"/>
+        <w:spacing w:before="0" w:after="40" w:line="360" w:lineRule="exact"/>
+        <w:ind w:left="397"/>
         <w:jc w:val="left"/>
       </w:pPr>
       <w:r>
         <w:rPr>
           <w:rFonts w:ascii="Times New Roman" w:hAnsi="Times New Roman" w:eastAsia="Times New Roman"/>
+          <w:b/>
+          <w:i w:val="0"/>
+          <w:sz w:val="24"/>
+        </w:rPr>
+        <w:t xml:space="preserve">3.12. </w:t>
+      </w:r>
+      <w:r>
+        <w:rPr>
+          <w:rFonts w:ascii="Times New Roman" w:hAnsi="Times New Roman" w:eastAsia="Times New Roman"/>
           <w:b w:val="0"/>
           <w:i w:val="0"/>
           <w:sz w:val="24"/>
         </w:rPr>
-        <w:t>3.12. Safety &amp; Security Considerations</w:t>
+        <w:t>Safety &amp; Security Considerations</w:t>
       </w:r>
       <w:r>
         <w:rPr>
@@ -1758,20 +2133,29 @@
     <w:p>
       <w:pPr>
         <w:tabs>
-          <w:tab w:pos="9071" w:val="right" w:leader="dot"/>
+          <w:tab w:pos="9184" w:val="right" w:leader="dot"/>
         </w:tabs>
-        <w:spacing w:before="20" w:after="20" w:line="320" w:lineRule="exact"/>
-        <w:ind w:left="340"/>
+        <w:spacing w:before="0" w:after="40" w:line="360" w:lineRule="exact"/>
+        <w:ind w:left="397"/>
         <w:jc w:val="left"/>
       </w:pPr>
       <w:r>
         <w:rPr>
           <w:rFonts w:ascii="Times New Roman" w:hAnsi="Times New Roman" w:eastAsia="Times New Roman"/>
+          <w:b/>
+          <w:i w:val="0"/>
+          <w:sz w:val="24"/>
+        </w:rPr>
+        <w:t xml:space="preserve">3.13. </w:t>
+      </w:r>
+      <w:r>
+        <w:rPr>
+          <w:rFonts w:ascii="Times New Roman" w:hAnsi="Times New Roman" w:eastAsia="Times New Roman"/>
           <w:b w:val="0"/>
           <w:i w:val="0"/>
           <w:sz w:val="24"/>
         </w:rPr>
-        <w:t>3.13. Chapter Summary</w:t>
+        <w:t>Chapter Summary</w:t>
       </w:r>
       <w:r>
         <w:rPr>
@@ -1782,14 +2166,28 @@
         </w:rPr>
         <w:tab/>
         <w:t>45</w:t>
+      </w:r>
+    </w:p>
+    <w:p>
+      <w:pPr>
+        <w:spacing w:before="0" w:after="80" w:line="160" w:lineRule="exact"/>
+        <w:jc w:val="center"/>
+      </w:pPr>
+      <w:r>
+        <w:rPr>
+          <w:rFonts w:ascii="Times New Roman" w:hAnsi="Times New Roman" w:eastAsia="Times New Roman"/>
+          <w:b w:val="0"/>
+          <w:i w:val="0"/>
+          <w:sz w:val="12"/>
+        </w:rPr>
       </w:r>
     </w:p>
     <w:p>
       <w:pPr>
         <w:tabs>
-          <w:tab w:pos="9071" w:val="right" w:leader="dot"/>
+          <w:tab w:pos="9184" w:val="right" w:leader="dot"/>
         </w:tabs>
-        <w:spacing w:before="20" w:after="20" w:line="320" w:lineRule="exact"/>
+        <w:spacing w:before="0" w:after="40" w:line="360" w:lineRule="exact"/>
         <w:jc w:val="left"/>
       </w:pPr>
       <w:r>
@@ -1815,20 +2213,29 @@
     <w:p>
       <w:pPr>
         <w:tabs>
-          <w:tab w:pos="9071" w:val="right" w:leader="dot"/>
+          <w:tab w:pos="9184" w:val="right" w:leader="dot"/>
         </w:tabs>
-        <w:spacing w:before="20" w:after="20" w:line="320" w:lineRule="exact"/>
-        <w:ind w:left="340"/>
+        <w:spacing w:before="0" w:after="40" w:line="360" w:lineRule="exact"/>
+        <w:ind w:left="397"/>
         <w:jc w:val="left"/>
       </w:pPr>
       <w:r>
         <w:rPr>
           <w:rFonts w:ascii="Times New Roman" w:hAnsi="Times New Roman" w:eastAsia="Times New Roman"/>
+          <w:b/>
+          <w:i w:val="0"/>
+          <w:sz w:val="24"/>
+        </w:rPr>
+        <w:t xml:space="preserve">4.1. </w:t>
+      </w:r>
+      <w:r>
+        <w:rPr>
+          <w:rFonts w:ascii="Times New Roman" w:hAnsi="Times New Roman" w:eastAsia="Times New Roman"/>
           <w:b w:val="0"/>
           <w:i w:val="0"/>
           <w:sz w:val="24"/>
         </w:rPr>
-        <w:t>4.1. Development Environment</w:t>
+        <w:t>Development Environment</w:t>
       </w:r>
       <w:r>
         <w:rPr>
@@ -1844,20 +2251,29 @@
     <w:p>
       <w:pPr>
         <w:tabs>
-          <w:tab w:pos="9071" w:val="right" w:leader="dot"/>
+          <w:tab w:pos="9184" w:val="right" w:leader="dot"/>
         </w:tabs>
-        <w:spacing w:before="20" w:after="20" w:line="320" w:lineRule="exact"/>
-        <w:ind w:left="340"/>
+        <w:spacing w:before="0" w:after="40" w:line="360" w:lineRule="exact"/>
+        <w:ind w:left="397"/>
         <w:jc w:val="left"/>
       </w:pPr>
       <w:r>
         <w:rPr>
           <w:rFonts w:ascii="Times New Roman" w:hAnsi="Times New Roman" w:eastAsia="Times New Roman"/>
+          <w:b/>
+          <w:i w:val="0"/>
+          <w:sz w:val="24"/>
+        </w:rPr>
+        <w:t xml:space="preserve">4.2. </w:t>
+      </w:r>
+      <w:r>
+        <w:rPr>
+          <w:rFonts w:ascii="Times New Roman" w:hAnsi="Times New Roman" w:eastAsia="Times New Roman"/>
           <w:b w:val="0"/>
           <w:i w:val="0"/>
           <w:sz w:val="24"/>
         </w:rPr>
-        <w:t>4.2. Implementation Approach</w:t>
+        <w:t>Implementation Approach</w:t>
       </w:r>
       <w:r>
         <w:rPr>
@@ -1873,20 +2289,29 @@
     <w:p>
       <w:pPr>
         <w:tabs>
-          <w:tab w:pos="9071" w:val="right" w:leader="dot"/>
+          <w:tab w:pos="9184" w:val="right" w:leader="dot"/>
         </w:tabs>
-        <w:spacing w:before="20" w:after="20" w:line="320" w:lineRule="exact"/>
-        <w:ind w:left="340"/>
+        <w:spacing w:before="0" w:after="40" w:line="360" w:lineRule="exact"/>
+        <w:ind w:left="397"/>
         <w:jc w:val="left"/>
       </w:pPr>
       <w:r>
         <w:rPr>
           <w:rFonts w:ascii="Times New Roman" w:hAnsi="Times New Roman" w:eastAsia="Times New Roman"/>
+          <w:b/>
+          <w:i w:val="0"/>
+          <w:sz w:val="24"/>
+        </w:rPr>
+        <w:t xml:space="preserve">4.3. </w:t>
+      </w:r>
+      <w:r>
+        <w:rPr>
+          <w:rFonts w:ascii="Times New Roman" w:hAnsi="Times New Roman" w:eastAsia="Times New Roman"/>
           <w:b w:val="0"/>
           <w:i w:val="0"/>
           <w:sz w:val="24"/>
         </w:rPr>
-        <w:t>4.3. Hardware Assembly</w:t>
+        <w:t>Hardware Assembly</w:t>
       </w:r>
       <w:r>
         <w:rPr>
@@ -1902,20 +2327,29 @@
     <w:p>
       <w:pPr>
         <w:tabs>
-          <w:tab w:pos="9071" w:val="right" w:leader="dot"/>
+          <w:tab w:pos="9184" w:val="right" w:leader="dot"/>
         </w:tabs>
-        <w:spacing w:before="20" w:after="20" w:line="320" w:lineRule="exact"/>
-        <w:ind w:left="340"/>
+        <w:spacing w:before="0" w:after="40" w:line="360" w:lineRule="exact"/>
+        <w:ind w:left="397"/>
         <w:jc w:val="left"/>
       </w:pPr>
       <w:r>
         <w:rPr>
           <w:rFonts w:ascii="Times New Roman" w:hAnsi="Times New Roman" w:eastAsia="Times New Roman"/>
+          <w:b/>
+          <w:i w:val="0"/>
+          <w:sz w:val="24"/>
+        </w:rPr>
+        <w:t xml:space="preserve">4.4. </w:t>
+      </w:r>
+      <w:r>
+        <w:rPr>
+          <w:rFonts w:ascii="Times New Roman" w:hAnsi="Times New Roman" w:eastAsia="Times New Roman"/>
           <w:b w:val="0"/>
           <w:i w:val="0"/>
           <w:sz w:val="24"/>
         </w:rPr>
-        <w:t>4.4. Firmware Development</w:t>
+        <w:t>Firmware Development</w:t>
       </w:r>
       <w:r>
         <w:rPr>
@@ -1931,20 +2365,29 @@
     <w:p>
       <w:pPr>
         <w:tabs>
-          <w:tab w:pos="9071" w:val="right" w:leader="dot"/>
+          <w:tab w:pos="9184" w:val="right" w:leader="dot"/>
         </w:tabs>
-        <w:spacing w:before="20" w:after="20" w:line="320" w:lineRule="exact"/>
-        <w:ind w:left="340"/>
+        <w:spacing w:before="0" w:after="40" w:line="360" w:lineRule="exact"/>
+        <w:ind w:left="397"/>
         <w:jc w:val="left"/>
       </w:pPr>
       <w:r>
         <w:rPr>
           <w:rFonts w:ascii="Times New Roman" w:hAnsi="Times New Roman" w:eastAsia="Times New Roman"/>
+          <w:b/>
+          <w:i w:val="0"/>
+          <w:sz w:val="24"/>
+        </w:rPr>
+        <w:t xml:space="preserve">4.5. </w:t>
+      </w:r>
+      <w:r>
+        <w:rPr>
+          <w:rFonts w:ascii="Times New Roman" w:hAnsi="Times New Roman" w:eastAsia="Times New Roman"/>
           <w:b w:val="0"/>
           <w:i w:val="0"/>
           <w:sz w:val="24"/>
         </w:rPr>
-        <w:t>4.5. Cloud / Blynk Integration</w:t>
+        <w:t>Database/Cloud Integration</w:t>
       </w:r>
       <w:r>
         <w:rPr>
@@ -1960,20 +2403,29 @@
     <w:p>
       <w:pPr>
         <w:tabs>
-          <w:tab w:pos="9071" w:val="right" w:leader="dot"/>
+          <w:tab w:pos="9184" w:val="right" w:leader="dot"/>
         </w:tabs>
-        <w:spacing w:before="20" w:after="20" w:line="320" w:lineRule="exact"/>
-        <w:ind w:left="340"/>
+        <w:spacing w:before="0" w:after="40" w:line="360" w:lineRule="exact"/>
+        <w:ind w:left="397"/>
         <w:jc w:val="left"/>
       </w:pPr>
       <w:r>
         <w:rPr>
           <w:rFonts w:ascii="Times New Roman" w:hAnsi="Times New Roman" w:eastAsia="Times New Roman"/>
+          <w:b/>
+          <w:i w:val="0"/>
+          <w:sz w:val="24"/>
+        </w:rPr>
+        <w:t xml:space="preserve">4.6. </w:t>
+      </w:r>
+      <w:r>
+        <w:rPr>
+          <w:rFonts w:ascii="Times New Roman" w:hAnsi="Times New Roman" w:eastAsia="Times New Roman"/>
           <w:b w:val="0"/>
           <w:i w:val="0"/>
           <w:sz w:val="24"/>
         </w:rPr>
-        <w:t>4.6. Dashboard Development</w:t>
+        <w:t>Dashboard Development</w:t>
       </w:r>
       <w:r>
         <w:rPr>
@@ -1989,20 +2441,29 @@
     <w:p>
       <w:pPr>
         <w:tabs>
-          <w:tab w:pos="9071" w:val="right" w:leader="dot"/>
+          <w:tab w:pos="9184" w:val="right" w:leader="dot"/>
         </w:tabs>
-        <w:spacing w:before="20" w:after="20" w:line="320" w:lineRule="exact"/>
-        <w:ind w:left="340"/>
+        <w:spacing w:before="0" w:after="40" w:line="360" w:lineRule="exact"/>
+        <w:ind w:left="397"/>
         <w:jc w:val="left"/>
       </w:pPr>
       <w:r>
         <w:rPr>
           <w:rFonts w:ascii="Times New Roman" w:hAnsi="Times New Roman" w:eastAsia="Times New Roman"/>
+          <w:b/>
+          <w:i w:val="0"/>
+          <w:sz w:val="24"/>
+        </w:rPr>
+        <w:t xml:space="preserve">4.7. </w:t>
+      </w:r>
+      <w:r>
+        <w:rPr>
+          <w:rFonts w:ascii="Times New Roman" w:hAnsi="Times New Roman" w:eastAsia="Times New Roman"/>
           <w:b w:val="0"/>
           <w:i w:val="0"/>
           <w:sz w:val="24"/>
         </w:rPr>
-        <w:t>4.7. Module-wise Implementation</w:t>
+        <w:t>Module-wise Implementation</w:t>
       </w:r>
       <w:r>
         <w:rPr>
@@ -2018,20 +2479,29 @@
     <w:p>
       <w:pPr>
         <w:tabs>
-          <w:tab w:pos="9071" w:val="right" w:leader="dot"/>
+          <w:tab w:pos="9184" w:val="right" w:leader="dot"/>
         </w:tabs>
-        <w:spacing w:before="20" w:after="20" w:line="320" w:lineRule="exact"/>
-        <w:ind w:left="340"/>
+        <w:spacing w:before="0" w:after="40" w:line="360" w:lineRule="exact"/>
+        <w:ind w:left="397"/>
         <w:jc w:val="left"/>
       </w:pPr>
       <w:r>
         <w:rPr>
           <w:rFonts w:ascii="Times New Roman" w:hAnsi="Times New Roman" w:eastAsia="Times New Roman"/>
+          <w:b/>
+          <w:i w:val="0"/>
+          <w:sz w:val="24"/>
+        </w:rPr>
+        <w:t xml:space="preserve">4.8. </w:t>
+      </w:r>
+      <w:r>
+        <w:rPr>
+          <w:rFonts w:ascii="Times New Roman" w:hAnsi="Times New Roman" w:eastAsia="Times New Roman"/>
           <w:b w:val="0"/>
           <w:i w:val="0"/>
           <w:sz w:val="24"/>
         </w:rPr>
-        <w:t>4.8. Algorithms and Control Logic</w:t>
+        <w:t>Algorithms and Control Logic</w:t>
       </w:r>
       <w:r>
         <w:rPr>
@@ -2047,20 +2517,29 @@
     <w:p>
       <w:pPr>
         <w:tabs>
-          <w:tab w:pos="9071" w:val="right" w:leader="dot"/>
+          <w:tab w:pos="9184" w:val="right" w:leader="dot"/>
         </w:tabs>
-        <w:spacing w:before="20" w:after="20" w:line="320" w:lineRule="exact"/>
-        <w:ind w:left="340"/>
+        <w:spacing w:before="0" w:after="40" w:line="360" w:lineRule="exact"/>
+        <w:ind w:left="397"/>
         <w:jc w:val="left"/>
       </w:pPr>
       <w:r>
         <w:rPr>
           <w:rFonts w:ascii="Times New Roman" w:hAnsi="Times New Roman" w:eastAsia="Times New Roman"/>
+          <w:b/>
+          <w:i w:val="0"/>
+          <w:sz w:val="24"/>
+        </w:rPr>
+        <w:t xml:space="preserve">4.9. </w:t>
+      </w:r>
+      <w:r>
+        <w:rPr>
+          <w:rFonts w:ascii="Times New Roman" w:hAnsi="Times New Roman" w:eastAsia="Times New Roman"/>
           <w:b w:val="0"/>
           <w:i w:val="0"/>
           <w:sz w:val="24"/>
         </w:rPr>
-        <w:t>4.9. Safety Features Implemented</w:t>
+        <w:t>Safety Features Implemented</w:t>
       </w:r>
       <w:r>
         <w:rPr>
@@ -2076,20 +2555,29 @@
     <w:p>
       <w:pPr>
         <w:tabs>
-          <w:tab w:pos="9071" w:val="right" w:leader="dot"/>
+          <w:tab w:pos="9184" w:val="right" w:leader="dot"/>
         </w:tabs>
-        <w:spacing w:before="20" w:after="20" w:line="320" w:lineRule="exact"/>
-        <w:ind w:left="340"/>
+        <w:spacing w:before="0" w:after="40" w:line="360" w:lineRule="exact"/>
+        <w:ind w:left="397"/>
         <w:jc w:val="left"/>
       </w:pPr>
       <w:r>
         <w:rPr>
           <w:rFonts w:ascii="Times New Roman" w:hAnsi="Times New Roman" w:eastAsia="Times New Roman"/>
+          <w:b/>
+          <w:i w:val="0"/>
+          <w:sz w:val="24"/>
+        </w:rPr>
+        <w:t xml:space="preserve">4.10. </w:t>
+      </w:r>
+      <w:r>
+        <w:rPr>
+          <w:rFonts w:ascii="Times New Roman" w:hAnsi="Times New Roman" w:eastAsia="Times New Roman"/>
           <w:b w:val="0"/>
           <w:i w:val="0"/>
           <w:sz w:val="24"/>
         </w:rPr>
-        <w:t>4.10. Prototype Development</w:t>
+        <w:t>Prototype Development</w:t>
       </w:r>
       <w:r>
         <w:rPr>
@@ -2105,20 +2593,29 @@
     <w:p>
       <w:pPr>
         <w:tabs>
-          <w:tab w:pos="9071" w:val="right" w:leader="dot"/>
+          <w:tab w:pos="9184" w:val="right" w:leader="dot"/>
         </w:tabs>
-        <w:spacing w:before="20" w:after="20" w:line="320" w:lineRule="exact"/>
-        <w:ind w:left="340"/>
+        <w:spacing w:before="0" w:after="40" w:line="360" w:lineRule="exact"/>
+        <w:ind w:left="397"/>
         <w:jc w:val="left"/>
       </w:pPr>
       <w:r>
         <w:rPr>
           <w:rFonts w:ascii="Times New Roman" w:hAnsi="Times New Roman" w:eastAsia="Times New Roman"/>
+          <w:b/>
+          <w:i w:val="0"/>
+          <w:sz w:val="24"/>
+        </w:rPr>
+        <w:t xml:space="preserve">4.11. </w:t>
+      </w:r>
+      <w:r>
+        <w:rPr>
+          <w:rFonts w:ascii="Times New Roman" w:hAnsi="Times New Roman" w:eastAsia="Times New Roman"/>
           <w:b w:val="0"/>
           <w:i w:val="0"/>
           <w:sz w:val="24"/>
         </w:rPr>
-        <w:t>4.11. Prototype Photos &amp; Demonstration</w:t>
+        <w:t>Prototype Photos &amp; Demonstration</w:t>
       </w:r>
       <w:r>
         <w:rPr>
@@ -2129,14 +2626,33 @@
         </w:rPr>
         <w:tab/>
         <w:t>63</w:t>
+      </w:r>
+    </w:p>
+    <w:p>
+      <w:pPr>
+        <w:spacing w:before="0" w:after="80" w:line="160" w:lineRule="exact"/>
+        <w:jc w:val="center"/>
+      </w:pPr>
+      <w:r>
+        <w:rPr>
+          <w:rFonts w:ascii="Times New Roman" w:hAnsi="Times New Roman" w:eastAsia="Times New Roman"/>
+          <w:b w:val="0"/>
+          <w:i w:val="0"/>
+          <w:sz w:val="12"/>
+        </w:rPr>
+      </w:r>
+    </w:p>
+    <w:p>
+      <w:r>
+        <w:br w:type="page"/>
       </w:r>
     </w:p>
     <w:p>
       <w:pPr>
         <w:tabs>
-          <w:tab w:pos="9071" w:val="right" w:leader="dot"/>
+          <w:tab w:pos="9184" w:val="right" w:leader="dot"/>
         </w:tabs>
-        <w:spacing w:before="20" w:after="20" w:line="320" w:lineRule="exact"/>
+        <w:spacing w:before="0" w:after="40" w:line="360" w:lineRule="exact"/>
         <w:jc w:val="left"/>
       </w:pPr>
       <w:r>
@@ -2162,20 +2678,29 @@
     <w:p>
       <w:pPr>
         <w:tabs>
-          <w:tab w:pos="9071" w:val="right" w:leader="dot"/>
+          <w:tab w:pos="9184" w:val="right" w:leader="dot"/>
         </w:tabs>
-        <w:spacing w:before="20" w:after="20" w:line="320" w:lineRule="exact"/>
-        <w:ind w:left="340"/>
+        <w:spacing w:before="0" w:after="40" w:line="360" w:lineRule="exact"/>
+        <w:ind w:left="397"/>
         <w:jc w:val="left"/>
       </w:pPr>
       <w:r>
         <w:rPr>
           <w:rFonts w:ascii="Times New Roman" w:hAnsi="Times New Roman" w:eastAsia="Times New Roman"/>
+          <w:b/>
+          <w:i w:val="0"/>
+          <w:sz w:val="24"/>
+        </w:rPr>
+        <w:t xml:space="preserve">5.1. </w:t>
+      </w:r>
+      <w:r>
+        <w:rPr>
+          <w:rFonts w:ascii="Times New Roman" w:hAnsi="Times New Roman" w:eastAsia="Times New Roman"/>
           <w:b w:val="0"/>
           <w:i w:val="0"/>
           <w:sz w:val="24"/>
         </w:rPr>
-        <w:t>5.1. Testing Strategy</w:t>
+        <w:t>Testing Strategy</w:t>
       </w:r>
       <w:r>
         <w:rPr>
@@ -2191,20 +2716,29 @@
     <w:p>
       <w:pPr>
         <w:tabs>
-          <w:tab w:pos="9071" w:val="right" w:leader="dot"/>
+          <w:tab w:pos="9184" w:val="right" w:leader="dot"/>
         </w:tabs>
-        <w:spacing w:before="20" w:after="20" w:line="320" w:lineRule="exact"/>
-        <w:ind w:left="340"/>
+        <w:spacing w:before="0" w:after="40" w:line="360" w:lineRule="exact"/>
+        <w:ind w:left="397"/>
         <w:jc w:val="left"/>
       </w:pPr>
       <w:r>
         <w:rPr>
           <w:rFonts w:ascii="Times New Roman" w:hAnsi="Times New Roman" w:eastAsia="Times New Roman"/>
+          <w:b/>
+          <w:i w:val="0"/>
+          <w:sz w:val="24"/>
+        </w:rPr>
+        <w:t xml:space="preserve">5.2. </w:t>
+      </w:r>
+      <w:r>
+        <w:rPr>
+          <w:rFonts w:ascii="Times New Roman" w:hAnsi="Times New Roman" w:eastAsia="Times New Roman"/>
           <w:b w:val="0"/>
           <w:i w:val="0"/>
           <w:sz w:val="24"/>
         </w:rPr>
-        <w:t>5.2. Unit Testing</w:t>
+        <w:t>Unit Testing</w:t>
       </w:r>
       <w:r>
         <w:rPr>
@@ -2220,20 +2754,29 @@
     <w:p>
       <w:pPr>
         <w:tabs>
-          <w:tab w:pos="9071" w:val="right" w:leader="dot"/>
+          <w:tab w:pos="9184" w:val="right" w:leader="dot"/>
         </w:tabs>
-        <w:spacing w:before="20" w:after="20" w:line="320" w:lineRule="exact"/>
-        <w:ind w:left="340"/>
+        <w:spacing w:before="0" w:after="40" w:line="360" w:lineRule="exact"/>
+        <w:ind w:left="397"/>
         <w:jc w:val="left"/>
       </w:pPr>
       <w:r>
         <w:rPr>
           <w:rFonts w:ascii="Times New Roman" w:hAnsi="Times New Roman" w:eastAsia="Times New Roman"/>
+          <w:b/>
+          <w:i w:val="0"/>
+          <w:sz w:val="24"/>
+        </w:rPr>
+        <w:t xml:space="preserve">5.3. </w:t>
+      </w:r>
+      <w:r>
+        <w:rPr>
+          <w:rFonts w:ascii="Times New Roman" w:hAnsi="Times New Roman" w:eastAsia="Times New Roman"/>
           <w:b w:val="0"/>
           <w:i w:val="0"/>
           <w:sz w:val="24"/>
         </w:rPr>
-        <w:t>5.3. Integration Testing</w:t>
+        <w:t>Integration Testing</w:t>
       </w:r>
       <w:r>
         <w:rPr>
@@ -2249,20 +2792,29 @@
     <w:p>
       <w:pPr>
         <w:tabs>
-          <w:tab w:pos="9071" w:val="right" w:leader="dot"/>
+          <w:tab w:pos="9184" w:val="right" w:leader="dot"/>
         </w:tabs>
-        <w:spacing w:before="20" w:after="20" w:line="320" w:lineRule="exact"/>
-        <w:ind w:left="340"/>
+        <w:spacing w:before="0" w:after="40" w:line="360" w:lineRule="exact"/>
+        <w:ind w:left="397"/>
         <w:jc w:val="left"/>
       </w:pPr>
       <w:r>
         <w:rPr>
           <w:rFonts w:ascii="Times New Roman" w:hAnsi="Times New Roman" w:eastAsia="Times New Roman"/>
+          <w:b/>
+          <w:i w:val="0"/>
+          <w:sz w:val="24"/>
+        </w:rPr>
+        <w:t xml:space="preserve">5.4. </w:t>
+      </w:r>
+      <w:r>
+        <w:rPr>
+          <w:rFonts w:ascii="Times New Roman" w:hAnsi="Times New Roman" w:eastAsia="Times New Roman"/>
           <w:b w:val="0"/>
           <w:i w:val="0"/>
           <w:sz w:val="24"/>
         </w:rPr>
-        <w:t>5.4. System Testing</w:t>
+        <w:t>System Testing</w:t>
       </w:r>
       <w:r>
         <w:rPr>
@@ -2278,20 +2830,29 @@
     <w:p>
       <w:pPr>
         <w:tabs>
-          <w:tab w:pos="9071" w:val="right" w:leader="dot"/>
+          <w:tab w:pos="9184" w:val="right" w:leader="dot"/>
         </w:tabs>
-        <w:spacing w:before="20" w:after="20" w:line="320" w:lineRule="exact"/>
-        <w:ind w:left="340"/>
+        <w:spacing w:before="0" w:after="40" w:line="360" w:lineRule="exact"/>
+        <w:ind w:left="397"/>
         <w:jc w:val="left"/>
       </w:pPr>
       <w:r>
         <w:rPr>
           <w:rFonts w:ascii="Times New Roman" w:hAnsi="Times New Roman" w:eastAsia="Times New Roman"/>
+          <w:b/>
+          <w:i w:val="0"/>
+          <w:sz w:val="24"/>
+        </w:rPr>
+        <w:t xml:space="preserve">5.5. </w:t>
+      </w:r>
+      <w:r>
+        <w:rPr>
+          <w:rFonts w:ascii="Times New Roman" w:hAnsi="Times New Roman" w:eastAsia="Times New Roman"/>
           <w:b w:val="0"/>
           <w:i w:val="0"/>
           <w:sz w:val="24"/>
         </w:rPr>
-        <w:t>5.5. User Acceptance Testing</w:t>
+        <w:t>User Acceptance Testing</w:t>
       </w:r>
       <w:r>
         <w:rPr>
@@ -2307,20 +2868,29 @@
     <w:p>
       <w:pPr>
         <w:tabs>
-          <w:tab w:pos="9071" w:val="right" w:leader="dot"/>
+          <w:tab w:pos="9184" w:val="right" w:leader="dot"/>
         </w:tabs>
-        <w:spacing w:before="20" w:after="20" w:line="320" w:lineRule="exact"/>
-        <w:ind w:left="340"/>
+        <w:spacing w:before="0" w:after="40" w:line="360" w:lineRule="exact"/>
+        <w:ind w:left="397"/>
         <w:jc w:val="left"/>
       </w:pPr>
       <w:r>
         <w:rPr>
           <w:rFonts w:ascii="Times New Roman" w:hAnsi="Times New Roman" w:eastAsia="Times New Roman"/>
+          <w:b/>
+          <w:i w:val="0"/>
+          <w:sz w:val="24"/>
+        </w:rPr>
+        <w:t xml:space="preserve">5.6. </w:t>
+      </w:r>
+      <w:r>
+        <w:rPr>
+          <w:rFonts w:ascii="Times New Roman" w:hAnsi="Times New Roman" w:eastAsia="Times New Roman"/>
           <w:b w:val="0"/>
           <w:i w:val="0"/>
           <w:sz w:val="24"/>
         </w:rPr>
-        <w:t>5.6. Performance Evaluation</w:t>
+        <w:t>Performance Evaluation</w:t>
       </w:r>
       <w:r>
         <w:rPr>
@@ -2336,20 +2906,29 @@
     <w:p>
       <w:pPr>
         <w:tabs>
-          <w:tab w:pos="9071" w:val="right" w:leader="dot"/>
+          <w:tab w:pos="9184" w:val="right" w:leader="dot"/>
         </w:tabs>
-        <w:spacing w:before="20" w:after="20" w:line="320" w:lineRule="exact"/>
-        <w:ind w:left="340"/>
+        <w:spacing w:before="0" w:after="40" w:line="360" w:lineRule="exact"/>
+        <w:ind w:left="397"/>
         <w:jc w:val="left"/>
       </w:pPr>
       <w:r>
         <w:rPr>
           <w:rFonts w:ascii="Times New Roman" w:hAnsi="Times New Roman" w:eastAsia="Times New Roman"/>
+          <w:b/>
+          <w:i w:val="0"/>
+          <w:sz w:val="24"/>
+        </w:rPr>
+        <w:t xml:space="preserve">5.7. </w:t>
+      </w:r>
+      <w:r>
+        <w:rPr>
+          <w:rFonts w:ascii="Times New Roman" w:hAnsi="Times New Roman" w:eastAsia="Times New Roman"/>
           <w:b w:val="0"/>
           <w:i w:val="0"/>
           <w:sz w:val="24"/>
         </w:rPr>
-        <w:t>5.7. Security Testing</w:t>
+        <w:t>Security Testing</w:t>
       </w:r>
       <w:r>
         <w:rPr>
@@ -2365,20 +2944,29 @@
     <w:p>
       <w:pPr>
         <w:tabs>
-          <w:tab w:pos="9071" w:val="right" w:leader="dot"/>
+          <w:tab w:pos="9184" w:val="right" w:leader="dot"/>
         </w:tabs>
-        <w:spacing w:before="20" w:after="20" w:line="320" w:lineRule="exact"/>
-        <w:ind w:left="340"/>
+        <w:spacing w:before="0" w:after="40" w:line="360" w:lineRule="exact"/>
+        <w:ind w:left="397"/>
         <w:jc w:val="left"/>
       </w:pPr>
       <w:r>
         <w:rPr>
           <w:rFonts w:ascii="Times New Roman" w:hAnsi="Times New Roman" w:eastAsia="Times New Roman"/>
+          <w:b/>
+          <w:i w:val="0"/>
+          <w:sz w:val="24"/>
+        </w:rPr>
+        <w:t xml:space="preserve">5.8. </w:t>
+      </w:r>
+      <w:r>
+        <w:rPr>
+          <w:rFonts w:ascii="Times New Roman" w:hAnsi="Times New Roman" w:eastAsia="Times New Roman"/>
           <w:b w:val="0"/>
           <w:i w:val="0"/>
           <w:sz w:val="24"/>
         </w:rPr>
-        <w:t>5.8. Validation Metrics</w:t>
+        <w:t>Validation Metrics</w:t>
       </w:r>
       <w:r>
         <w:rPr>
@@ -2394,20 +2982,29 @@
     <w:p>
       <w:pPr>
         <w:tabs>
-          <w:tab w:pos="9071" w:val="right" w:leader="dot"/>
+          <w:tab w:pos="9184" w:val="right" w:leader="dot"/>
         </w:tabs>
-        <w:spacing w:before="20" w:after="20" w:line="320" w:lineRule="exact"/>
-        <w:ind w:left="340"/>
+        <w:spacing w:before="0" w:after="40" w:line="360" w:lineRule="exact"/>
+        <w:ind w:left="397"/>
         <w:jc w:val="left"/>
       </w:pPr>
       <w:r>
         <w:rPr>
           <w:rFonts w:ascii="Times New Roman" w:hAnsi="Times New Roman" w:eastAsia="Times New Roman"/>
+          <w:b/>
+          <w:i w:val="0"/>
+          <w:sz w:val="24"/>
+        </w:rPr>
+        <w:t xml:space="preserve">5.9. </w:t>
+      </w:r>
+      <w:r>
+        <w:rPr>
+          <w:rFonts w:ascii="Times New Roman" w:hAnsi="Times New Roman" w:eastAsia="Times New Roman"/>
           <w:b w:val="0"/>
           <w:i w:val="0"/>
           <w:sz w:val="24"/>
         </w:rPr>
-        <w:t>5.9. Test Cases</w:t>
+        <w:t>Test Cases</w:t>
       </w:r>
       <w:r>
         <w:rPr>
@@ -2423,20 +3020,29 @@
     <w:p>
       <w:pPr>
         <w:tabs>
-          <w:tab w:pos="9071" w:val="right" w:leader="dot"/>
+          <w:tab w:pos="9184" w:val="right" w:leader="dot"/>
         </w:tabs>
-        <w:spacing w:before="20" w:after="20" w:line="320" w:lineRule="exact"/>
-        <w:ind w:left="340"/>
+        <w:spacing w:before="0" w:after="40" w:line="360" w:lineRule="exact"/>
+        <w:ind w:left="397"/>
         <w:jc w:val="left"/>
       </w:pPr>
       <w:r>
         <w:rPr>
           <w:rFonts w:ascii="Times New Roman" w:hAnsi="Times New Roman" w:eastAsia="Times New Roman"/>
+          <w:b/>
+          <w:i w:val="0"/>
+          <w:sz w:val="24"/>
+        </w:rPr>
+        <w:t xml:space="preserve">5.10. </w:t>
+      </w:r>
+      <w:r>
+        <w:rPr>
+          <w:rFonts w:ascii="Times New Roman" w:hAnsi="Times New Roman" w:eastAsia="Times New Roman"/>
           <w:b w:val="0"/>
           <w:i w:val="0"/>
           <w:sz w:val="24"/>
         </w:rPr>
-        <w:t>5.10. Defects Identified and Corrections</w:t>
+        <w:t>Defects Identified and corrections</w:t>
       </w:r>
       <w:r>
         <w:rPr>
@@ -2452,20 +3058,29 @@
     <w:p>
       <w:pPr>
         <w:tabs>
-          <w:tab w:pos="9071" w:val="right" w:leader="dot"/>
+          <w:tab w:pos="9184" w:val="right" w:leader="dot"/>
         </w:tabs>
-        <w:spacing w:before="20" w:after="20" w:line="320" w:lineRule="exact"/>
-        <w:ind w:left="340"/>
+        <w:spacing w:before="0" w:after="40" w:line="360" w:lineRule="exact"/>
+        <w:ind w:left="397"/>
         <w:jc w:val="left"/>
       </w:pPr>
       <w:r>
         <w:rPr>
           <w:rFonts w:ascii="Times New Roman" w:hAnsi="Times New Roman" w:eastAsia="Times New Roman"/>
+          <w:b/>
+          <w:i w:val="0"/>
+          <w:sz w:val="24"/>
+        </w:rPr>
+        <w:t xml:space="preserve">5.11. </w:t>
+      </w:r>
+      <w:r>
+        <w:rPr>
+          <w:rFonts w:ascii="Times New Roman" w:hAnsi="Times New Roman" w:eastAsia="Times New Roman"/>
           <w:b w:val="0"/>
           <w:i w:val="0"/>
           <w:sz w:val="24"/>
         </w:rPr>
-        <w:t>5.11. Chapter Summary</w:t>
+        <w:t>Chapter Summary</w:t>
       </w:r>
       <w:r>
         <w:rPr>
@@ -2476,14 +3091,28 @@
         </w:rPr>
         <w:tab/>
         <w:t>79</w:t>
+      </w:r>
+    </w:p>
+    <w:p>
+      <w:pPr>
+        <w:spacing w:before="0" w:after="80" w:line="160" w:lineRule="exact"/>
+        <w:jc w:val="center"/>
+      </w:pPr>
+      <w:r>
+        <w:rPr>
+          <w:rFonts w:ascii="Times New Roman" w:hAnsi="Times New Roman" w:eastAsia="Times New Roman"/>
+          <w:b w:val="0"/>
+          <w:i w:val="0"/>
+          <w:sz w:val="12"/>
+        </w:rPr>
       </w:r>
     </w:p>
     <w:p>
       <w:pPr>
         <w:tabs>
-          <w:tab w:pos="9071" w:val="right" w:leader="dot"/>
+          <w:tab w:pos="9184" w:val="right" w:leader="dot"/>
         </w:tabs>
-        <w:spacing w:before="20" w:after="20" w:line="320" w:lineRule="exact"/>
+        <w:spacing w:before="0" w:after="40" w:line="360" w:lineRule="exact"/>
         <w:jc w:val="left"/>
       </w:pPr>
       <w:r>
@@ -2509,20 +3138,29 @@
     <w:p>
       <w:pPr>
         <w:tabs>
-          <w:tab w:pos="9071" w:val="right" w:leader="dot"/>
+          <w:tab w:pos="9184" w:val="right" w:leader="dot"/>
         </w:tabs>
-        <w:spacing w:before="20" w:after="20" w:line="320" w:lineRule="exact"/>
-        <w:ind w:left="340"/>
+        <w:spacing w:before="0" w:after="40" w:line="360" w:lineRule="exact"/>
+        <w:ind w:left="397"/>
         <w:jc w:val="left"/>
       </w:pPr>
       <w:r>
         <w:rPr>
           <w:rFonts w:ascii="Times New Roman" w:hAnsi="Times New Roman" w:eastAsia="Times New Roman"/>
+          <w:b/>
+          <w:i w:val="0"/>
+          <w:sz w:val="24"/>
+        </w:rPr>
+        <w:t xml:space="preserve">6.1. </w:t>
+      </w:r>
+      <w:r>
+        <w:rPr>
+          <w:rFonts w:ascii="Times New Roman" w:hAnsi="Times New Roman" w:eastAsia="Times New Roman"/>
           <w:b w:val="0"/>
           <w:i w:val="0"/>
           <w:sz w:val="24"/>
         </w:rPr>
-        <w:t>6.1. Beneficiary Profile</w:t>
+        <w:t>Beneficiary Profile</w:t>
       </w:r>
       <w:r>
         <w:rPr>
@@ -2538,20 +3176,29 @@
     <w:p>
       <w:pPr>
         <w:tabs>
-          <w:tab w:pos="9071" w:val="right" w:leader="dot"/>
+          <w:tab w:pos="9184" w:val="right" w:leader="dot"/>
         </w:tabs>
-        <w:spacing w:before="20" w:after="20" w:line="320" w:lineRule="exact"/>
-        <w:ind w:left="340"/>
+        <w:spacing w:before="0" w:after="40" w:line="360" w:lineRule="exact"/>
+        <w:ind w:left="397"/>
         <w:jc w:val="left"/>
       </w:pPr>
       <w:r>
         <w:rPr>
           <w:rFonts w:ascii="Times New Roman" w:hAnsi="Times New Roman" w:eastAsia="Times New Roman"/>
+          <w:b/>
+          <w:i w:val="0"/>
+          <w:sz w:val="24"/>
+        </w:rPr>
+        <w:t xml:space="preserve">6.2. </w:t>
+      </w:r>
+      <w:r>
+        <w:rPr>
+          <w:rFonts w:ascii="Times New Roman" w:hAnsi="Times New Roman" w:eastAsia="Times New Roman"/>
           <w:b w:val="0"/>
           <w:i w:val="0"/>
           <w:sz w:val="24"/>
         </w:rPr>
-        <w:t>6.2. Community Engagement Activities</w:t>
+        <w:t>Community Engagement Activities</w:t>
       </w:r>
       <w:r>
         <w:rPr>
@@ -2567,20 +3214,29 @@
     <w:p>
       <w:pPr>
         <w:tabs>
-          <w:tab w:pos="9071" w:val="right" w:leader="dot"/>
+          <w:tab w:pos="9184" w:val="right" w:leader="dot"/>
         </w:tabs>
-        <w:spacing w:before="20" w:after="20" w:line="320" w:lineRule="exact"/>
-        <w:ind w:left="340"/>
+        <w:spacing w:before="0" w:after="40" w:line="360" w:lineRule="exact"/>
+        <w:ind w:left="397"/>
         <w:jc w:val="left"/>
       </w:pPr>
       <w:r>
         <w:rPr>
           <w:rFonts w:ascii="Times New Roman" w:hAnsi="Times New Roman" w:eastAsia="Times New Roman"/>
+          <w:b/>
+          <w:i w:val="0"/>
+          <w:sz w:val="24"/>
+        </w:rPr>
+        <w:t xml:space="preserve">6.3. </w:t>
+      </w:r>
+      <w:r>
+        <w:rPr>
+          <w:rFonts w:ascii="Times New Roman" w:hAnsi="Times New Roman" w:eastAsia="Times New Roman"/>
           <w:b w:val="0"/>
           <w:i w:val="0"/>
           <w:sz w:val="24"/>
         </w:rPr>
-        <w:t>6.3. Pilot Deployment</w:t>
+        <w:t>Pilot Deployment</w:t>
       </w:r>
       <w:r>
         <w:rPr>
@@ -2596,20 +3252,29 @@
     <w:p>
       <w:pPr>
         <w:tabs>
-          <w:tab w:pos="9071" w:val="right" w:leader="dot"/>
+          <w:tab w:pos="9184" w:val="right" w:leader="dot"/>
         </w:tabs>
-        <w:spacing w:before="20" w:after="20" w:line="320" w:lineRule="exact"/>
-        <w:ind w:left="340"/>
+        <w:spacing w:before="0" w:after="40" w:line="360" w:lineRule="exact"/>
+        <w:ind w:left="397"/>
         <w:jc w:val="left"/>
       </w:pPr>
       <w:r>
         <w:rPr>
           <w:rFonts w:ascii="Times New Roman" w:hAnsi="Times New Roman" w:eastAsia="Times New Roman"/>
+          <w:b/>
+          <w:i w:val="0"/>
+          <w:sz w:val="24"/>
+        </w:rPr>
+        <w:t xml:space="preserve">6.4. </w:t>
+      </w:r>
+      <w:r>
+        <w:rPr>
+          <w:rFonts w:ascii="Times New Roman" w:hAnsi="Times New Roman" w:eastAsia="Times New Roman"/>
           <w:b w:val="0"/>
           <w:i w:val="0"/>
           <w:sz w:val="24"/>
         </w:rPr>
-        <w:t>6.4. User Training</w:t>
+        <w:t>User Training</w:t>
       </w:r>
       <w:r>
         <w:rPr>
@@ -2625,20 +3290,29 @@
     <w:p>
       <w:pPr>
         <w:tabs>
-          <w:tab w:pos="9071" w:val="right" w:leader="dot"/>
+          <w:tab w:pos="9184" w:val="right" w:leader="dot"/>
         </w:tabs>
-        <w:spacing w:before="20" w:after="20" w:line="320" w:lineRule="exact"/>
-        <w:ind w:left="340"/>
+        <w:spacing w:before="0" w:after="40" w:line="360" w:lineRule="exact"/>
+        <w:ind w:left="397"/>
         <w:jc w:val="left"/>
       </w:pPr>
       <w:r>
         <w:rPr>
           <w:rFonts w:ascii="Times New Roman" w:hAnsi="Times New Roman" w:eastAsia="Times New Roman"/>
+          <w:b/>
+          <w:i w:val="0"/>
+          <w:sz w:val="24"/>
+        </w:rPr>
+        <w:t xml:space="preserve">6.5. </w:t>
+      </w:r>
+      <w:r>
+        <w:rPr>
+          <w:rFonts w:ascii="Times New Roman" w:hAnsi="Times New Roman" w:eastAsia="Times New Roman"/>
           <w:b w:val="0"/>
           <w:i w:val="0"/>
           <w:sz w:val="24"/>
         </w:rPr>
-        <w:t>6.5. Feedback Collection</w:t>
+        <w:t>Feedback Collection</w:t>
       </w:r>
       <w:r>
         <w:rPr>
@@ -2654,20 +3328,29 @@
     <w:p>
       <w:pPr>
         <w:tabs>
-          <w:tab w:pos="9071" w:val="right" w:leader="dot"/>
+          <w:tab w:pos="9184" w:val="right" w:leader="dot"/>
         </w:tabs>
-        <w:spacing w:before="20" w:after="20" w:line="320" w:lineRule="exact"/>
-        <w:ind w:left="340"/>
+        <w:spacing w:before="0" w:after="40" w:line="360" w:lineRule="exact"/>
+        <w:ind w:left="397"/>
         <w:jc w:val="left"/>
       </w:pPr>
       <w:r>
         <w:rPr>
           <w:rFonts w:ascii="Times New Roman" w:hAnsi="Times New Roman" w:eastAsia="Times New Roman"/>
+          <w:b/>
+          <w:i w:val="0"/>
+          <w:sz w:val="24"/>
+        </w:rPr>
+        <w:t xml:space="preserve">6.6. </w:t>
+      </w:r>
+      <w:r>
+        <w:rPr>
+          <w:rFonts w:ascii="Times New Roman" w:hAnsi="Times New Roman" w:eastAsia="Times New Roman"/>
           <w:b w:val="0"/>
           <w:i w:val="0"/>
           <w:sz w:val="24"/>
         </w:rPr>
-        <w:t>6.6. Feedback Analysis</w:t>
+        <w:t>Feedback Analysis</w:t>
       </w:r>
       <w:r>
         <w:rPr>
@@ -2683,20 +3366,29 @@
     <w:p>
       <w:pPr>
         <w:tabs>
-          <w:tab w:pos="9071" w:val="right" w:leader="dot"/>
+          <w:tab w:pos="9184" w:val="right" w:leader="dot"/>
         </w:tabs>
-        <w:spacing w:before="20" w:after="20" w:line="320" w:lineRule="exact"/>
-        <w:ind w:left="340"/>
+        <w:spacing w:before="0" w:after="40" w:line="360" w:lineRule="exact"/>
+        <w:ind w:left="397"/>
         <w:jc w:val="left"/>
       </w:pPr>
       <w:r>
         <w:rPr>
           <w:rFonts w:ascii="Times New Roman" w:hAnsi="Times New Roman" w:eastAsia="Times New Roman"/>
+          <w:b/>
+          <w:i w:val="0"/>
+          <w:sz w:val="24"/>
+        </w:rPr>
+        <w:t xml:space="preserve">6.7. </w:t>
+      </w:r>
+      <w:r>
+        <w:rPr>
+          <w:rFonts w:ascii="Times New Roman" w:hAnsi="Times New Roman" w:eastAsia="Times New Roman"/>
           <w:b w:val="0"/>
           <w:i w:val="0"/>
           <w:sz w:val="24"/>
         </w:rPr>
-        <w:t>6.7. Impact Assessment</w:t>
+        <w:t>Impact Assessment</w:t>
       </w:r>
       <w:r>
         <w:rPr>
@@ -2712,20 +3404,29 @@
     <w:p>
       <w:pPr>
         <w:tabs>
-          <w:tab w:pos="9071" w:val="right" w:leader="dot"/>
+          <w:tab w:pos="9184" w:val="right" w:leader="dot"/>
         </w:tabs>
-        <w:spacing w:before="20" w:after="20" w:line="320" w:lineRule="exact"/>
-        <w:ind w:left="340"/>
+        <w:spacing w:before="0" w:after="40" w:line="360" w:lineRule="exact"/>
+        <w:ind w:left="397"/>
         <w:jc w:val="left"/>
       </w:pPr>
       <w:r>
         <w:rPr>
           <w:rFonts w:ascii="Times New Roman" w:hAnsi="Times New Roman" w:eastAsia="Times New Roman"/>
+          <w:b/>
+          <w:i w:val="0"/>
+          <w:sz w:val="24"/>
+        </w:rPr>
+        <w:t xml:space="preserve">6.8. </w:t>
+      </w:r>
+      <w:r>
+        <w:rPr>
+          <w:rFonts w:ascii="Times New Roman" w:hAnsi="Times New Roman" w:eastAsia="Times New Roman"/>
           <w:b w:val="0"/>
           <w:i w:val="0"/>
           <w:sz w:val="24"/>
         </w:rPr>
-        <w:t>6.8. Outcome Achievement Matrix</w:t>
+        <w:t>Outcome Achievement Matrix</w:t>
       </w:r>
       <w:r>
         <w:rPr>
@@ -2741,20 +3442,29 @@
     <w:p>
       <w:pPr>
         <w:tabs>
-          <w:tab w:pos="9071" w:val="right" w:leader="dot"/>
+          <w:tab w:pos="9184" w:val="right" w:leader="dot"/>
         </w:tabs>
-        <w:spacing w:before="20" w:after="20" w:line="320" w:lineRule="exact"/>
-        <w:ind w:left="340"/>
+        <w:spacing w:before="0" w:after="40" w:line="360" w:lineRule="exact"/>
+        <w:ind w:left="397"/>
         <w:jc w:val="left"/>
       </w:pPr>
       <w:r>
         <w:rPr>
           <w:rFonts w:ascii="Times New Roman" w:hAnsi="Times New Roman" w:eastAsia="Times New Roman"/>
+          <w:b/>
+          <w:i w:val="0"/>
+          <w:sz w:val="24"/>
+        </w:rPr>
+        <w:t xml:space="preserve">6.9. </w:t>
+      </w:r>
+      <w:r>
+        <w:rPr>
+          <w:rFonts w:ascii="Times New Roman" w:hAnsi="Times New Roman" w:eastAsia="Times New Roman"/>
           <w:b w:val="0"/>
           <w:i w:val="0"/>
           <w:sz w:val="24"/>
         </w:rPr>
-        <w:t>6.9. Sustainability Plan</w:t>
+        <w:t>Sustainability Plan</w:t>
       </w:r>
       <w:r>
         <w:rPr>
@@ -2765,14 +3475,28 @@
         </w:rPr>
         <w:tab/>
         <w:t>86</w:t>
+      </w:r>
+    </w:p>
+    <w:p>
+      <w:pPr>
+        <w:spacing w:before="0" w:after="80" w:line="160" w:lineRule="exact"/>
+        <w:jc w:val="center"/>
+      </w:pPr>
+      <w:r>
+        <w:rPr>
+          <w:rFonts w:ascii="Times New Roman" w:hAnsi="Times New Roman" w:eastAsia="Times New Roman"/>
+          <w:b w:val="0"/>
+          <w:i w:val="0"/>
+          <w:sz w:val="12"/>
+        </w:rPr>
       </w:r>
     </w:p>
     <w:p>
       <w:pPr>
         <w:tabs>
-          <w:tab w:pos="9071" w:val="right" w:leader="dot"/>
+          <w:tab w:pos="9184" w:val="right" w:leader="dot"/>
         </w:tabs>
-        <w:spacing w:before="20" w:after="20" w:line="320" w:lineRule="exact"/>
+        <w:spacing w:before="0" w:after="40" w:line="360" w:lineRule="exact"/>
         <w:jc w:val="left"/>
       </w:pPr>
       <w:r>
@@ -2798,20 +3522,29 @@
     <w:p>
       <w:pPr>
         <w:tabs>
-          <w:tab w:pos="9071" w:val="right" w:leader="dot"/>
+          <w:tab w:pos="9184" w:val="right" w:leader="dot"/>
         </w:tabs>
-        <w:spacing w:before="20" w:after="20" w:line="320" w:lineRule="exact"/>
-        <w:ind w:left="340"/>
+        <w:spacing w:before="0" w:after="40" w:line="360" w:lineRule="exact"/>
+        <w:ind w:left="397"/>
         <w:jc w:val="left"/>
       </w:pPr>
       <w:r>
         <w:rPr>
           <w:rFonts w:ascii="Times New Roman" w:hAnsi="Times New Roman" w:eastAsia="Times New Roman"/>
+          <w:b/>
+          <w:i w:val="0"/>
+          <w:sz w:val="24"/>
+        </w:rPr>
+        <w:t xml:space="preserve">7.1. </w:t>
+      </w:r>
+      <w:r>
+        <w:rPr>
+          <w:rFonts w:ascii="Times New Roman" w:hAnsi="Times New Roman" w:eastAsia="Times New Roman"/>
           <w:b w:val="0"/>
           <w:i w:val="0"/>
           <w:sz w:val="24"/>
         </w:rPr>
-        <w:t>7.1. Results and Discussion</w:t>
+        <w:t>Results and Discussion</w:t>
       </w:r>
       <w:r>
         <w:rPr>
@@ -2827,20 +3560,29 @@
     <w:p>
       <w:pPr>
         <w:tabs>
-          <w:tab w:pos="9071" w:val="right" w:leader="dot"/>
+          <w:tab w:pos="9184" w:val="right" w:leader="dot"/>
         </w:tabs>
-        <w:spacing w:before="20" w:after="20" w:line="320" w:lineRule="exact"/>
-        <w:ind w:left="340"/>
+        <w:spacing w:before="0" w:after="40" w:line="360" w:lineRule="exact"/>
+        <w:ind w:left="397"/>
         <w:jc w:val="left"/>
       </w:pPr>
       <w:r>
         <w:rPr>
           <w:rFonts w:ascii="Times New Roman" w:hAnsi="Times New Roman" w:eastAsia="Times New Roman"/>
+          <w:b/>
+          <w:i w:val="0"/>
+          <w:sz w:val="24"/>
+        </w:rPr>
+        <w:t xml:space="preserve">7.2. </w:t>
+      </w:r>
+      <w:r>
+        <w:rPr>
+          <w:rFonts w:ascii="Times New Roman" w:hAnsi="Times New Roman" w:eastAsia="Times New Roman"/>
           <w:b w:val="0"/>
           <w:i w:val="0"/>
           <w:sz w:val="24"/>
         </w:rPr>
-        <w:t>7.2. Achievement of Objectives</w:t>
+        <w:t>Achievement of Objectives</w:t>
       </w:r>
       <w:r>
         <w:rPr>
@@ -2856,20 +3598,29 @@
     <w:p>
       <w:pPr>
         <w:tabs>
-          <w:tab w:pos="9071" w:val="right" w:leader="dot"/>
+          <w:tab w:pos="9184" w:val="right" w:leader="dot"/>
         </w:tabs>
-        <w:spacing w:before="20" w:after="20" w:line="320" w:lineRule="exact"/>
-        <w:ind w:left="340"/>
+        <w:spacing w:before="0" w:after="40" w:line="360" w:lineRule="exact"/>
+        <w:ind w:left="397"/>
         <w:jc w:val="left"/>
       </w:pPr>
       <w:r>
         <w:rPr>
           <w:rFonts w:ascii="Times New Roman" w:hAnsi="Times New Roman" w:eastAsia="Times New Roman"/>
+          <w:b/>
+          <w:i w:val="0"/>
+          <w:sz w:val="24"/>
+        </w:rPr>
+        <w:t xml:space="preserve">7.3. </w:t>
+      </w:r>
+      <w:r>
+        <w:rPr>
+          <w:rFonts w:ascii="Times New Roman" w:hAnsi="Times New Roman" w:eastAsia="Times New Roman"/>
           <w:b w:val="0"/>
           <w:i w:val="0"/>
           <w:sz w:val="24"/>
         </w:rPr>
-        <w:t>7.3. Project Contributions</w:t>
+        <w:t>Project Contributions</w:t>
       </w:r>
       <w:r>
         <w:rPr>
@@ -2885,20 +3636,29 @@
     <w:p>
       <w:pPr>
         <w:tabs>
-          <w:tab w:pos="9071" w:val="right" w:leader="dot"/>
+          <w:tab w:pos="9184" w:val="right" w:leader="dot"/>
         </w:tabs>
-        <w:spacing w:before="20" w:after="20" w:line="320" w:lineRule="exact"/>
-        <w:ind w:left="340"/>
+        <w:spacing w:before="0" w:after="40" w:line="360" w:lineRule="exact"/>
+        <w:ind w:left="397"/>
         <w:jc w:val="left"/>
       </w:pPr>
       <w:r>
         <w:rPr>
           <w:rFonts w:ascii="Times New Roman" w:hAnsi="Times New Roman" w:eastAsia="Times New Roman"/>
+          <w:b/>
+          <w:i w:val="0"/>
+          <w:sz w:val="24"/>
+        </w:rPr>
+        <w:t xml:space="preserve">7.4. </w:t>
+      </w:r>
+      <w:r>
+        <w:rPr>
+          <w:rFonts w:ascii="Times New Roman" w:hAnsi="Times New Roman" w:eastAsia="Times New Roman"/>
           <w:b w:val="0"/>
           <w:i w:val="0"/>
           <w:sz w:val="24"/>
         </w:rPr>
-        <w:t>7.4. Limitations</w:t>
+        <w:t>Limitations</w:t>
       </w:r>
       <w:r>
         <w:rPr>
@@ -2914,20 +3674,29 @@
     <w:p>
       <w:pPr>
         <w:tabs>
-          <w:tab w:pos="9071" w:val="right" w:leader="dot"/>
+          <w:tab w:pos="9184" w:val="right" w:leader="dot"/>
         </w:tabs>
-        <w:spacing w:before="20" w:after="20" w:line="320" w:lineRule="exact"/>
-        <w:ind w:left="340"/>
+        <w:spacing w:before="0" w:after="40" w:line="360" w:lineRule="exact"/>
+        <w:ind w:left="397"/>
         <w:jc w:val="left"/>
       </w:pPr>
       <w:r>
         <w:rPr>
           <w:rFonts w:ascii="Times New Roman" w:hAnsi="Times New Roman" w:eastAsia="Times New Roman"/>
+          <w:b/>
+          <w:i w:val="0"/>
+          <w:sz w:val="24"/>
+        </w:rPr>
+        <w:t xml:space="preserve">7.5. </w:t>
+      </w:r>
+      <w:r>
+        <w:rPr>
+          <w:rFonts w:ascii="Times New Roman" w:hAnsi="Times New Roman" w:eastAsia="Times New Roman"/>
           <w:b w:val="0"/>
           <w:i w:val="0"/>
           <w:sz w:val="24"/>
         </w:rPr>
-        <w:t>7.5. Future Enhancements</w:t>
+        <w:t>Future Enhancements</w:t>
       </w:r>
       <w:r>
         <w:rPr>
@@ -2943,20 +3712,29 @@
     <w:p>
       <w:pPr>
         <w:tabs>
-          <w:tab w:pos="9071" w:val="right" w:leader="dot"/>
+          <w:tab w:pos="9184" w:val="right" w:leader="dot"/>
         </w:tabs>
-        <w:spacing w:before="20" w:after="20" w:line="320" w:lineRule="exact"/>
-        <w:ind w:left="340"/>
+        <w:spacing w:before="0" w:after="40" w:line="360" w:lineRule="exact"/>
+        <w:ind w:left="397"/>
         <w:jc w:val="left"/>
       </w:pPr>
       <w:r>
         <w:rPr>
           <w:rFonts w:ascii="Times New Roman" w:hAnsi="Times New Roman" w:eastAsia="Times New Roman"/>
+          <w:b/>
+          <w:i w:val="0"/>
+          <w:sz w:val="24"/>
+        </w:rPr>
+        <w:t xml:space="preserve">7.6. </w:t>
+      </w:r>
+      <w:r>
+        <w:rPr>
+          <w:rFonts w:ascii="Times New Roman" w:hAnsi="Times New Roman" w:eastAsia="Times New Roman"/>
           <w:b w:val="0"/>
           <w:i w:val="0"/>
           <w:sz w:val="24"/>
         </w:rPr>
-        <w:t>7.6. Conclusion</w:t>
+        <w:t>Conclusion</w:t>
       </w:r>
       <w:r>
         <w:rPr>
@@ -2967,14 +3745,28 @@
         </w:rPr>
         <w:tab/>
         <w:t>91</w:t>
+      </w:r>
+    </w:p>
+    <w:p>
+      <w:pPr>
+        <w:spacing w:before="0" w:after="80" w:line="160" w:lineRule="exact"/>
+        <w:jc w:val="center"/>
+      </w:pPr>
+      <w:r>
+        <w:rPr>
+          <w:rFonts w:ascii="Times New Roman" w:hAnsi="Times New Roman" w:eastAsia="Times New Roman"/>
+          <w:b w:val="0"/>
+          <w:i w:val="0"/>
+          <w:sz w:val="12"/>
+        </w:rPr>
       </w:r>
     </w:p>
     <w:p>
       <w:pPr>
         <w:tabs>
-          <w:tab w:pos="9071" w:val="right" w:leader="dot"/>
+          <w:tab w:pos="9184" w:val="right" w:leader="dot"/>
         </w:tabs>
-        <w:spacing w:before="20" w:after="20" w:line="320" w:lineRule="exact"/>
+        <w:spacing w:before="0" w:after="40" w:line="360" w:lineRule="exact"/>
         <w:jc w:val="left"/>
       </w:pPr>
       <w:r>
@@ -2994,15 +3786,15 @@
           <w:sz w:val="24"/>
         </w:rPr>
         <w:tab/>
-        <w:t>86</w:t>
+        <w:t>92</w:t>
       </w:r>
     </w:p>
     <w:p>
       <w:pPr>
         <w:tabs>
-          <w:tab w:pos="9071" w:val="right" w:leader="dot"/>
+          <w:tab w:pos="9184" w:val="right" w:leader="dot"/>
         </w:tabs>
-        <w:spacing w:before="20" w:after="20" w:line="320" w:lineRule="exact"/>
+        <w:spacing w:before="0" w:after="40" w:line="360" w:lineRule="exact"/>
         <w:jc w:val="left"/>
       </w:pPr>
       <w:r>
@@ -3012,7 +3804,7 @@
           <w:i w:val="0"/>
           <w:sz w:val="24"/>
         </w:rPr>
-        <w:t>APPENDIX A: SYSTEM LOGIC</w:t>
+        <w:t>ANNEXURES</w:t>
       </w:r>
       <w:r>
         <w:rPr>
@@ -3022,119 +3814,7 @@
           <w:sz w:val="24"/>
         </w:rPr>
         <w:tab/>
-        <w:t>89</w:t>
-      </w:r>
-    </w:p>
-    <w:p>
-      <w:pPr>
-        <w:tabs>
-          <w:tab w:pos="9071" w:val="right" w:leader="dot"/>
-        </w:tabs>
-        <w:spacing w:before="20" w:after="20" w:line="320" w:lineRule="exact"/>
-        <w:jc w:val="left"/>
-      </w:pPr>
-      <w:r>
-        <w:rPr>
-          <w:rFonts w:ascii="Times New Roman" w:hAnsi="Times New Roman" w:eastAsia="Times New Roman"/>
-          <w:b/>
-          <w:i w:val="0"/>
-          <w:sz w:val="24"/>
-        </w:rPr>
-        <w:t>SURVEY QUESTIONNAIRE</w:t>
-      </w:r>
-      <w:r>
-        <w:rPr>
-          <w:rFonts w:ascii="Times New Roman" w:hAnsi="Times New Roman" w:eastAsia="Times New Roman"/>
-          <w:b/>
-          <w:i w:val="0"/>
-          <w:sz w:val="24"/>
-        </w:rPr>
-        <w:tab/>
-        <w:t>94</w:t>
-      </w:r>
-    </w:p>
-    <w:p>
-      <w:pPr>
-        <w:tabs>
-          <w:tab w:pos="9071" w:val="right" w:leader="dot"/>
-        </w:tabs>
-        <w:spacing w:before="20" w:after="20" w:line="320" w:lineRule="exact"/>
-        <w:jc w:val="left"/>
-      </w:pPr>
-      <w:r>
-        <w:rPr>
-          <w:rFonts w:ascii="Times New Roman" w:hAnsi="Times New Roman" w:eastAsia="Times New Roman"/>
-          <w:b/>
-          <w:i w:val="0"/>
-          <w:sz w:val="24"/>
-        </w:rPr>
-        <w:t>FEEDBACK QUESTIONNAIRE</w:t>
-      </w:r>
-      <w:r>
-        <w:rPr>
-          <w:rFonts w:ascii="Times New Roman" w:hAnsi="Times New Roman" w:eastAsia="Times New Roman"/>
-          <w:b/>
-          <w:i w:val="0"/>
-          <w:sz w:val="24"/>
-        </w:rPr>
-        <w:tab/>
-        <w:t>95</w:t>
-      </w:r>
-    </w:p>
-    <w:p>
-      <w:pPr>
-        <w:tabs>
-          <w:tab w:pos="9071" w:val="right" w:leader="dot"/>
-        </w:tabs>
-        <w:spacing w:before="20" w:after="20" w:line="320" w:lineRule="exact"/>
-        <w:jc w:val="left"/>
-      </w:pPr>
-      <w:r>
-        <w:rPr>
-          <w:rFonts w:ascii="Times New Roman" w:hAnsi="Times New Roman" w:eastAsia="Times New Roman"/>
-          <w:b/>
-          <w:i w:val="0"/>
-          <w:sz w:val="24"/>
-        </w:rPr>
-        <w:t>FIELD VISIT PHOTOGRAPHS</w:t>
-      </w:r>
-      <w:r>
-        <w:rPr>
-          <w:rFonts w:ascii="Times New Roman" w:hAnsi="Times New Roman" w:eastAsia="Times New Roman"/>
-          <w:b/>
-          <w:i w:val="0"/>
-          <w:sz w:val="24"/>
-        </w:rPr>
-        <w:tab/>
-        <w:t>96</w:t>
-      </w:r>
-    </w:p>
-    <w:p>
-      <w:pPr>
-        <w:tabs>
-          <w:tab w:pos="9071" w:val="right" w:leader="dot"/>
-        </w:tabs>
-        <w:spacing w:before="20" w:after="20" w:line="320" w:lineRule="exact"/>
-        <w:jc w:val="left"/>
-      </w:pPr>
-      <w:r>
-        <w:rPr>
-          <w:rFonts w:ascii="Times New Roman" w:hAnsi="Times New Roman" w:eastAsia="Times New Roman"/>
-          <w:b/>
-          <w:i w:val="0"/>
-          <w:sz w:val="24"/>
-        </w:rPr>
-        <w:t>ANNEXURES</w:t>
-      </w:r>
-      <w:r>
-        <w:rPr>
-          <w:rFonts w:ascii="Times New Roman" w:hAnsi="Times New Roman" w:eastAsia="Times New Roman"/>
-          <w:b/>
-          <w:i w:val="0"/>
-          <w:sz w:val="24"/>
-        </w:rPr>
-        <w:tab/>
-        <w:t>94 – 98</w:t>
+        <w:t>95 – 102</w:t>
       </w:r>
     </w:p>
     <w:sectPr>

</xml_diff>

<commit_message>
Update TOC page numbers to the printed black-book map.
Chapters 1–7, references at 86, and annexures from 89 onwards.

Co-authored-by: omkeluskar <omkeluskar@users.noreply.github.com>
</commit_message>
<xml_diff>
--- a/cep-iot-bus-stop/chapters/Front_Matter.docx
+++ b/cep-iot-bus-stop/chapters/Front_Matter.docx
@@ -670,7 +670,7 @@
           <w:sz w:val="24"/>
         </w:rPr>
         <w:tab/>
-        <w:t>2</w:t>
+        <w:t>1</w:t>
       </w:r>
     </w:p>
     <w:p>
@@ -708,7 +708,7 @@
           <w:sz w:val="24"/>
         </w:rPr>
         <w:tab/>
-        <w:t>3</w:t>
+        <w:t>2</w:t>
       </w:r>
     </w:p>
     <w:p>
@@ -746,7 +746,7 @@
           <w:sz w:val="24"/>
         </w:rPr>
         <w:tab/>
-        <w:t>4</w:t>
+        <w:t>3</w:t>
       </w:r>
     </w:p>
     <w:p>
@@ -784,7 +784,7 @@
           <w:sz w:val="24"/>
         </w:rPr>
         <w:tab/>
-        <w:t>5</w:t>
+        <w:t>3</w:t>
       </w:r>
     </w:p>
     <w:p>
@@ -822,7 +822,7 @@
           <w:sz w:val="24"/>
         </w:rPr>
         <w:tab/>
-        <w:t>5</w:t>
+        <w:t>3</w:t>
       </w:r>
     </w:p>
     <w:p>
@@ -860,7 +860,7 @@
           <w:sz w:val="24"/>
         </w:rPr>
         <w:tab/>
-        <w:t>6</w:t>
+        <w:t>4</w:t>
       </w:r>
     </w:p>
     <w:p>
@@ -898,7 +898,7 @@
           <w:sz w:val="24"/>
         </w:rPr>
         <w:tab/>
-        <w:t>7</w:t>
+        <w:t>4</w:t>
       </w:r>
     </w:p>
     <w:p>
@@ -936,7 +936,7 @@
           <w:sz w:val="24"/>
         </w:rPr>
         <w:tab/>
-        <w:t>8</w:t>
+        <w:t>5</w:t>
       </w:r>
     </w:p>
     <w:p>
@@ -974,7 +974,7 @@
           <w:sz w:val="24"/>
         </w:rPr>
         <w:tab/>
-        <w:t>8</w:t>
+        <w:t>5</w:t>
       </w:r>
     </w:p>
     <w:p>
@@ -1012,7 +1012,7 @@
           <w:sz w:val="24"/>
         </w:rPr>
         <w:tab/>
-        <w:t>9</w:t>
+        <w:t>6</w:t>
       </w:r>
     </w:p>
     <w:p>
@@ -1050,7 +1050,7 @@
           <w:sz w:val="24"/>
         </w:rPr>
         <w:tab/>
-        <w:t>10</w:t>
+        <w:t>6</w:t>
       </w:r>
     </w:p>
     <w:p>
@@ -1088,7 +1088,7 @@
           <w:sz w:val="24"/>
         </w:rPr>
         <w:tab/>
-        <w:t>10</w:t>
+        <w:t>7</w:t>
       </w:r>
     </w:p>
     <w:p>
@@ -1130,7 +1130,7 @@
           <w:sz w:val="24"/>
         </w:rPr>
         <w:tab/>
-        <w:t>11</w:t>
+        <w:t>8</w:t>
       </w:r>
     </w:p>
     <w:p>
@@ -1168,7 +1168,7 @@
           <w:sz w:val="24"/>
         </w:rPr>
         <w:tab/>
-        <w:t>11</w:t>
+        <w:t>8</w:t>
       </w:r>
     </w:p>
     <w:p>
@@ -1206,7 +1206,7 @@
           <w:sz w:val="24"/>
         </w:rPr>
         <w:tab/>
-        <w:t>11</w:t>
+        <w:t>8</w:t>
       </w:r>
     </w:p>
     <w:p>
@@ -1244,7 +1244,7 @@
           <w:sz w:val="24"/>
         </w:rPr>
         <w:tab/>
-        <w:t>15</w:t>
+        <w:t>11</w:t>
       </w:r>
     </w:p>
     <w:p>
@@ -1282,7 +1282,7 @@
           <w:sz w:val="24"/>
         </w:rPr>
         <w:tab/>
-        <w:t>17</w:t>
+        <w:t>11</w:t>
       </w:r>
     </w:p>
     <w:p>
@@ -1320,7 +1320,7 @@
           <w:sz w:val="24"/>
         </w:rPr>
         <w:tab/>
-        <w:t>18</w:t>
+        <w:t>12</w:t>
       </w:r>
     </w:p>
     <w:p>
@@ -1358,7 +1358,7 @@
           <w:sz w:val="24"/>
         </w:rPr>
         <w:tab/>
-        <w:t>19</w:t>
+        <w:t>13</w:t>
       </w:r>
     </w:p>
     <w:p>
@@ -1396,7 +1396,7 @@
           <w:sz w:val="24"/>
         </w:rPr>
         <w:tab/>
-        <w:t>20</w:t>
+        <w:t>14</w:t>
       </w:r>
     </w:p>
     <w:p>
@@ -1434,7 +1434,7 @@
           <w:sz w:val="24"/>
         </w:rPr>
         <w:tab/>
-        <w:t>21</w:t>
+        <w:t>15</w:t>
       </w:r>
     </w:p>
     <w:p>
@@ -1472,7 +1472,7 @@
           <w:sz w:val="24"/>
         </w:rPr>
         <w:tab/>
-        <w:t>22</w:t>
+        <w:t>16</w:t>
       </w:r>
     </w:p>
     <w:p>
@@ -1510,7 +1510,7 @@
           <w:sz w:val="24"/>
         </w:rPr>
         <w:tab/>
-        <w:t>23</w:t>
+        <w:t>16</w:t>
       </w:r>
     </w:p>
     <w:p>
@@ -1548,7 +1548,7 @@
           <w:sz w:val="24"/>
         </w:rPr>
         <w:tab/>
-        <w:t>24</w:t>
+        <w:t>17</w:t>
       </w:r>
     </w:p>
     <w:p>
@@ -1586,7 +1586,7 @@
           <w:sz w:val="24"/>
         </w:rPr>
         <w:tab/>
-        <w:t>25</w:t>
+        <w:t>17</w:t>
       </w:r>
     </w:p>
     <w:p>
@@ -1624,7 +1624,7 @@
           <w:sz w:val="24"/>
         </w:rPr>
         <w:tab/>
-        <w:t>26</w:t>
+        <w:t>18</w:t>
       </w:r>
     </w:p>
     <w:p>
@@ -1671,7 +1671,7 @@
           <w:sz w:val="24"/>
         </w:rPr>
         <w:tab/>
-        <w:t>27</w:t>
+        <w:t>19</w:t>
       </w:r>
     </w:p>
     <w:p>
@@ -1709,7 +1709,7 @@
           <w:sz w:val="24"/>
         </w:rPr>
         <w:tab/>
-        <w:t>27</w:t>
+        <w:t>19</w:t>
       </w:r>
     </w:p>
     <w:p>
@@ -1747,7 +1747,7 @@
           <w:sz w:val="24"/>
         </w:rPr>
         <w:tab/>
-        <w:t>28</w:t>
+        <w:t>20</w:t>
       </w:r>
     </w:p>
     <w:p>
@@ -1785,7 +1785,7 @@
           <w:sz w:val="24"/>
         </w:rPr>
         <w:tab/>
-        <w:t>29</w:t>
+        <w:t>21</w:t>
       </w:r>
     </w:p>
     <w:p>
@@ -1823,7 +1823,7 @@
           <w:sz w:val="24"/>
         </w:rPr>
         <w:tab/>
-        <w:t>29</w:t>
+        <w:t>22</w:t>
       </w:r>
     </w:p>
     <w:p>
@@ -1861,7 +1861,7 @@
           <w:sz w:val="24"/>
         </w:rPr>
         <w:tab/>
-        <w:t>30</w:t>
+        <w:t>23</w:t>
       </w:r>
     </w:p>
     <w:p>
@@ -1899,7 +1899,7 @@
           <w:sz w:val="24"/>
         </w:rPr>
         <w:tab/>
-        <w:t>31</w:t>
+        <w:t>25</w:t>
       </w:r>
     </w:p>
     <w:p>
@@ -1937,7 +1937,7 @@
           <w:sz w:val="24"/>
         </w:rPr>
         <w:tab/>
-        <w:t>33</w:t>
+        <w:t>27</w:t>
       </w:r>
     </w:p>
     <w:p>
@@ -1975,7 +1975,7 @@
           <w:sz w:val="24"/>
         </w:rPr>
         <w:tab/>
-        <w:t>35</w:t>
+        <w:t>30</w:t>
       </w:r>
     </w:p>
     <w:p>
@@ -2013,7 +2013,7 @@
           <w:sz w:val="24"/>
         </w:rPr>
         <w:tab/>
-        <w:t>37</w:t>
+        <w:t>31</w:t>
       </w:r>
     </w:p>
     <w:p>
@@ -2051,7 +2051,7 @@
           <w:sz w:val="24"/>
         </w:rPr>
         <w:tab/>
-        <w:t>38</w:t>
+        <w:t>32</w:t>
       </w:r>
     </w:p>
     <w:p>
@@ -2089,7 +2089,7 @@
           <w:sz w:val="24"/>
         </w:rPr>
         <w:tab/>
-        <w:t>42</w:t>
+        <w:t>33</w:t>
       </w:r>
     </w:p>
     <w:p>
@@ -2127,7 +2127,7 @@
           <w:sz w:val="24"/>
         </w:rPr>
         <w:tab/>
-        <w:t>43</w:t>
+        <w:t>34</w:t>
       </w:r>
     </w:p>
     <w:p>
@@ -2165,7 +2165,7 @@
           <w:sz w:val="24"/>
         </w:rPr>
         <w:tab/>
-        <w:t>45</w:t>
+        <w:t>35</w:t>
       </w:r>
     </w:p>
     <w:p>
@@ -2207,7 +2207,7 @@
           <w:sz w:val="24"/>
         </w:rPr>
         <w:tab/>
-        <w:t>46</w:t>
+        <w:t>36</w:t>
       </w:r>
     </w:p>
     <w:p>
@@ -2245,7 +2245,7 @@
           <w:sz w:val="24"/>
         </w:rPr>
         <w:tab/>
-        <w:t>46</w:t>
+        <w:t>36</w:t>
       </w:r>
     </w:p>
     <w:p>
@@ -2283,7 +2283,7 @@
           <w:sz w:val="24"/>
         </w:rPr>
         <w:tab/>
-        <w:t>46</w:t>
+        <w:t>36</w:t>
       </w:r>
     </w:p>
     <w:p>
@@ -2321,7 +2321,7 @@
           <w:sz w:val="24"/>
         </w:rPr>
         <w:tab/>
-        <w:t>48</w:t>
+        <w:t>38</w:t>
       </w:r>
     </w:p>
     <w:p>
@@ -2359,7 +2359,7 @@
           <w:sz w:val="24"/>
         </w:rPr>
         <w:tab/>
-        <w:t>51</w:t>
+        <w:t>42</w:t>
       </w:r>
     </w:p>
     <w:p>
@@ -2397,7 +2397,7 @@
           <w:sz w:val="24"/>
         </w:rPr>
         <w:tab/>
-        <w:t>56</w:t>
+        <w:t>44</w:t>
       </w:r>
     </w:p>
     <w:p>
@@ -2435,7 +2435,7 @@
           <w:sz w:val="24"/>
         </w:rPr>
         <w:tab/>
-        <w:t>58</w:t>
+        <w:t>46</w:t>
       </w:r>
     </w:p>
     <w:p>
@@ -2473,7 +2473,7 @@
           <w:sz w:val="24"/>
         </w:rPr>
         <w:tab/>
-        <w:t>59</w:t>
+        <w:t>48</w:t>
       </w:r>
     </w:p>
     <w:p>
@@ -2511,7 +2511,7 @@
           <w:sz w:val="24"/>
         </w:rPr>
         <w:tab/>
-        <w:t>60</w:t>
+        <w:t>50</w:t>
       </w:r>
     </w:p>
     <w:p>
@@ -2549,7 +2549,7 @@
           <w:sz w:val="24"/>
         </w:rPr>
         <w:tab/>
-        <w:t>61</w:t>
+        <w:t>52</w:t>
       </w:r>
     </w:p>
     <w:p>
@@ -2587,7 +2587,7 @@
           <w:sz w:val="24"/>
         </w:rPr>
         <w:tab/>
-        <w:t>62</w:t>
+        <w:t>53</w:t>
       </w:r>
     </w:p>
     <w:p>
@@ -2625,7 +2625,7 @@
           <w:sz w:val="24"/>
         </w:rPr>
         <w:tab/>
-        <w:t>63</w:t>
+        <w:t>54</w:t>
       </w:r>
     </w:p>
     <w:p>
@@ -2672,7 +2672,7 @@
           <w:sz w:val="24"/>
         </w:rPr>
         <w:tab/>
-        <w:t>66</w:t>
+        <w:t>58</w:t>
       </w:r>
     </w:p>
     <w:p>
@@ -2710,7 +2710,7 @@
           <w:sz w:val="24"/>
         </w:rPr>
         <w:tab/>
-        <w:t>66</w:t>
+        <w:t>58</w:t>
       </w:r>
     </w:p>
     <w:p>
@@ -2748,7 +2748,7 @@
           <w:sz w:val="24"/>
         </w:rPr>
         <w:tab/>
-        <w:t>66</w:t>
+        <w:t>58</w:t>
       </w:r>
     </w:p>
     <w:p>
@@ -2786,7 +2786,7 @@
           <w:sz w:val="24"/>
         </w:rPr>
         <w:tab/>
-        <w:t>68</w:t>
+        <w:t>60</w:t>
       </w:r>
     </w:p>
     <w:p>
@@ -2824,7 +2824,7 @@
           <w:sz w:val="24"/>
         </w:rPr>
         <w:tab/>
-        <w:t>70</w:t>
+        <w:t>62</w:t>
       </w:r>
     </w:p>
     <w:p>
@@ -2862,7 +2862,7 @@
           <w:sz w:val="24"/>
         </w:rPr>
         <w:tab/>
-        <w:t>72</w:t>
+        <w:t>64</w:t>
       </w:r>
     </w:p>
     <w:p>
@@ -2900,7 +2900,7 @@
           <w:sz w:val="24"/>
         </w:rPr>
         <w:tab/>
-        <w:t>72</w:t>
+        <w:t>65</w:t>
       </w:r>
     </w:p>
     <w:p>
@@ -2938,7 +2938,7 @@
           <w:sz w:val="24"/>
         </w:rPr>
         <w:tab/>
-        <w:t>74</w:t>
+        <w:t>67</w:t>
       </w:r>
     </w:p>
     <w:p>
@@ -2976,7 +2976,7 @@
           <w:sz w:val="24"/>
         </w:rPr>
         <w:tab/>
-        <w:t>75</w:t>
+        <w:t>68</w:t>
       </w:r>
     </w:p>
     <w:p>
@@ -3014,7 +3014,7 @@
           <w:sz w:val="24"/>
         </w:rPr>
         <w:tab/>
-        <w:t>77</w:t>
+        <w:t>69</w:t>
       </w:r>
     </w:p>
     <w:p>
@@ -3052,7 +3052,7 @@
           <w:sz w:val="24"/>
         </w:rPr>
         <w:tab/>
-        <w:t>78</w:t>
+        <w:t>70</w:t>
       </w:r>
     </w:p>
     <w:p>
@@ -3090,7 +3090,7 @@
           <w:sz w:val="24"/>
         </w:rPr>
         <w:tab/>
-        <w:t>79</w:t>
+        <w:t>71</w:t>
       </w:r>
     </w:p>
     <w:p>
@@ -3132,7 +3132,7 @@
           <w:sz w:val="24"/>
         </w:rPr>
         <w:tab/>
-        <w:t>80</w:t>
+        <w:t>72</w:t>
       </w:r>
     </w:p>
     <w:p>
@@ -3170,7 +3170,7 @@
           <w:sz w:val="24"/>
         </w:rPr>
         <w:tab/>
-        <w:t>80</w:t>
+        <w:t>72</w:t>
       </w:r>
     </w:p>
     <w:p>
@@ -3208,7 +3208,7 @@
           <w:sz w:val="24"/>
         </w:rPr>
         <w:tab/>
-        <w:t>80</w:t>
+        <w:t>72</w:t>
       </w:r>
     </w:p>
     <w:p>
@@ -3246,7 +3246,7 @@
           <w:sz w:val="24"/>
         </w:rPr>
         <w:tab/>
-        <w:t>81</w:t>
+        <w:t>73</w:t>
       </w:r>
     </w:p>
     <w:p>
@@ -3284,7 +3284,7 @@
           <w:sz w:val="24"/>
         </w:rPr>
         <w:tab/>
-        <w:t>82</w:t>
+        <w:t>74</w:t>
       </w:r>
     </w:p>
     <w:p>
@@ -3322,7 +3322,7 @@
           <w:sz w:val="24"/>
         </w:rPr>
         <w:tab/>
-        <w:t>83</w:t>
+        <w:t>75</w:t>
       </w:r>
     </w:p>
     <w:p>
@@ -3360,7 +3360,7 @@
           <w:sz w:val="24"/>
         </w:rPr>
         <w:tab/>
-        <w:t>83</w:t>
+        <w:t>75</w:t>
       </w:r>
     </w:p>
     <w:p>
@@ -3398,7 +3398,7 @@
           <w:sz w:val="24"/>
         </w:rPr>
         <w:tab/>
-        <w:t>85</w:t>
+        <w:t>77</w:t>
       </w:r>
     </w:p>
     <w:p>
@@ -3436,7 +3436,7 @@
           <w:sz w:val="24"/>
         </w:rPr>
         <w:tab/>
-        <w:t>86</w:t>
+        <w:t>78</w:t>
       </w:r>
     </w:p>
     <w:p>
@@ -3474,7 +3474,7 @@
           <w:sz w:val="24"/>
         </w:rPr>
         <w:tab/>
-        <w:t>86</w:t>
+        <w:t>79</w:t>
       </w:r>
     </w:p>
     <w:p>
@@ -3516,7 +3516,7 @@
           <w:sz w:val="24"/>
         </w:rPr>
         <w:tab/>
-        <w:t>87</w:t>
+        <w:t>80</w:t>
       </w:r>
     </w:p>
     <w:p>
@@ -3554,7 +3554,7 @@
           <w:sz w:val="24"/>
         </w:rPr>
         <w:tab/>
-        <w:t>87</w:t>
+        <w:t>80</w:t>
       </w:r>
     </w:p>
     <w:p>
@@ -3592,7 +3592,7 @@
           <w:sz w:val="24"/>
         </w:rPr>
         <w:tab/>
-        <w:t>88</w:t>
+        <w:t>81</w:t>
       </w:r>
     </w:p>
     <w:p>
@@ -3630,7 +3630,7 @@
           <w:sz w:val="24"/>
         </w:rPr>
         <w:tab/>
-        <w:t>89</w:t>
+        <w:t>82</w:t>
       </w:r>
     </w:p>
     <w:p>
@@ -3668,7 +3668,7 @@
           <w:sz w:val="24"/>
         </w:rPr>
         <w:tab/>
-        <w:t>90</w:t>
+        <w:t>83</w:t>
       </w:r>
     </w:p>
     <w:p>
@@ -3706,7 +3706,7 @@
           <w:sz w:val="24"/>
         </w:rPr>
         <w:tab/>
-        <w:t>90</w:t>
+        <w:t>84</w:t>
       </w:r>
     </w:p>
     <w:p>
@@ -3744,7 +3744,7 @@
           <w:sz w:val="24"/>
         </w:rPr>
         <w:tab/>
-        <w:t>91</w:t>
+        <w:t>85</w:t>
       </w:r>
     </w:p>
     <w:p>
@@ -3786,7 +3786,7 @@
           <w:sz w:val="24"/>
         </w:rPr>
         <w:tab/>
-        <w:t>92</w:t>
+        <w:t>86</w:t>
       </w:r>
     </w:p>
     <w:p>
@@ -3814,7 +3814,7 @@
           <w:sz w:val="24"/>
         </w:rPr>
         <w:tab/>
-        <w:t>95 – 102</w:t>
+        <w:t>89 onwards</w:t>
       </w:r>
     </w:p>
     <w:sectPr>

</xml_diff>

<commit_message>
Put real dotted leaders in the TOC Word file.
Google Docs drops tab leaders, so each line is now title plus typed '. .' dots, and a page-image Word file matches the PDF exactly.

Co-authored-by: omkeluskar <omkeluskar@users.noreply.github.com>
</commit_message>
<xml_diff>
--- a/cep-iot-bus-stop/chapters/Front_Matter.docx
+++ b/cep-iot-bus-stop/chapters/Front_Matter.docx
@@ -556,14 +556,13 @@
     </w:p>
     <w:p>
       <w:pPr>
-        <w:spacing w:before="0" w:after="280" w:line="440" w:lineRule="exact"/>
+        <w:spacing w:after="320" w:line="240" w:lineRule="auto"/>
         <w:jc w:val="center"/>
       </w:pPr>
       <w:r>
         <w:rPr>
-          <w:rFonts w:ascii="Times New Roman" w:hAnsi="Times New Roman" w:eastAsia="Times New Roman"/>
+          <w:rFonts w:ascii="Times New Roman" w:hAnsi="Times New Roman"/>
           <w:b/>
-          <w:i w:val="0"/>
           <w:sz w:val="32"/>
         </w:rPr>
         <w:t>TABLE OF CONTENTS</w:t>
@@ -571,1075 +570,611 @@
     </w:p>
     <w:p>
       <w:pPr>
-        <w:tabs>
-          <w:tab w:pos="9184" w:val="right" w:leader="dot"/>
-        </w:tabs>
-        <w:spacing w:before="0" w:after="40" w:line="360" w:lineRule="exact"/>
-        <w:jc w:val="left"/>
+        <w:spacing w:before="20" w:after="20" w:line="259" w:lineRule="auto"/>
       </w:pPr>
       <w:r>
         <w:rPr>
-          <w:rFonts w:ascii="Times New Roman" w:hAnsi="Times New Roman" w:eastAsia="Times New Roman"/>
+          <w:rFonts w:ascii="Times New Roman" w:hAnsi="Times New Roman"/>
           <w:b/>
-          <w:i w:val="0"/>
           <w:sz w:val="24"/>
         </w:rPr>
-        <w:t>CHAPTER 1: INTRODUCTION AND COMMUNITY CONTEXT</w:t>
-      </w:r>
-      <w:r>
-        <w:rPr>
-          <w:rFonts w:ascii="Times New Roman" w:hAnsi="Times New Roman" w:eastAsia="Times New Roman"/>
-          <w:b/>
-          <w:i w:val="0"/>
-          <w:sz w:val="24"/>
-        </w:rPr>
-        <w:tab/>
-        <w:t>1</w:t>
+        <w:t>CHAPTER 1: INTRODUCTION AND COMMUNITY CONTEXT . . . . . . . . . . . . . . . . . . . . . . 1</w:t>
       </w:r>
     </w:p>
     <w:p>
       <w:pPr>
-        <w:tabs>
-          <w:tab w:pos="9184" w:val="right" w:leader="dot"/>
-        </w:tabs>
-        <w:spacing w:before="0" w:after="40" w:line="360" w:lineRule="exact"/>
+        <w:spacing w:before="20" w:after="20" w:line="259" w:lineRule="auto"/>
         <w:ind w:left="397"/>
-        <w:jc w:val="left"/>
       </w:pPr>
       <w:r>
         <w:rPr>
-          <w:rFonts w:ascii="Times New Roman" w:hAnsi="Times New Roman" w:eastAsia="Times New Roman"/>
+          <w:rFonts w:ascii="Times New Roman" w:hAnsi="Times New Roman"/>
           <w:b/>
-          <w:i w:val="0"/>
           <w:sz w:val="24"/>
         </w:rPr>
         <w:t xml:space="preserve">1.1. </w:t>
       </w:r>
       <w:r>
         <w:rPr>
-          <w:rFonts w:ascii="Times New Roman" w:hAnsi="Times New Roman" w:eastAsia="Times New Roman"/>
+          <w:rFonts w:ascii="Times New Roman" w:hAnsi="Times New Roman"/>
           <w:b w:val="0"/>
-          <w:i w:val="0"/>
           <w:sz w:val="24"/>
         </w:rPr>
-        <w:t>Project Background</w:t>
-      </w:r>
-      <w:r>
-        <w:rPr>
-          <w:rFonts w:ascii="Times New Roman" w:hAnsi="Times New Roman" w:eastAsia="Times New Roman"/>
-          <w:b w:val="0"/>
-          <w:i w:val="0"/>
-          <w:sz w:val="24"/>
-        </w:rPr>
-        <w:tab/>
-        <w:t>1</w:t>
+        <w:t>Project Background . . . . . . . . . . . . . . . . . . . . . . . . . . . . . . . . . . . . . . . . . . . . . . . . . . . . . . . . . 1</w:t>
       </w:r>
     </w:p>
     <w:p>
       <w:pPr>
-        <w:tabs>
-          <w:tab w:pos="9184" w:val="right" w:leader="dot"/>
-        </w:tabs>
-        <w:spacing w:before="0" w:after="40" w:line="360" w:lineRule="exact"/>
+        <w:spacing w:before="20" w:after="20" w:line="259" w:lineRule="auto"/>
         <w:ind w:left="397"/>
-        <w:jc w:val="left"/>
       </w:pPr>
       <w:r>
         <w:rPr>
-          <w:rFonts w:ascii="Times New Roman" w:hAnsi="Times New Roman" w:eastAsia="Times New Roman"/>
+          <w:rFonts w:ascii="Times New Roman" w:hAnsi="Times New Roman"/>
           <w:b/>
-          <w:i w:val="0"/>
           <w:sz w:val="24"/>
         </w:rPr>
         <w:t xml:space="preserve">1.2. </w:t>
       </w:r>
       <w:r>
         <w:rPr>
-          <w:rFonts w:ascii="Times New Roman" w:hAnsi="Times New Roman" w:eastAsia="Times New Roman"/>
+          <w:rFonts w:ascii="Times New Roman" w:hAnsi="Times New Roman"/>
           <w:b w:val="0"/>
-          <w:i w:val="0"/>
           <w:sz w:val="24"/>
         </w:rPr>
-        <w:t>Community Problem Identification</w:t>
-      </w:r>
-      <w:r>
-        <w:rPr>
-          <w:rFonts w:ascii="Times New Roman" w:hAnsi="Times New Roman" w:eastAsia="Times New Roman"/>
-          <w:b w:val="0"/>
-          <w:i w:val="0"/>
-          <w:sz w:val="24"/>
-        </w:rPr>
-        <w:tab/>
-        <w:t>1</w:t>
+        <w:t>Community Problem Identification . . . . . . . . . . . . . . . . . . . . . . . . . . . . . . . . . . . . . . . . . . . . . 1</w:t>
       </w:r>
     </w:p>
     <w:p>
       <w:pPr>
-        <w:tabs>
-          <w:tab w:pos="9184" w:val="right" w:leader="dot"/>
-        </w:tabs>
-        <w:spacing w:before="0" w:after="40" w:line="360" w:lineRule="exact"/>
+        <w:spacing w:before="20" w:after="20" w:line="259" w:lineRule="auto"/>
         <w:ind w:left="397"/>
-        <w:jc w:val="left"/>
       </w:pPr>
       <w:r>
         <w:rPr>
-          <w:rFonts w:ascii="Times New Roman" w:hAnsi="Times New Roman" w:eastAsia="Times New Roman"/>
+          <w:rFonts w:ascii="Times New Roman" w:hAnsi="Times New Roman"/>
           <w:b/>
-          <w:i w:val="0"/>
           <w:sz w:val="24"/>
         </w:rPr>
         <w:t xml:space="preserve">1.3. </w:t>
       </w:r>
       <w:r>
         <w:rPr>
-          <w:rFonts w:ascii="Times New Roman" w:hAnsi="Times New Roman" w:eastAsia="Times New Roman"/>
+          <w:rFonts w:ascii="Times New Roman" w:hAnsi="Times New Roman"/>
           <w:b w:val="0"/>
-          <w:i w:val="0"/>
           <w:sz w:val="24"/>
         </w:rPr>
-        <w:t>Community Need Assessment</w:t>
-      </w:r>
-      <w:r>
-        <w:rPr>
-          <w:rFonts w:ascii="Times New Roman" w:hAnsi="Times New Roman" w:eastAsia="Times New Roman"/>
-          <w:b w:val="0"/>
-          <w:i w:val="0"/>
-          <w:sz w:val="24"/>
-        </w:rPr>
-        <w:tab/>
-        <w:t>2</w:t>
+        <w:t>Community Need Assessment . . . . . . . . . . . . . . . . . . . . . . . . . . . . . . . . . . . . . . . . . . . . . . . . . 2</w:t>
       </w:r>
     </w:p>
     <w:p>
       <w:pPr>
-        <w:tabs>
-          <w:tab w:pos="9184" w:val="right" w:leader="dot"/>
-        </w:tabs>
-        <w:spacing w:before="0" w:after="40" w:line="360" w:lineRule="exact"/>
+        <w:spacing w:before="20" w:after="20" w:line="259" w:lineRule="auto"/>
         <w:ind w:left="397"/>
-        <w:jc w:val="left"/>
       </w:pPr>
       <w:r>
         <w:rPr>
-          <w:rFonts w:ascii="Times New Roman" w:hAnsi="Times New Roman" w:eastAsia="Times New Roman"/>
+          <w:rFonts w:ascii="Times New Roman" w:hAnsi="Times New Roman"/>
           <w:b/>
-          <w:i w:val="0"/>
           <w:sz w:val="24"/>
         </w:rPr>
         <w:t xml:space="preserve">1.4. </w:t>
       </w:r>
       <w:r>
         <w:rPr>
-          <w:rFonts w:ascii="Times New Roman" w:hAnsi="Times New Roman" w:eastAsia="Times New Roman"/>
+          <w:rFonts w:ascii="Times New Roman" w:hAnsi="Times New Roman"/>
           <w:b w:val="0"/>
-          <w:i w:val="0"/>
           <w:sz w:val="24"/>
         </w:rPr>
-        <w:t>Existing System Analysis</w:t>
-      </w:r>
-      <w:r>
-        <w:rPr>
-          <w:rFonts w:ascii="Times New Roman" w:hAnsi="Times New Roman" w:eastAsia="Times New Roman"/>
-          <w:b w:val="0"/>
-          <w:i w:val="0"/>
-          <w:sz w:val="24"/>
-        </w:rPr>
-        <w:tab/>
-        <w:t>3</w:t>
+        <w:t>Existing System Analysis . . . . . . . . . . . . . . . . . . . . . . . . . . . . . . . . . . . . . . . . . . . . . . . . . . . . 3</w:t>
       </w:r>
     </w:p>
     <w:p>
       <w:pPr>
-        <w:tabs>
-          <w:tab w:pos="9184" w:val="right" w:leader="dot"/>
-        </w:tabs>
-        <w:spacing w:before="0" w:after="40" w:line="360" w:lineRule="exact"/>
+        <w:spacing w:before="20" w:after="20" w:line="259" w:lineRule="auto"/>
         <w:ind w:left="397"/>
-        <w:jc w:val="left"/>
       </w:pPr>
       <w:r>
         <w:rPr>
-          <w:rFonts w:ascii="Times New Roman" w:hAnsi="Times New Roman" w:eastAsia="Times New Roman"/>
+          <w:rFonts w:ascii="Times New Roman" w:hAnsi="Times New Roman"/>
           <w:b/>
-          <w:i w:val="0"/>
           <w:sz w:val="24"/>
         </w:rPr>
         <w:t xml:space="preserve">1.5. </w:t>
       </w:r>
       <w:r>
         <w:rPr>
-          <w:rFonts w:ascii="Times New Roman" w:hAnsi="Times New Roman" w:eastAsia="Times New Roman"/>
+          <w:rFonts w:ascii="Times New Roman" w:hAnsi="Times New Roman"/>
           <w:b w:val="0"/>
-          <w:i w:val="0"/>
           <w:sz w:val="24"/>
         </w:rPr>
-        <w:t>Problem Statement</w:t>
-      </w:r>
-      <w:r>
-        <w:rPr>
-          <w:rFonts w:ascii="Times New Roman" w:hAnsi="Times New Roman" w:eastAsia="Times New Roman"/>
-          <w:b w:val="0"/>
-          <w:i w:val="0"/>
-          <w:sz w:val="24"/>
-        </w:rPr>
-        <w:tab/>
-        <w:t>3</w:t>
+        <w:t>Problem Statement . . . . . . . . . . . . . . . . . . . . . . . . . . . . . . . . . . . . . . . . . . . . . . . . . . . . . . . . . . 3</w:t>
       </w:r>
     </w:p>
     <w:p>
       <w:pPr>
-        <w:tabs>
-          <w:tab w:pos="9184" w:val="right" w:leader="dot"/>
-        </w:tabs>
-        <w:spacing w:before="0" w:after="40" w:line="360" w:lineRule="exact"/>
+        <w:spacing w:before="20" w:after="20" w:line="259" w:lineRule="auto"/>
         <w:ind w:left="397"/>
-        <w:jc w:val="left"/>
       </w:pPr>
       <w:r>
         <w:rPr>
-          <w:rFonts w:ascii="Times New Roman" w:hAnsi="Times New Roman" w:eastAsia="Times New Roman"/>
+          <w:rFonts w:ascii="Times New Roman" w:hAnsi="Times New Roman"/>
           <w:b/>
-          <w:i w:val="0"/>
           <w:sz w:val="24"/>
         </w:rPr>
         <w:t xml:space="preserve">1.6. </w:t>
       </w:r>
       <w:r>
         <w:rPr>
-          <w:rFonts w:ascii="Times New Roman" w:hAnsi="Times New Roman" w:eastAsia="Times New Roman"/>
+          <w:rFonts w:ascii="Times New Roman" w:hAnsi="Times New Roman"/>
           <w:b w:val="0"/>
-          <w:i w:val="0"/>
           <w:sz w:val="24"/>
         </w:rPr>
-        <w:t>Proposed Solution</w:t>
-      </w:r>
-      <w:r>
-        <w:rPr>
-          <w:rFonts w:ascii="Times New Roman" w:hAnsi="Times New Roman" w:eastAsia="Times New Roman"/>
-          <w:b w:val="0"/>
-          <w:i w:val="0"/>
-          <w:sz w:val="24"/>
-        </w:rPr>
-        <w:tab/>
-        <w:t>3</w:t>
+        <w:t>Proposed Solution . . . . . . . . . . . . . . . . . . . . . . . . . . . . . . . . . . . . . . . . . . . . . . . . . . . . . . . . . . 3</w:t>
       </w:r>
     </w:p>
     <w:p>
       <w:pPr>
-        <w:tabs>
-          <w:tab w:pos="9184" w:val="right" w:leader="dot"/>
-        </w:tabs>
-        <w:spacing w:before="0" w:after="40" w:line="360" w:lineRule="exact"/>
+        <w:spacing w:before="20" w:after="20" w:line="259" w:lineRule="auto"/>
         <w:ind w:left="397"/>
-        <w:jc w:val="left"/>
       </w:pPr>
       <w:r>
         <w:rPr>
-          <w:rFonts w:ascii="Times New Roman" w:hAnsi="Times New Roman" w:eastAsia="Times New Roman"/>
+          <w:rFonts w:ascii="Times New Roman" w:hAnsi="Times New Roman"/>
           <w:b/>
-          <w:i w:val="0"/>
           <w:sz w:val="24"/>
         </w:rPr>
         <w:t xml:space="preserve">1.7. </w:t>
       </w:r>
       <w:r>
         <w:rPr>
-          <w:rFonts w:ascii="Times New Roman" w:hAnsi="Times New Roman" w:eastAsia="Times New Roman"/>
+          <w:rFonts w:ascii="Times New Roman" w:hAnsi="Times New Roman"/>
           <w:b w:val="0"/>
-          <w:i w:val="0"/>
           <w:sz w:val="24"/>
         </w:rPr>
-        <w:t>Aim and Objectives</w:t>
-      </w:r>
-      <w:r>
-        <w:rPr>
-          <w:rFonts w:ascii="Times New Roman" w:hAnsi="Times New Roman" w:eastAsia="Times New Roman"/>
-          <w:b w:val="0"/>
-          <w:i w:val="0"/>
-          <w:sz w:val="24"/>
-        </w:rPr>
-        <w:tab/>
-        <w:t>4</w:t>
+        <w:t>Aim and Objectives . . . . . . . . . . . . . . . . . . . . . . . . . . . . . . . . . . . . . . . . . . . . . . . . . . . . . . . . . 4</w:t>
       </w:r>
     </w:p>
     <w:p>
       <w:pPr>
-        <w:tabs>
-          <w:tab w:pos="9184" w:val="right" w:leader="dot"/>
-        </w:tabs>
-        <w:spacing w:before="0" w:after="40" w:line="360" w:lineRule="exact"/>
+        <w:spacing w:before="20" w:after="20" w:line="259" w:lineRule="auto"/>
         <w:ind w:left="397"/>
-        <w:jc w:val="left"/>
       </w:pPr>
       <w:r>
         <w:rPr>
-          <w:rFonts w:ascii="Times New Roman" w:hAnsi="Times New Roman" w:eastAsia="Times New Roman"/>
+          <w:rFonts w:ascii="Times New Roman" w:hAnsi="Times New Roman"/>
           <w:b/>
-          <w:i w:val="0"/>
           <w:sz w:val="24"/>
         </w:rPr>
         <w:t xml:space="preserve">1.8. </w:t>
       </w:r>
       <w:r>
         <w:rPr>
-          <w:rFonts w:ascii="Times New Roman" w:hAnsi="Times New Roman" w:eastAsia="Times New Roman"/>
+          <w:rFonts w:ascii="Times New Roman" w:hAnsi="Times New Roman"/>
           <w:b w:val="0"/>
-          <w:i w:val="0"/>
           <w:sz w:val="24"/>
         </w:rPr>
-        <w:t>Scope of Project</w:t>
-      </w:r>
-      <w:r>
-        <w:rPr>
-          <w:rFonts w:ascii="Times New Roman" w:hAnsi="Times New Roman" w:eastAsia="Times New Roman"/>
-          <w:b w:val="0"/>
-          <w:i w:val="0"/>
-          <w:sz w:val="24"/>
-        </w:rPr>
-        <w:tab/>
-        <w:t>4</w:t>
+        <w:t>Scope of Project . . . . . . . . . . . . . . . . . . . . . . . . . . . . . . . . . . . . . . . . . . . . . . . . . . . . . . . . . . . . 4</w:t>
       </w:r>
     </w:p>
     <w:p>
       <w:pPr>
-        <w:tabs>
-          <w:tab w:pos="9184" w:val="right" w:leader="dot"/>
-        </w:tabs>
-        <w:spacing w:before="0" w:after="40" w:line="360" w:lineRule="exact"/>
+        <w:spacing w:before="20" w:after="20" w:line="259" w:lineRule="auto"/>
         <w:ind w:left="397"/>
-        <w:jc w:val="left"/>
       </w:pPr>
       <w:r>
         <w:rPr>
-          <w:rFonts w:ascii="Times New Roman" w:hAnsi="Times New Roman" w:eastAsia="Times New Roman"/>
+          <w:rFonts w:ascii="Times New Roman" w:hAnsi="Times New Roman"/>
           <w:b/>
-          <w:i w:val="0"/>
           <w:sz w:val="24"/>
         </w:rPr>
         <w:t xml:space="preserve">1.9. </w:t>
       </w:r>
       <w:r>
         <w:rPr>
-          <w:rFonts w:ascii="Times New Roman" w:hAnsi="Times New Roman" w:eastAsia="Times New Roman"/>
+          <w:rFonts w:ascii="Times New Roman" w:hAnsi="Times New Roman"/>
           <w:b w:val="0"/>
-          <w:i w:val="0"/>
           <w:sz w:val="24"/>
         </w:rPr>
-        <w:t>Limitations</w:t>
-      </w:r>
-      <w:r>
-        <w:rPr>
-          <w:rFonts w:ascii="Times New Roman" w:hAnsi="Times New Roman" w:eastAsia="Times New Roman"/>
-          <w:b w:val="0"/>
-          <w:i w:val="0"/>
-          <w:sz w:val="24"/>
-        </w:rPr>
-        <w:tab/>
-        <w:t>5</w:t>
+        <w:t>Limitations . . . . . . . . . . . . . . . . . . . . . . . . . . . . . . . . . . . . . . . . . . . . . . . . . . . . . . . . . . . . . . . . 5</w:t>
       </w:r>
     </w:p>
     <w:p>
       <w:pPr>
-        <w:tabs>
-          <w:tab w:pos="9184" w:val="right" w:leader="dot"/>
-        </w:tabs>
-        <w:spacing w:before="0" w:after="40" w:line="360" w:lineRule="exact"/>
+        <w:spacing w:before="20" w:after="20" w:line="259" w:lineRule="auto"/>
         <w:ind w:left="397"/>
-        <w:jc w:val="left"/>
       </w:pPr>
       <w:r>
         <w:rPr>
-          <w:rFonts w:ascii="Times New Roman" w:hAnsi="Times New Roman" w:eastAsia="Times New Roman"/>
+          <w:rFonts w:ascii="Times New Roman" w:hAnsi="Times New Roman"/>
           <w:b/>
-          <w:i w:val="0"/>
           <w:sz w:val="24"/>
         </w:rPr>
         <w:t xml:space="preserve">1.10. </w:t>
       </w:r>
       <w:r>
         <w:rPr>
-          <w:rFonts w:ascii="Times New Roman" w:hAnsi="Times New Roman" w:eastAsia="Times New Roman"/>
+          <w:rFonts w:ascii="Times New Roman" w:hAnsi="Times New Roman"/>
           <w:b w:val="0"/>
-          <w:i w:val="0"/>
           <w:sz w:val="24"/>
         </w:rPr>
-        <w:t>Major Modules</w:t>
-      </w:r>
-      <w:r>
-        <w:rPr>
-          <w:rFonts w:ascii="Times New Roman" w:hAnsi="Times New Roman" w:eastAsia="Times New Roman"/>
-          <w:b w:val="0"/>
-          <w:i w:val="0"/>
-          <w:sz w:val="24"/>
-        </w:rPr>
-        <w:tab/>
-        <w:t>5</w:t>
+        <w:t>Major Modules . . . . . . . . . . . . . . . . . . . . . . . . . . . . . . . . . . . . . . . . . . . . . . . . . . . . . . . . . . . 5</w:t>
       </w:r>
     </w:p>
     <w:p>
       <w:pPr>
-        <w:tabs>
-          <w:tab w:pos="9184" w:val="right" w:leader="dot"/>
-        </w:tabs>
-        <w:spacing w:before="0" w:after="40" w:line="360" w:lineRule="exact"/>
+        <w:spacing w:before="20" w:after="20" w:line="259" w:lineRule="auto"/>
         <w:ind w:left="397"/>
-        <w:jc w:val="left"/>
       </w:pPr>
       <w:r>
         <w:rPr>
-          <w:rFonts w:ascii="Times New Roman" w:hAnsi="Times New Roman" w:eastAsia="Times New Roman"/>
+          <w:rFonts w:ascii="Times New Roman" w:hAnsi="Times New Roman"/>
           <w:b/>
-          <w:i w:val="0"/>
           <w:sz w:val="24"/>
         </w:rPr>
         <w:t xml:space="preserve">1.11. </w:t>
       </w:r>
       <w:r>
         <w:rPr>
-          <w:rFonts w:ascii="Times New Roman" w:hAnsi="Times New Roman" w:eastAsia="Times New Roman"/>
+          <w:rFonts w:ascii="Times New Roman" w:hAnsi="Times New Roman"/>
           <w:b w:val="0"/>
-          <w:i w:val="0"/>
           <w:sz w:val="24"/>
         </w:rPr>
-        <w:t>Success Criteria</w:t>
-      </w:r>
-      <w:r>
-        <w:rPr>
-          <w:rFonts w:ascii="Times New Roman" w:hAnsi="Times New Roman" w:eastAsia="Times New Roman"/>
-          <w:b w:val="0"/>
-          <w:i w:val="0"/>
-          <w:sz w:val="24"/>
-        </w:rPr>
-        <w:tab/>
-        <w:t>6</w:t>
+        <w:t>Success Criteria . . . . . . . . . . . . . . . . . . . . . . . . . . . . . . . . . . . . . . . . . . . . . . . . . . . . . . . . . . . 6</w:t>
       </w:r>
     </w:p>
     <w:p>
       <w:pPr>
-        <w:tabs>
-          <w:tab w:pos="9184" w:val="right" w:leader="dot"/>
-        </w:tabs>
-        <w:spacing w:before="0" w:after="40" w:line="360" w:lineRule="exact"/>
+        <w:spacing w:before="20" w:after="20" w:line="259" w:lineRule="auto"/>
         <w:ind w:left="397"/>
-        <w:jc w:val="left"/>
       </w:pPr>
       <w:r>
         <w:rPr>
-          <w:rFonts w:ascii="Times New Roman" w:hAnsi="Times New Roman" w:eastAsia="Times New Roman"/>
+          <w:rFonts w:ascii="Times New Roman" w:hAnsi="Times New Roman"/>
           <w:b/>
-          <w:i w:val="0"/>
           <w:sz w:val="24"/>
         </w:rPr>
         <w:t xml:space="preserve">1.12. </w:t>
       </w:r>
       <w:r>
         <w:rPr>
-          <w:rFonts w:ascii="Times New Roman" w:hAnsi="Times New Roman" w:eastAsia="Times New Roman"/>
+          <w:rFonts w:ascii="Times New Roman" w:hAnsi="Times New Roman"/>
           <w:b w:val="0"/>
-          <w:i w:val="0"/>
           <w:sz w:val="24"/>
         </w:rPr>
-        <w:t>Expected Outcomes</w:t>
-      </w:r>
-      <w:r>
-        <w:rPr>
-          <w:rFonts w:ascii="Times New Roman" w:hAnsi="Times New Roman" w:eastAsia="Times New Roman"/>
-          <w:b w:val="0"/>
-          <w:i w:val="0"/>
-          <w:sz w:val="24"/>
-        </w:rPr>
-        <w:tab/>
-        <w:t>6</w:t>
+        <w:t>Expected Outcomes . . . . . . . . . . . . . . . . . . . . . . . . . . . . . . . . . . . . . . . . . . . . . . . . . . . . . . . . 6</w:t>
       </w:r>
     </w:p>
     <w:p>
       <w:pPr>
-        <w:tabs>
-          <w:tab w:pos="9184" w:val="right" w:leader="dot"/>
-        </w:tabs>
-        <w:spacing w:before="0" w:after="40" w:line="360" w:lineRule="exact"/>
+        <w:spacing w:before="20" w:after="20" w:line="259" w:lineRule="auto"/>
         <w:ind w:left="397"/>
-        <w:jc w:val="left"/>
       </w:pPr>
       <w:r>
         <w:rPr>
-          <w:rFonts w:ascii="Times New Roman" w:hAnsi="Times New Roman" w:eastAsia="Times New Roman"/>
+          <w:rFonts w:ascii="Times New Roman" w:hAnsi="Times New Roman"/>
           <w:b/>
-          <w:i w:val="0"/>
           <w:sz w:val="24"/>
         </w:rPr>
         <w:t xml:space="preserve">1.13. </w:t>
       </w:r>
       <w:r>
         <w:rPr>
-          <w:rFonts w:ascii="Times New Roman" w:hAnsi="Times New Roman" w:eastAsia="Times New Roman"/>
+          <w:rFonts w:ascii="Times New Roman" w:hAnsi="Times New Roman"/>
           <w:b w:val="0"/>
-          <w:i w:val="0"/>
           <w:sz w:val="24"/>
         </w:rPr>
-        <w:t>Chapter Summary</w:t>
-      </w:r>
-      <w:r>
-        <w:rPr>
-          <w:rFonts w:ascii="Times New Roman" w:hAnsi="Times New Roman" w:eastAsia="Times New Roman"/>
-          <w:b w:val="0"/>
-          <w:i w:val="0"/>
-          <w:sz w:val="24"/>
-        </w:rPr>
-        <w:tab/>
-        <w:t>7</w:t>
+        <w:t>Chapter Summary . . . . . . . . . . . . . . . . . . . . . . . . . . . . . . . . . . . . . . . . . . . . . . . . . . . . . . . . . 7</w:t>
       </w:r>
     </w:p>
     <w:p>
       <w:pPr>
-        <w:spacing w:before="0" w:after="80" w:line="160" w:lineRule="exact"/>
-        <w:jc w:val="center"/>
+        <w:spacing w:after="120"/>
+      </w:pPr>
+    </w:p>
+    <w:p>
+      <w:pPr>
+        <w:spacing w:before="20" w:after="20" w:line="259" w:lineRule="auto"/>
       </w:pPr>
       <w:r>
         <w:rPr>
-          <w:rFonts w:ascii="Times New Roman" w:hAnsi="Times New Roman" w:eastAsia="Times New Roman"/>
-          <w:b w:val="0"/>
-          <w:i w:val="0"/>
-          <w:sz w:val="12"/>
+          <w:rFonts w:ascii="Times New Roman" w:hAnsi="Times New Roman"/>
+          <w:b/>
+          <w:sz w:val="24"/>
         </w:rPr>
+        <w:t>CHAPTER 2: SYSTEM ANALYSIS AND REQUIREMENT ANALYSIS . . . . . . . . . . . . . . . . . 8</w:t>
       </w:r>
     </w:p>
     <w:p>
       <w:pPr>
-        <w:tabs>
-          <w:tab w:pos="9184" w:val="right" w:leader="dot"/>
-        </w:tabs>
-        <w:spacing w:before="0" w:after="40" w:line="360" w:lineRule="exact"/>
-        <w:jc w:val="left"/>
+        <w:spacing w:before="20" w:after="20" w:line="259" w:lineRule="auto"/>
+        <w:ind w:left="397"/>
       </w:pPr>
       <w:r>
         <w:rPr>
-          <w:rFonts w:ascii="Times New Roman" w:hAnsi="Times New Roman" w:eastAsia="Times New Roman"/>
+          <w:rFonts w:ascii="Times New Roman" w:hAnsi="Times New Roman"/>
           <w:b/>
-          <w:i w:val="0"/>
-          <w:sz w:val="24"/>
-        </w:rPr>
-        <w:t>CHAPTER 2: SYSTEM ANALYSIS AND REQUIREMENT ANALYSIS</w:t>
-      </w:r>
-      <w:r>
-        <w:rPr>
-          <w:rFonts w:ascii="Times New Roman" w:hAnsi="Times New Roman" w:eastAsia="Times New Roman"/>
-          <w:b/>
-          <w:i w:val="0"/>
-          <w:sz w:val="24"/>
-        </w:rPr>
-        <w:tab/>
-        <w:t>8</w:t>
-      </w:r>
-    </w:p>
-    <w:p>
-      <w:pPr>
-        <w:tabs>
-          <w:tab w:pos="9184" w:val="right" w:leader="dot"/>
-        </w:tabs>
-        <w:spacing w:before="0" w:after="40" w:line="360" w:lineRule="exact"/>
-        <w:ind w:left="397"/>
-        <w:jc w:val="left"/>
-      </w:pPr>
-      <w:r>
-        <w:rPr>
-          <w:rFonts w:ascii="Times New Roman" w:hAnsi="Times New Roman" w:eastAsia="Times New Roman"/>
-          <w:b/>
-          <w:i w:val="0"/>
           <w:sz w:val="24"/>
         </w:rPr>
         <w:t xml:space="preserve">2.1. </w:t>
       </w:r>
       <w:r>
         <w:rPr>
-          <w:rFonts w:ascii="Times New Roman" w:hAnsi="Times New Roman" w:eastAsia="Times New Roman"/>
+          <w:rFonts w:ascii="Times New Roman" w:hAnsi="Times New Roman"/>
           <w:b w:val="0"/>
-          <w:i w:val="0"/>
           <w:sz w:val="24"/>
         </w:rPr>
-        <w:t>Introduction</w:t>
-      </w:r>
-      <w:r>
-        <w:rPr>
-          <w:rFonts w:ascii="Times New Roman" w:hAnsi="Times New Roman" w:eastAsia="Times New Roman"/>
-          <w:b w:val="0"/>
-          <w:i w:val="0"/>
-          <w:sz w:val="24"/>
-        </w:rPr>
-        <w:tab/>
-        <w:t>8</w:t>
+        <w:t>Introduction . . . . . . . . . . . . . . . . . . . . . . . . . . . . . . . . . . . . . . . . . . . . . . . . . . . . . . . . . . . . . . . 8</w:t>
       </w:r>
     </w:p>
     <w:p>
       <w:pPr>
-        <w:tabs>
-          <w:tab w:pos="9184" w:val="right" w:leader="dot"/>
-        </w:tabs>
-        <w:spacing w:before="0" w:after="40" w:line="360" w:lineRule="exact"/>
+        <w:spacing w:before="20" w:after="20" w:line="259" w:lineRule="auto"/>
         <w:ind w:left="397"/>
-        <w:jc w:val="left"/>
       </w:pPr>
       <w:r>
         <w:rPr>
-          <w:rFonts w:ascii="Times New Roman" w:hAnsi="Times New Roman" w:eastAsia="Times New Roman"/>
+          <w:rFonts w:ascii="Times New Roman" w:hAnsi="Times New Roman"/>
           <w:b/>
-          <w:i w:val="0"/>
           <w:sz w:val="24"/>
         </w:rPr>
         <w:t xml:space="preserve">2.2. </w:t>
       </w:r>
       <w:r>
         <w:rPr>
-          <w:rFonts w:ascii="Times New Roman" w:hAnsi="Times New Roman" w:eastAsia="Times New Roman"/>
+          <w:rFonts w:ascii="Times New Roman" w:hAnsi="Times New Roman"/>
           <w:b w:val="0"/>
-          <w:i w:val="0"/>
           <w:sz w:val="24"/>
         </w:rPr>
-        <w:t>Literature Review</w:t>
-      </w:r>
-      <w:r>
-        <w:rPr>
-          <w:rFonts w:ascii="Times New Roman" w:hAnsi="Times New Roman" w:eastAsia="Times New Roman"/>
-          <w:b w:val="0"/>
-          <w:i w:val="0"/>
-          <w:sz w:val="24"/>
-        </w:rPr>
-        <w:tab/>
-        <w:t>8</w:t>
+        <w:t>Literature Review . . . . . . . . . . . . . . . . . . . . . . . . . . . . . . . . . . . . . . . . . . . . . . . . . . . . . . . . . . 8</w:t>
       </w:r>
     </w:p>
     <w:p>
       <w:pPr>
-        <w:tabs>
-          <w:tab w:pos="9184" w:val="right" w:leader="dot"/>
-        </w:tabs>
-        <w:spacing w:before="0" w:after="40" w:line="360" w:lineRule="exact"/>
+        <w:spacing w:before="20" w:after="20" w:line="259" w:lineRule="auto"/>
         <w:ind w:left="397"/>
-        <w:jc w:val="left"/>
       </w:pPr>
       <w:r>
         <w:rPr>
-          <w:rFonts w:ascii="Times New Roman" w:hAnsi="Times New Roman" w:eastAsia="Times New Roman"/>
+          <w:rFonts w:ascii="Times New Roman" w:hAnsi="Times New Roman"/>
           <w:b/>
-          <w:i w:val="0"/>
           <w:sz w:val="24"/>
         </w:rPr>
         <w:t xml:space="preserve">2.3. </w:t>
       </w:r>
       <w:r>
         <w:rPr>
-          <w:rFonts w:ascii="Times New Roman" w:hAnsi="Times New Roman" w:eastAsia="Times New Roman"/>
+          <w:rFonts w:ascii="Times New Roman" w:hAnsi="Times New Roman"/>
           <w:b w:val="0"/>
-          <w:i w:val="0"/>
           <w:sz w:val="24"/>
         </w:rPr>
-        <w:t>Comparative Analysis</w:t>
-      </w:r>
-      <w:r>
-        <w:rPr>
-          <w:rFonts w:ascii="Times New Roman" w:hAnsi="Times New Roman" w:eastAsia="Times New Roman"/>
-          <w:b w:val="0"/>
-          <w:i w:val="0"/>
-          <w:sz w:val="24"/>
-        </w:rPr>
-        <w:tab/>
-        <w:t>11</w:t>
+        <w:t>Comparative Analysis . . . . . . . . . . . . . . . . . . . . . . . . . . . . . . . . . . . . . . . . . . . . . . . . . . . . . . 11</w:t>
       </w:r>
     </w:p>
     <w:p>
       <w:pPr>
-        <w:tabs>
-          <w:tab w:pos="9184" w:val="right" w:leader="dot"/>
-        </w:tabs>
-        <w:spacing w:before="0" w:after="40" w:line="360" w:lineRule="exact"/>
+        <w:spacing w:before="20" w:after="20" w:line="259" w:lineRule="auto"/>
         <w:ind w:left="397"/>
-        <w:jc w:val="left"/>
       </w:pPr>
       <w:r>
         <w:rPr>
-          <w:rFonts w:ascii="Times New Roman" w:hAnsi="Times New Roman" w:eastAsia="Times New Roman"/>
+          <w:rFonts w:ascii="Times New Roman" w:hAnsi="Times New Roman"/>
           <w:b/>
-          <w:i w:val="0"/>
           <w:sz w:val="24"/>
         </w:rPr>
         <w:t xml:space="preserve">2.4. </w:t>
       </w:r>
       <w:r>
         <w:rPr>
-          <w:rFonts w:ascii="Times New Roman" w:hAnsi="Times New Roman" w:eastAsia="Times New Roman"/>
+          <w:rFonts w:ascii="Times New Roman" w:hAnsi="Times New Roman"/>
           <w:b w:val="0"/>
-          <w:i w:val="0"/>
           <w:sz w:val="24"/>
         </w:rPr>
-        <w:t>Research Gap Identification</w:t>
-      </w:r>
-      <w:r>
-        <w:rPr>
-          <w:rFonts w:ascii="Times New Roman" w:hAnsi="Times New Roman" w:eastAsia="Times New Roman"/>
-          <w:b w:val="0"/>
-          <w:i w:val="0"/>
-          <w:sz w:val="24"/>
-        </w:rPr>
-        <w:tab/>
-        <w:t>11</w:t>
+        <w:t>Research Gap Identification . . . . . . . . . . . . . . . . . . . . . . . . . . . . . . . . . . . . . . . . . . . . . . . . . 11</w:t>
       </w:r>
     </w:p>
     <w:p>
       <w:pPr>
-        <w:tabs>
-          <w:tab w:pos="9184" w:val="right" w:leader="dot"/>
-        </w:tabs>
-        <w:spacing w:before="0" w:after="40" w:line="360" w:lineRule="exact"/>
+        <w:spacing w:before="20" w:after="20" w:line="259" w:lineRule="auto"/>
         <w:ind w:left="397"/>
-        <w:jc w:val="left"/>
       </w:pPr>
       <w:r>
         <w:rPr>
-          <w:rFonts w:ascii="Times New Roman" w:hAnsi="Times New Roman" w:eastAsia="Times New Roman"/>
+          <w:rFonts w:ascii="Times New Roman" w:hAnsi="Times New Roman"/>
           <w:b/>
-          <w:i w:val="0"/>
           <w:sz w:val="24"/>
         </w:rPr>
         <w:t xml:space="preserve">2.5. </w:t>
       </w:r>
       <w:r>
         <w:rPr>
-          <w:rFonts w:ascii="Times New Roman" w:hAnsi="Times New Roman" w:eastAsia="Times New Roman"/>
+          <w:rFonts w:ascii="Times New Roman" w:hAnsi="Times New Roman"/>
           <w:b w:val="0"/>
-          <w:i w:val="0"/>
           <w:sz w:val="24"/>
         </w:rPr>
-        <w:t>Requirement Gathering</w:t>
-      </w:r>
-      <w:r>
-        <w:rPr>
-          <w:rFonts w:ascii="Times New Roman" w:hAnsi="Times New Roman" w:eastAsia="Times New Roman"/>
-          <w:b w:val="0"/>
-          <w:i w:val="0"/>
-          <w:sz w:val="24"/>
-        </w:rPr>
-        <w:tab/>
-        <w:t>12</w:t>
+        <w:t>Requirement Gathering . . . . . . . . . . . . . . . . . . . . . . . . . . . . . . . . . . . . . . . . . . . . . . . . . . . . . 12</w:t>
       </w:r>
     </w:p>
     <w:p>
       <w:pPr>
-        <w:tabs>
-          <w:tab w:pos="9184" w:val="right" w:leader="dot"/>
-        </w:tabs>
-        <w:spacing w:before="0" w:after="40" w:line="360" w:lineRule="exact"/>
+        <w:spacing w:before="20" w:after="20" w:line="259" w:lineRule="auto"/>
         <w:ind w:left="397"/>
-        <w:jc w:val="left"/>
       </w:pPr>
       <w:r>
         <w:rPr>
-          <w:rFonts w:ascii="Times New Roman" w:hAnsi="Times New Roman" w:eastAsia="Times New Roman"/>
+          <w:rFonts w:ascii="Times New Roman" w:hAnsi="Times New Roman"/>
           <w:b/>
-          <w:i w:val="0"/>
           <w:sz w:val="24"/>
         </w:rPr>
         <w:t xml:space="preserve">2.6. </w:t>
       </w:r>
       <w:r>
         <w:rPr>
-          <w:rFonts w:ascii="Times New Roman" w:hAnsi="Times New Roman" w:eastAsia="Times New Roman"/>
+          <w:rFonts w:ascii="Times New Roman" w:hAnsi="Times New Roman"/>
           <w:b w:val="0"/>
-          <w:i w:val="0"/>
           <w:sz w:val="24"/>
         </w:rPr>
-        <w:t>Stakeholder Analysis</w:t>
-      </w:r>
-      <w:r>
-        <w:rPr>
-          <w:rFonts w:ascii="Times New Roman" w:hAnsi="Times New Roman" w:eastAsia="Times New Roman"/>
-          <w:b w:val="0"/>
-          <w:i w:val="0"/>
-          <w:sz w:val="24"/>
-        </w:rPr>
-        <w:tab/>
-        <w:t>13</w:t>
+        <w:t>Stakeholder Analysis . . . . . . . . . . . . . . . . . . . . . . . . . . . . . . . . . . . . . . . . . . . . . . . . . . . . . . . 13</w:t>
       </w:r>
     </w:p>
     <w:p>
       <w:pPr>
-        <w:tabs>
-          <w:tab w:pos="9184" w:val="right" w:leader="dot"/>
-        </w:tabs>
-        <w:spacing w:before="0" w:after="40" w:line="360" w:lineRule="exact"/>
+        <w:spacing w:before="20" w:after="20" w:line="259" w:lineRule="auto"/>
         <w:ind w:left="397"/>
-        <w:jc w:val="left"/>
       </w:pPr>
       <w:r>
         <w:rPr>
-          <w:rFonts w:ascii="Times New Roman" w:hAnsi="Times New Roman" w:eastAsia="Times New Roman"/>
+          <w:rFonts w:ascii="Times New Roman" w:hAnsi="Times New Roman"/>
           <w:b/>
-          <w:i w:val="0"/>
           <w:sz w:val="24"/>
         </w:rPr>
         <w:t xml:space="preserve">2.7. </w:t>
       </w:r>
       <w:r>
         <w:rPr>
-          <w:rFonts w:ascii="Times New Roman" w:hAnsi="Times New Roman" w:eastAsia="Times New Roman"/>
+          <w:rFonts w:ascii="Times New Roman" w:hAnsi="Times New Roman"/>
           <w:b w:val="0"/>
-          <w:i w:val="0"/>
           <w:sz w:val="24"/>
         </w:rPr>
-        <w:t>Functional Requirements</w:t>
-      </w:r>
-      <w:r>
-        <w:rPr>
-          <w:rFonts w:ascii="Times New Roman" w:hAnsi="Times New Roman" w:eastAsia="Times New Roman"/>
-          <w:b w:val="0"/>
-          <w:i w:val="0"/>
-          <w:sz w:val="24"/>
-        </w:rPr>
-        <w:tab/>
-        <w:t>14</w:t>
+        <w:t>Functional Requirements . . . . . . . . . . . . . . . . . . . . . . . . . . . . . . . . . . . . . . . . . . . . . . . . . . . . 14</w:t>
       </w:r>
     </w:p>
     <w:p>
       <w:pPr>
-        <w:tabs>
-          <w:tab w:pos="9184" w:val="right" w:leader="dot"/>
-        </w:tabs>
-        <w:spacing w:before="0" w:after="40" w:line="360" w:lineRule="exact"/>
+        <w:spacing w:before="20" w:after="20" w:line="259" w:lineRule="auto"/>
         <w:ind w:left="397"/>
-        <w:jc w:val="left"/>
       </w:pPr>
       <w:r>
         <w:rPr>
-          <w:rFonts w:ascii="Times New Roman" w:hAnsi="Times New Roman" w:eastAsia="Times New Roman"/>
+          <w:rFonts w:ascii="Times New Roman" w:hAnsi="Times New Roman"/>
           <w:b/>
-          <w:i w:val="0"/>
           <w:sz w:val="24"/>
         </w:rPr>
         <w:t xml:space="preserve">2.8. </w:t>
       </w:r>
       <w:r>
         <w:rPr>
-          <w:rFonts w:ascii="Times New Roman" w:hAnsi="Times New Roman" w:eastAsia="Times New Roman"/>
+          <w:rFonts w:ascii="Times New Roman" w:hAnsi="Times New Roman"/>
           <w:b w:val="0"/>
-          <w:i w:val="0"/>
           <w:sz w:val="24"/>
         </w:rPr>
-        <w:t>Nonfunctional Requirements</w:t>
-      </w:r>
-      <w:r>
-        <w:rPr>
-          <w:rFonts w:ascii="Times New Roman" w:hAnsi="Times New Roman" w:eastAsia="Times New Roman"/>
-          <w:b w:val="0"/>
-          <w:i w:val="0"/>
-          <w:sz w:val="24"/>
-        </w:rPr>
-        <w:tab/>
-        <w:t>15</w:t>
+        <w:t>Nonfunctional Requirements . . . . . . . . . . . . . . . . . . . . . . . . . . . . . . . . . . . . . . . . . . . . . . . . . 15</w:t>
       </w:r>
     </w:p>
     <w:p>
       <w:pPr>
-        <w:tabs>
-          <w:tab w:pos="9184" w:val="right" w:leader="dot"/>
-        </w:tabs>
-        <w:spacing w:before="0" w:after="40" w:line="360" w:lineRule="exact"/>
+        <w:spacing w:before="20" w:after="20" w:line="259" w:lineRule="auto"/>
         <w:ind w:left="397"/>
-        <w:jc w:val="left"/>
       </w:pPr>
       <w:r>
         <w:rPr>
-          <w:rFonts w:ascii="Times New Roman" w:hAnsi="Times New Roman" w:eastAsia="Times New Roman"/>
+          <w:rFonts w:ascii="Times New Roman" w:hAnsi="Times New Roman"/>
           <w:b/>
-          <w:i w:val="0"/>
           <w:sz w:val="24"/>
         </w:rPr>
         <w:t xml:space="preserve">2.9. </w:t>
       </w:r>
       <w:r>
         <w:rPr>
-          <w:rFonts w:ascii="Times New Roman" w:hAnsi="Times New Roman" w:eastAsia="Times New Roman"/>
+          <w:rFonts w:ascii="Times New Roman" w:hAnsi="Times New Roman"/>
           <w:b w:val="0"/>
-          <w:i w:val="0"/>
           <w:sz w:val="24"/>
         </w:rPr>
-        <w:t>Feasibility Study</w:t>
-      </w:r>
-      <w:r>
-        <w:rPr>
-          <w:rFonts w:ascii="Times New Roman" w:hAnsi="Times New Roman" w:eastAsia="Times New Roman"/>
-          <w:b w:val="0"/>
-          <w:i w:val="0"/>
-          <w:sz w:val="24"/>
-        </w:rPr>
-        <w:tab/>
-        <w:t>16</w:t>
+        <w:t>Feasibility Study . . . . . . . . . . . . . . . . . . . . . . . . . . . . . . . . . . . . . . . . . . . . . . . . . . . . . . . . . . 16</w:t>
       </w:r>
     </w:p>
     <w:p>
       <w:pPr>
-        <w:tabs>
-          <w:tab w:pos="9184" w:val="right" w:leader="dot"/>
-        </w:tabs>
-        <w:spacing w:before="0" w:after="40" w:line="360" w:lineRule="exact"/>
+        <w:spacing w:before="20" w:after="20" w:line="259" w:lineRule="auto"/>
         <w:ind w:left="397"/>
-        <w:jc w:val="left"/>
       </w:pPr>
       <w:r>
         <w:rPr>
-          <w:rFonts w:ascii="Times New Roman" w:hAnsi="Times New Roman" w:eastAsia="Times New Roman"/>
+          <w:rFonts w:ascii="Times New Roman" w:hAnsi="Times New Roman"/>
           <w:b/>
-          <w:i w:val="0"/>
           <w:sz w:val="24"/>
         </w:rPr>
         <w:t xml:space="preserve">2.10. </w:t>
       </w:r>
       <w:r>
         <w:rPr>
-          <w:rFonts w:ascii="Times New Roman" w:hAnsi="Times New Roman" w:eastAsia="Times New Roman"/>
+          <w:rFonts w:ascii="Times New Roman" w:hAnsi="Times New Roman"/>
           <w:b w:val="0"/>
-          <w:i w:val="0"/>
           <w:sz w:val="24"/>
         </w:rPr>
-        <w:t>Software Requirements</w:t>
-      </w:r>
-      <w:r>
-        <w:rPr>
-          <w:rFonts w:ascii="Times New Roman" w:hAnsi="Times New Roman" w:eastAsia="Times New Roman"/>
-          <w:b w:val="0"/>
-          <w:i w:val="0"/>
-          <w:sz w:val="24"/>
-        </w:rPr>
-        <w:tab/>
-        <w:t>16</w:t>
+        <w:t>Software Requirements . . . . . . . . . . . . . . . . . . . . . . . . . . . . . . . . . . . . . . . . . . . . . . . . . . . . 16</w:t>
       </w:r>
     </w:p>
     <w:p>
       <w:pPr>
-        <w:tabs>
-          <w:tab w:pos="9184" w:val="right" w:leader="dot"/>
-        </w:tabs>
-        <w:spacing w:before="0" w:after="40" w:line="360" w:lineRule="exact"/>
+        <w:spacing w:before="20" w:after="20" w:line="259" w:lineRule="auto"/>
         <w:ind w:left="397"/>
-        <w:jc w:val="left"/>
       </w:pPr>
       <w:r>
         <w:rPr>
-          <w:rFonts w:ascii="Times New Roman" w:hAnsi="Times New Roman" w:eastAsia="Times New Roman"/>
+          <w:rFonts w:ascii="Times New Roman" w:hAnsi="Times New Roman"/>
           <w:b/>
-          <w:i w:val="0"/>
           <w:sz w:val="24"/>
         </w:rPr>
         <w:t xml:space="preserve">2.11. </w:t>
       </w:r>
       <w:r>
         <w:rPr>
-          <w:rFonts w:ascii="Times New Roman" w:hAnsi="Times New Roman" w:eastAsia="Times New Roman"/>
+          <w:rFonts w:ascii="Times New Roman" w:hAnsi="Times New Roman"/>
           <w:b w:val="0"/>
-          <w:i w:val="0"/>
           <w:sz w:val="24"/>
         </w:rPr>
-        <w:t>Hardware Requirements</w:t>
-      </w:r>
-      <w:r>
-        <w:rPr>
-          <w:rFonts w:ascii="Times New Roman" w:hAnsi="Times New Roman" w:eastAsia="Times New Roman"/>
-          <w:b w:val="0"/>
-          <w:i w:val="0"/>
-          <w:sz w:val="24"/>
-        </w:rPr>
-        <w:tab/>
-        <w:t>17</w:t>
+        <w:t>Hardware Requirements . . . . . . . . . . . . . . . . . . . . . . . . . . . . . . . . . . . . . . . . . . . . . . . . . . . 17</w:t>
       </w:r>
     </w:p>
     <w:p>
       <w:pPr>
-        <w:tabs>
-          <w:tab w:pos="9184" w:val="right" w:leader="dot"/>
-        </w:tabs>
-        <w:spacing w:before="0" w:after="40" w:line="360" w:lineRule="exact"/>
+        <w:spacing w:before="20" w:after="20" w:line="259" w:lineRule="auto"/>
         <w:ind w:left="397"/>
-        <w:jc w:val="left"/>
       </w:pPr>
       <w:r>
         <w:rPr>
-          <w:rFonts w:ascii="Times New Roman" w:hAnsi="Times New Roman" w:eastAsia="Times New Roman"/>
+          <w:rFonts w:ascii="Times New Roman" w:hAnsi="Times New Roman"/>
           <w:b/>
-          <w:i w:val="0"/>
           <w:sz w:val="24"/>
         </w:rPr>
         <w:t xml:space="preserve">2.12. </w:t>
       </w:r>
       <w:r>
         <w:rPr>
-          <w:rFonts w:ascii="Times New Roman" w:hAnsi="Times New Roman" w:eastAsia="Times New Roman"/>
+          <w:rFonts w:ascii="Times New Roman" w:hAnsi="Times New Roman"/>
           <w:b w:val="0"/>
-          <w:i w:val="0"/>
           <w:sz w:val="24"/>
         </w:rPr>
-        <w:t>Project Schedule</w:t>
-      </w:r>
-      <w:r>
-        <w:rPr>
-          <w:rFonts w:ascii="Times New Roman" w:hAnsi="Times New Roman" w:eastAsia="Times New Roman"/>
-          <w:b w:val="0"/>
-          <w:i w:val="0"/>
-          <w:sz w:val="24"/>
-        </w:rPr>
-        <w:tab/>
-        <w:t>17</w:t>
+        <w:t>Project Schedule . . . . . . . . . . . . . . . . . . . . . . . . . . . . . . . . . . . . . . . . . . . . . . . . . . . . . . . . . 17</w:t>
       </w:r>
     </w:p>
     <w:p>
       <w:pPr>
-        <w:tabs>
-          <w:tab w:pos="9184" w:val="right" w:leader="dot"/>
-        </w:tabs>
-        <w:spacing w:before="0" w:after="40" w:line="360" w:lineRule="exact"/>
+        <w:spacing w:before="20" w:after="20" w:line="259" w:lineRule="auto"/>
         <w:ind w:left="397"/>
-        <w:jc w:val="left"/>
       </w:pPr>
       <w:r>
         <w:rPr>
-          <w:rFonts w:ascii="Times New Roman" w:hAnsi="Times New Roman" w:eastAsia="Times New Roman"/>
+          <w:rFonts w:ascii="Times New Roman" w:hAnsi="Times New Roman"/>
           <w:b/>
-          <w:i w:val="0"/>
           <w:sz w:val="24"/>
         </w:rPr>
         <w:t xml:space="preserve">2.13. </w:t>
       </w:r>
       <w:r>
         <w:rPr>
-          <w:rFonts w:ascii="Times New Roman" w:hAnsi="Times New Roman" w:eastAsia="Times New Roman"/>
+          <w:rFonts w:ascii="Times New Roman" w:hAnsi="Times New Roman"/>
           <w:b w:val="0"/>
-          <w:i w:val="0"/>
           <w:sz w:val="24"/>
         </w:rPr>
-        <w:t>Development Methodology</w:t>
-      </w:r>
-      <w:r>
-        <w:rPr>
-          <w:rFonts w:ascii="Times New Roman" w:hAnsi="Times New Roman" w:eastAsia="Times New Roman"/>
-          <w:b w:val="0"/>
-          <w:i w:val="0"/>
-          <w:sz w:val="24"/>
-        </w:rPr>
-        <w:tab/>
-        <w:t>18</w:t>
+        <w:t>Development Methodology . . . . . . . . . . . . . . . . . . . . . . . . . . . . . . . . . . . . . . . . . . . . . . . . . 18</w:t>
       </w:r>
     </w:p>
     <w:p>
       <w:pPr>
-        <w:spacing w:before="0" w:after="80" w:line="160" w:lineRule="exact"/>
-        <w:jc w:val="center"/>
-      </w:pPr>
-      <w:r>
-        <w:rPr>
-          <w:rFonts w:ascii="Times New Roman" w:hAnsi="Times New Roman" w:eastAsia="Times New Roman"/>
-          <w:b w:val="0"/>
-          <w:i w:val="0"/>
-          <w:sz w:val="12"/>
-        </w:rPr>
-      </w:r>
+        <w:spacing w:after="120"/>
+      </w:pPr>
     </w:p>
     <w:p>
       <w:r>
@@ -1648,999 +1183,567 @@
     </w:p>
     <w:p>
       <w:pPr>
-        <w:tabs>
-          <w:tab w:pos="9184" w:val="right" w:leader="dot"/>
-        </w:tabs>
-        <w:spacing w:before="0" w:after="40" w:line="360" w:lineRule="exact"/>
-        <w:jc w:val="left"/>
+        <w:spacing w:before="20" w:after="20" w:line="259" w:lineRule="auto"/>
       </w:pPr>
       <w:r>
         <w:rPr>
-          <w:rFonts w:ascii="Times New Roman" w:hAnsi="Times New Roman" w:eastAsia="Times New Roman"/>
+          <w:rFonts w:ascii="Times New Roman" w:hAnsi="Times New Roman"/>
           <w:b/>
-          <w:i w:val="0"/>
           <w:sz w:val="24"/>
         </w:rPr>
-        <w:t>CHAPTER 3: SYSTEM DESIGN</w:t>
-      </w:r>
-      <w:r>
-        <w:rPr>
-          <w:rFonts w:ascii="Times New Roman" w:hAnsi="Times New Roman" w:eastAsia="Times New Roman"/>
-          <w:b/>
-          <w:i w:val="0"/>
-          <w:sz w:val="24"/>
-        </w:rPr>
-        <w:tab/>
-        <w:t>19</w:t>
+        <w:t>CHAPTER 3: SYSTEM DESIGN . . . . . . . . . . . . . . . . . . . . . . . . . . . . . . . . . . . . . . . . . . . . . . . . . . 19</w:t>
       </w:r>
     </w:p>
     <w:p>
       <w:pPr>
-        <w:tabs>
-          <w:tab w:pos="9184" w:val="right" w:leader="dot"/>
-        </w:tabs>
-        <w:spacing w:before="0" w:after="40" w:line="360" w:lineRule="exact"/>
+        <w:spacing w:before="20" w:after="20" w:line="259" w:lineRule="auto"/>
         <w:ind w:left="397"/>
-        <w:jc w:val="left"/>
       </w:pPr>
       <w:r>
         <w:rPr>
-          <w:rFonts w:ascii="Times New Roman" w:hAnsi="Times New Roman" w:eastAsia="Times New Roman"/>
+          <w:rFonts w:ascii="Times New Roman" w:hAnsi="Times New Roman"/>
           <w:b/>
-          <w:i w:val="0"/>
           <w:sz w:val="24"/>
         </w:rPr>
         <w:t xml:space="preserve">3.1. </w:t>
       </w:r>
       <w:r>
         <w:rPr>
-          <w:rFonts w:ascii="Times New Roman" w:hAnsi="Times New Roman" w:eastAsia="Times New Roman"/>
+          <w:rFonts w:ascii="Times New Roman" w:hAnsi="Times New Roman"/>
           <w:b w:val="0"/>
-          <w:i w:val="0"/>
           <w:sz w:val="24"/>
         </w:rPr>
-        <w:t>System Architecture</w:t>
-      </w:r>
-      <w:r>
-        <w:rPr>
-          <w:rFonts w:ascii="Times New Roman" w:hAnsi="Times New Roman" w:eastAsia="Times New Roman"/>
-          <w:b w:val="0"/>
-          <w:i w:val="0"/>
-          <w:sz w:val="24"/>
-        </w:rPr>
-        <w:tab/>
-        <w:t>19</w:t>
+        <w:t>System Architecture . . . . . . . . . . . . . . . . . . . . . . . . . . . . . . . . . . . . . . . . . . . . . . . . . . . . . . . 19</w:t>
       </w:r>
     </w:p>
     <w:p>
       <w:pPr>
-        <w:tabs>
-          <w:tab w:pos="9184" w:val="right" w:leader="dot"/>
-        </w:tabs>
-        <w:spacing w:before="0" w:after="40" w:line="360" w:lineRule="exact"/>
+        <w:spacing w:before="20" w:after="20" w:line="259" w:lineRule="auto"/>
         <w:ind w:left="397"/>
-        <w:jc w:val="left"/>
       </w:pPr>
       <w:r>
         <w:rPr>
-          <w:rFonts w:ascii="Times New Roman" w:hAnsi="Times New Roman" w:eastAsia="Times New Roman"/>
+          <w:rFonts w:ascii="Times New Roman" w:hAnsi="Times New Roman"/>
           <w:b/>
-          <w:i w:val="0"/>
           <w:sz w:val="24"/>
         </w:rPr>
         <w:t xml:space="preserve">3.2. </w:t>
       </w:r>
       <w:r>
         <w:rPr>
-          <w:rFonts w:ascii="Times New Roman" w:hAnsi="Times New Roman" w:eastAsia="Times New Roman"/>
+          <w:rFonts w:ascii="Times New Roman" w:hAnsi="Times New Roman"/>
           <w:b w:val="0"/>
-          <w:i w:val="0"/>
           <w:sz w:val="24"/>
         </w:rPr>
-        <w:t>System Workflow</w:t>
-      </w:r>
-      <w:r>
-        <w:rPr>
-          <w:rFonts w:ascii="Times New Roman" w:hAnsi="Times New Roman" w:eastAsia="Times New Roman"/>
-          <w:b w:val="0"/>
-          <w:i w:val="0"/>
-          <w:sz w:val="24"/>
-        </w:rPr>
-        <w:tab/>
-        <w:t>20</w:t>
+        <w:t>System Workflow . . . . . . . . . . . . . . . . . . . . . . . . . . . . . . . . . . . . . . . . . . . . . . . . . . . . . . . . . 20</w:t>
       </w:r>
     </w:p>
     <w:p>
       <w:pPr>
-        <w:tabs>
-          <w:tab w:pos="9184" w:val="right" w:leader="dot"/>
-        </w:tabs>
-        <w:spacing w:before="0" w:after="40" w:line="360" w:lineRule="exact"/>
+        <w:spacing w:before="20" w:after="20" w:line="259" w:lineRule="auto"/>
         <w:ind w:left="397"/>
-        <w:jc w:val="left"/>
       </w:pPr>
       <w:r>
         <w:rPr>
-          <w:rFonts w:ascii="Times New Roman" w:hAnsi="Times New Roman" w:eastAsia="Times New Roman"/>
+          <w:rFonts w:ascii="Times New Roman" w:hAnsi="Times New Roman"/>
           <w:b/>
-          <w:i w:val="0"/>
           <w:sz w:val="24"/>
         </w:rPr>
         <w:t xml:space="preserve">3.3. </w:t>
       </w:r>
       <w:r>
         <w:rPr>
-          <w:rFonts w:ascii="Times New Roman" w:hAnsi="Times New Roman" w:eastAsia="Times New Roman"/>
+          <w:rFonts w:ascii="Times New Roman" w:hAnsi="Times New Roman"/>
           <w:b w:val="0"/>
-          <w:i w:val="0"/>
           <w:sz w:val="24"/>
         </w:rPr>
-        <w:t>Block Diagram</w:t>
-      </w:r>
-      <w:r>
-        <w:rPr>
-          <w:rFonts w:ascii="Times New Roman" w:hAnsi="Times New Roman" w:eastAsia="Times New Roman"/>
-          <w:b w:val="0"/>
-          <w:i w:val="0"/>
-          <w:sz w:val="24"/>
-        </w:rPr>
-        <w:tab/>
-        <w:t>21</w:t>
+        <w:t>Block Diagram . . . . . . . . . . . . . . . . . . . . . . . . . . . . . . . . . . . . . . . . . . . . . . . . . . . . . . . . . . . . 21</w:t>
       </w:r>
     </w:p>
     <w:p>
       <w:pPr>
-        <w:tabs>
-          <w:tab w:pos="9184" w:val="right" w:leader="dot"/>
-        </w:tabs>
-        <w:spacing w:before="0" w:after="40" w:line="360" w:lineRule="exact"/>
+        <w:spacing w:before="20" w:after="20" w:line="259" w:lineRule="auto"/>
         <w:ind w:left="397"/>
-        <w:jc w:val="left"/>
       </w:pPr>
       <w:r>
         <w:rPr>
-          <w:rFonts w:ascii="Times New Roman" w:hAnsi="Times New Roman" w:eastAsia="Times New Roman"/>
+          <w:rFonts w:ascii="Times New Roman" w:hAnsi="Times New Roman"/>
           <w:b/>
-          <w:i w:val="0"/>
           <w:sz w:val="24"/>
         </w:rPr>
         <w:t xml:space="preserve">3.4. </w:t>
       </w:r>
       <w:r>
         <w:rPr>
-          <w:rFonts w:ascii="Times New Roman" w:hAnsi="Times New Roman" w:eastAsia="Times New Roman"/>
+          <w:rFonts w:ascii="Times New Roman" w:hAnsi="Times New Roman"/>
           <w:b w:val="0"/>
-          <w:i w:val="0"/>
           <w:sz w:val="24"/>
         </w:rPr>
-        <w:t>Functional Flow Diagram</w:t>
-      </w:r>
-      <w:r>
-        <w:rPr>
-          <w:rFonts w:ascii="Times New Roman" w:hAnsi="Times New Roman" w:eastAsia="Times New Roman"/>
-          <w:b w:val="0"/>
-          <w:i w:val="0"/>
-          <w:sz w:val="24"/>
-        </w:rPr>
-        <w:tab/>
-        <w:t>22</w:t>
+        <w:t>Functional Flow Diagram . . . . . . . . . . . . . . . . . . . . . . . . . . . . . . . . . . . . . . . . . . . . . . . . . . . 22</w:t>
       </w:r>
     </w:p>
     <w:p>
       <w:pPr>
-        <w:tabs>
-          <w:tab w:pos="9184" w:val="right" w:leader="dot"/>
-        </w:tabs>
-        <w:spacing w:before="0" w:after="40" w:line="360" w:lineRule="exact"/>
+        <w:spacing w:before="20" w:after="20" w:line="259" w:lineRule="auto"/>
         <w:ind w:left="397"/>
-        <w:jc w:val="left"/>
       </w:pPr>
       <w:r>
         <w:rPr>
-          <w:rFonts w:ascii="Times New Roman" w:hAnsi="Times New Roman" w:eastAsia="Times New Roman"/>
+          <w:rFonts w:ascii="Times New Roman" w:hAnsi="Times New Roman"/>
           <w:b/>
-          <w:i w:val="0"/>
           <w:sz w:val="24"/>
         </w:rPr>
         <w:t xml:space="preserve">3.5. </w:t>
       </w:r>
       <w:r>
         <w:rPr>
-          <w:rFonts w:ascii="Times New Roman" w:hAnsi="Times New Roman" w:eastAsia="Times New Roman"/>
+          <w:rFonts w:ascii="Times New Roman" w:hAnsi="Times New Roman"/>
           <w:b w:val="0"/>
-          <w:i w:val="0"/>
           <w:sz w:val="24"/>
         </w:rPr>
-        <w:t>Circuit Diagram</w:t>
-      </w:r>
-      <w:r>
-        <w:rPr>
-          <w:rFonts w:ascii="Times New Roman" w:hAnsi="Times New Roman" w:eastAsia="Times New Roman"/>
-          <w:b w:val="0"/>
-          <w:i w:val="0"/>
-          <w:sz w:val="24"/>
-        </w:rPr>
-        <w:tab/>
-        <w:t>23</w:t>
+        <w:t>Circuit Diagram . . . . . . . . . . . . . . . . . . . . . . . . . . . . . . . . . . . . . . . . . . . . . . . . . . . . . . . . . . . 23</w:t>
       </w:r>
     </w:p>
     <w:p>
       <w:pPr>
-        <w:tabs>
-          <w:tab w:pos="9184" w:val="right" w:leader="dot"/>
-        </w:tabs>
-        <w:spacing w:before="0" w:after="40" w:line="360" w:lineRule="exact"/>
+        <w:spacing w:before="20" w:after="20" w:line="259" w:lineRule="auto"/>
         <w:ind w:left="397"/>
-        <w:jc w:val="left"/>
       </w:pPr>
       <w:r>
         <w:rPr>
-          <w:rFonts w:ascii="Times New Roman" w:hAnsi="Times New Roman" w:eastAsia="Times New Roman"/>
+          <w:rFonts w:ascii="Times New Roman" w:hAnsi="Times New Roman"/>
           <w:b/>
-          <w:i w:val="0"/>
           <w:sz w:val="24"/>
         </w:rPr>
         <w:t xml:space="preserve">3.6. </w:t>
       </w:r>
       <w:r>
         <w:rPr>
-          <w:rFonts w:ascii="Times New Roman" w:hAnsi="Times New Roman" w:eastAsia="Times New Roman"/>
+          <w:rFonts w:ascii="Times New Roman" w:hAnsi="Times New Roman"/>
           <w:b w:val="0"/>
-          <w:i w:val="0"/>
           <w:sz w:val="24"/>
         </w:rPr>
-        <w:t>Component Interconnection Diagram</w:t>
-      </w:r>
-      <w:r>
-        <w:rPr>
-          <w:rFonts w:ascii="Times New Roman" w:hAnsi="Times New Roman" w:eastAsia="Times New Roman"/>
-          <w:b w:val="0"/>
-          <w:i w:val="0"/>
-          <w:sz w:val="24"/>
-        </w:rPr>
-        <w:tab/>
-        <w:t>25</w:t>
+        <w:t>Component Interconnection Diagram . . . . . . . . . . . . . . . . . . . . . . . . . . . . . . . . . . . . . . . . . . 25</w:t>
       </w:r>
     </w:p>
     <w:p>
       <w:pPr>
-        <w:tabs>
-          <w:tab w:pos="9184" w:val="right" w:leader="dot"/>
-        </w:tabs>
-        <w:spacing w:before="0" w:after="40" w:line="360" w:lineRule="exact"/>
+        <w:spacing w:before="20" w:after="20" w:line="259" w:lineRule="auto"/>
         <w:ind w:left="397"/>
-        <w:jc w:val="left"/>
       </w:pPr>
       <w:r>
         <w:rPr>
-          <w:rFonts w:ascii="Times New Roman" w:hAnsi="Times New Roman" w:eastAsia="Times New Roman"/>
+          <w:rFonts w:ascii="Times New Roman" w:hAnsi="Times New Roman"/>
           <w:b/>
-          <w:i w:val="0"/>
           <w:sz w:val="24"/>
         </w:rPr>
         <w:t xml:space="preserve">3.7. </w:t>
       </w:r>
       <w:r>
         <w:rPr>
-          <w:rFonts w:ascii="Times New Roman" w:hAnsi="Times New Roman" w:eastAsia="Times New Roman"/>
+          <w:rFonts w:ascii="Times New Roman" w:hAnsi="Times New Roman"/>
           <w:b w:val="0"/>
-          <w:i w:val="0"/>
           <w:sz w:val="24"/>
         </w:rPr>
-        <w:t>Hardware Module Design</w:t>
-      </w:r>
-      <w:r>
-        <w:rPr>
-          <w:rFonts w:ascii="Times New Roman" w:hAnsi="Times New Roman" w:eastAsia="Times New Roman"/>
-          <w:b w:val="0"/>
-          <w:i w:val="0"/>
-          <w:sz w:val="24"/>
-        </w:rPr>
-        <w:tab/>
-        <w:t>27</w:t>
+        <w:t>Hardware Module Design . . . . . . . . . . . . . . . . . . . . . . . . . . . . . . . . . . . . . . . . . . . . . . . . . . . 27</w:t>
       </w:r>
     </w:p>
     <w:p>
       <w:pPr>
-        <w:tabs>
-          <w:tab w:pos="9184" w:val="right" w:leader="dot"/>
-        </w:tabs>
-        <w:spacing w:before="0" w:after="40" w:line="360" w:lineRule="exact"/>
+        <w:spacing w:before="20" w:after="20" w:line="259" w:lineRule="auto"/>
         <w:ind w:left="397"/>
-        <w:jc w:val="left"/>
       </w:pPr>
       <w:r>
         <w:rPr>
-          <w:rFonts w:ascii="Times New Roman" w:hAnsi="Times New Roman" w:eastAsia="Times New Roman"/>
+          <w:rFonts w:ascii="Times New Roman" w:hAnsi="Times New Roman"/>
           <w:b/>
-          <w:i w:val="0"/>
           <w:sz w:val="24"/>
         </w:rPr>
         <w:t xml:space="preserve">3.8. </w:t>
       </w:r>
       <w:r>
         <w:rPr>
-          <w:rFonts w:ascii="Times New Roman" w:hAnsi="Times New Roman" w:eastAsia="Times New Roman"/>
+          <w:rFonts w:ascii="Times New Roman" w:hAnsi="Times New Roman"/>
           <w:b w:val="0"/>
-          <w:i w:val="0"/>
           <w:sz w:val="24"/>
         </w:rPr>
-        <w:t>Data Flow &amp; Processing Logic</w:t>
-      </w:r>
-      <w:r>
-        <w:rPr>
-          <w:rFonts w:ascii="Times New Roman" w:hAnsi="Times New Roman" w:eastAsia="Times New Roman"/>
-          <w:b w:val="0"/>
-          <w:i w:val="0"/>
-          <w:sz w:val="24"/>
-        </w:rPr>
-        <w:tab/>
-        <w:t>30</w:t>
+        <w:t>Data Flow &amp; Processing Logic . . . . . . . . . . . . . . . . . . . . . . . . . . . . . . . . . . . . . . . . . . . . . . . 30</w:t>
       </w:r>
     </w:p>
     <w:p>
       <w:pPr>
-        <w:tabs>
-          <w:tab w:pos="9184" w:val="right" w:leader="dot"/>
-        </w:tabs>
-        <w:spacing w:before="0" w:after="40" w:line="360" w:lineRule="exact"/>
+        <w:spacing w:before="20" w:after="20" w:line="259" w:lineRule="auto"/>
         <w:ind w:left="397"/>
-        <w:jc w:val="left"/>
       </w:pPr>
       <w:r>
         <w:rPr>
-          <w:rFonts w:ascii="Times New Roman" w:hAnsi="Times New Roman" w:eastAsia="Times New Roman"/>
+          <w:rFonts w:ascii="Times New Roman" w:hAnsi="Times New Roman"/>
           <w:b/>
-          <w:i w:val="0"/>
           <w:sz w:val="24"/>
         </w:rPr>
         <w:t xml:space="preserve">3.9. </w:t>
       </w:r>
       <w:r>
         <w:rPr>
-          <w:rFonts w:ascii="Times New Roman" w:hAnsi="Times New Roman" w:eastAsia="Times New Roman"/>
+          <w:rFonts w:ascii="Times New Roman" w:hAnsi="Times New Roman"/>
           <w:b w:val="0"/>
-          <w:i w:val="0"/>
           <w:sz w:val="24"/>
         </w:rPr>
-        <w:t>Database Design (if applicable)</w:t>
-      </w:r>
-      <w:r>
-        <w:rPr>
-          <w:rFonts w:ascii="Times New Roman" w:hAnsi="Times New Roman" w:eastAsia="Times New Roman"/>
-          <w:b w:val="0"/>
-          <w:i w:val="0"/>
-          <w:sz w:val="24"/>
-        </w:rPr>
-        <w:tab/>
-        <w:t>31</w:t>
+        <w:t>Database Design (if applicable) . . . . . . . . . . . . . . . . . . . . . . . . . . . . . . . . . . . . . . . . . . . . . . . 31</w:t>
       </w:r>
     </w:p>
     <w:p>
       <w:pPr>
-        <w:tabs>
-          <w:tab w:pos="9184" w:val="right" w:leader="dot"/>
-        </w:tabs>
-        <w:spacing w:before="0" w:after="40" w:line="360" w:lineRule="exact"/>
+        <w:spacing w:before="20" w:after="20" w:line="259" w:lineRule="auto"/>
         <w:ind w:left="397"/>
-        <w:jc w:val="left"/>
       </w:pPr>
       <w:r>
         <w:rPr>
-          <w:rFonts w:ascii="Times New Roman" w:hAnsi="Times New Roman" w:eastAsia="Times New Roman"/>
+          <w:rFonts w:ascii="Times New Roman" w:hAnsi="Times New Roman"/>
           <w:b/>
-          <w:i w:val="0"/>
           <w:sz w:val="24"/>
         </w:rPr>
         <w:t xml:space="preserve">3.10. </w:t>
       </w:r>
       <w:r>
         <w:rPr>
-          <w:rFonts w:ascii="Times New Roman" w:hAnsi="Times New Roman" w:eastAsia="Times New Roman"/>
+          <w:rFonts w:ascii="Times New Roman" w:hAnsi="Times New Roman"/>
           <w:b w:val="0"/>
-          <w:i w:val="0"/>
           <w:sz w:val="24"/>
         </w:rPr>
-        <w:t>Dashboard/UI Design</w:t>
-      </w:r>
-      <w:r>
-        <w:rPr>
-          <w:rFonts w:ascii="Times New Roman" w:hAnsi="Times New Roman" w:eastAsia="Times New Roman"/>
-          <w:b w:val="0"/>
-          <w:i w:val="0"/>
-          <w:sz w:val="24"/>
-        </w:rPr>
-        <w:tab/>
-        <w:t>32</w:t>
+        <w:t>Dashboard/UI Design . . . . . . . . . . . . . . . . . . . . . . . . . . . . . . . . . . . . . . . . . . . . . . . . . . . . . 32</w:t>
       </w:r>
     </w:p>
     <w:p>
       <w:pPr>
-        <w:tabs>
-          <w:tab w:pos="9184" w:val="right" w:leader="dot"/>
-        </w:tabs>
-        <w:spacing w:before="0" w:after="40" w:line="360" w:lineRule="exact"/>
+        <w:spacing w:before="20" w:after="20" w:line="259" w:lineRule="auto"/>
         <w:ind w:left="397"/>
-        <w:jc w:val="left"/>
       </w:pPr>
       <w:r>
         <w:rPr>
-          <w:rFonts w:ascii="Times New Roman" w:hAnsi="Times New Roman" w:eastAsia="Times New Roman"/>
+          <w:rFonts w:ascii="Times New Roman" w:hAnsi="Times New Roman"/>
           <w:b/>
-          <w:i w:val="0"/>
           <w:sz w:val="24"/>
         </w:rPr>
         <w:t xml:space="preserve">3.11. </w:t>
       </w:r>
       <w:r>
         <w:rPr>
-          <w:rFonts w:ascii="Times New Roman" w:hAnsi="Times New Roman" w:eastAsia="Times New Roman"/>
+          <w:rFonts w:ascii="Times New Roman" w:hAnsi="Times New Roman"/>
           <w:b w:val="0"/>
-          <w:i w:val="0"/>
           <w:sz w:val="24"/>
         </w:rPr>
-        <w:t>Technology Stack</w:t>
-      </w:r>
-      <w:r>
-        <w:rPr>
-          <w:rFonts w:ascii="Times New Roman" w:hAnsi="Times New Roman" w:eastAsia="Times New Roman"/>
-          <w:b w:val="0"/>
-          <w:i w:val="0"/>
-          <w:sz w:val="24"/>
-        </w:rPr>
-        <w:tab/>
-        <w:t>33</w:t>
+        <w:t>Technology Stack . . . . . . . . . . . . . . . . . . . . . . . . . . . . . . . . . . . . . . . . . . . . . . . . . . . . . . . . 33</w:t>
       </w:r>
     </w:p>
     <w:p>
       <w:pPr>
-        <w:tabs>
-          <w:tab w:pos="9184" w:val="right" w:leader="dot"/>
-        </w:tabs>
-        <w:spacing w:before="0" w:after="40" w:line="360" w:lineRule="exact"/>
+        <w:spacing w:before="20" w:after="20" w:line="259" w:lineRule="auto"/>
         <w:ind w:left="397"/>
-        <w:jc w:val="left"/>
       </w:pPr>
       <w:r>
         <w:rPr>
-          <w:rFonts w:ascii="Times New Roman" w:hAnsi="Times New Roman" w:eastAsia="Times New Roman"/>
+          <w:rFonts w:ascii="Times New Roman" w:hAnsi="Times New Roman"/>
           <w:b/>
-          <w:i w:val="0"/>
           <w:sz w:val="24"/>
         </w:rPr>
         <w:t xml:space="preserve">3.12. </w:t>
       </w:r>
       <w:r>
         <w:rPr>
-          <w:rFonts w:ascii="Times New Roman" w:hAnsi="Times New Roman" w:eastAsia="Times New Roman"/>
+          <w:rFonts w:ascii="Times New Roman" w:hAnsi="Times New Roman"/>
           <w:b w:val="0"/>
-          <w:i w:val="0"/>
           <w:sz w:val="24"/>
         </w:rPr>
-        <w:t>Safety &amp; Security Considerations</w:t>
-      </w:r>
-      <w:r>
-        <w:rPr>
-          <w:rFonts w:ascii="Times New Roman" w:hAnsi="Times New Roman" w:eastAsia="Times New Roman"/>
-          <w:b w:val="0"/>
-          <w:i w:val="0"/>
-          <w:sz w:val="24"/>
-        </w:rPr>
-        <w:tab/>
-        <w:t>34</w:t>
+        <w:t>Safety &amp; Security Considerations . . . . . . . . . . . . . . . . . . . . . . . . . . . . . . . . . . . . . . . . . . . . 34</w:t>
       </w:r>
     </w:p>
     <w:p>
       <w:pPr>
-        <w:tabs>
-          <w:tab w:pos="9184" w:val="right" w:leader="dot"/>
-        </w:tabs>
-        <w:spacing w:before="0" w:after="40" w:line="360" w:lineRule="exact"/>
+        <w:spacing w:before="20" w:after="20" w:line="259" w:lineRule="auto"/>
         <w:ind w:left="397"/>
-        <w:jc w:val="left"/>
       </w:pPr>
       <w:r>
         <w:rPr>
-          <w:rFonts w:ascii="Times New Roman" w:hAnsi="Times New Roman" w:eastAsia="Times New Roman"/>
+          <w:rFonts w:ascii="Times New Roman" w:hAnsi="Times New Roman"/>
           <w:b/>
-          <w:i w:val="0"/>
           <w:sz w:val="24"/>
         </w:rPr>
         <w:t xml:space="preserve">3.13. </w:t>
       </w:r>
       <w:r>
         <w:rPr>
-          <w:rFonts w:ascii="Times New Roman" w:hAnsi="Times New Roman" w:eastAsia="Times New Roman"/>
+          <w:rFonts w:ascii="Times New Roman" w:hAnsi="Times New Roman"/>
           <w:b w:val="0"/>
-          <w:i w:val="0"/>
           <w:sz w:val="24"/>
         </w:rPr>
-        <w:t>Chapter Summary</w:t>
-      </w:r>
-      <w:r>
-        <w:rPr>
-          <w:rFonts w:ascii="Times New Roman" w:hAnsi="Times New Roman" w:eastAsia="Times New Roman"/>
-          <w:b w:val="0"/>
-          <w:i w:val="0"/>
-          <w:sz w:val="24"/>
-        </w:rPr>
-        <w:tab/>
-        <w:t>35</w:t>
+        <w:t>Chapter Summary . . . . . . . . . . . . . . . . . . . . . . . . . . . . . . . . . . . . . . . . . . . . . . . . . . . . . . . . 35</w:t>
       </w:r>
     </w:p>
     <w:p>
       <w:pPr>
-        <w:spacing w:before="0" w:after="80" w:line="160" w:lineRule="exact"/>
-        <w:jc w:val="center"/>
+        <w:spacing w:after="120"/>
+      </w:pPr>
+    </w:p>
+    <w:p>
+      <w:pPr>
+        <w:spacing w:before="20" w:after="20" w:line="259" w:lineRule="auto"/>
       </w:pPr>
       <w:r>
         <w:rPr>
-          <w:rFonts w:ascii="Times New Roman" w:hAnsi="Times New Roman" w:eastAsia="Times New Roman"/>
-          <w:b w:val="0"/>
-          <w:i w:val="0"/>
-          <w:sz w:val="12"/>
+          <w:rFonts w:ascii="Times New Roman" w:hAnsi="Times New Roman"/>
+          <w:b/>
+          <w:sz w:val="24"/>
         </w:rPr>
+        <w:t>CHAPTER 4: DEVELOPMENT AND IMPLEMENTATION . . . . . . . . . . . . . . . . . . . . . . . . . . 36</w:t>
       </w:r>
     </w:p>
     <w:p>
       <w:pPr>
-        <w:tabs>
-          <w:tab w:pos="9184" w:val="right" w:leader="dot"/>
-        </w:tabs>
-        <w:spacing w:before="0" w:after="40" w:line="360" w:lineRule="exact"/>
-        <w:jc w:val="left"/>
+        <w:spacing w:before="20" w:after="20" w:line="259" w:lineRule="auto"/>
+        <w:ind w:left="397"/>
       </w:pPr>
       <w:r>
         <w:rPr>
-          <w:rFonts w:ascii="Times New Roman" w:hAnsi="Times New Roman" w:eastAsia="Times New Roman"/>
+          <w:rFonts w:ascii="Times New Roman" w:hAnsi="Times New Roman"/>
           <w:b/>
-          <w:i w:val="0"/>
-          <w:sz w:val="24"/>
-        </w:rPr>
-        <w:t>CHAPTER 4: DEVELOPMENT AND IMPLEMENTATION</w:t>
-      </w:r>
-      <w:r>
-        <w:rPr>
-          <w:rFonts w:ascii="Times New Roman" w:hAnsi="Times New Roman" w:eastAsia="Times New Roman"/>
-          <w:b/>
-          <w:i w:val="0"/>
-          <w:sz w:val="24"/>
-        </w:rPr>
-        <w:tab/>
-        <w:t>36</w:t>
-      </w:r>
-    </w:p>
-    <w:p>
-      <w:pPr>
-        <w:tabs>
-          <w:tab w:pos="9184" w:val="right" w:leader="dot"/>
-        </w:tabs>
-        <w:spacing w:before="0" w:after="40" w:line="360" w:lineRule="exact"/>
-        <w:ind w:left="397"/>
-        <w:jc w:val="left"/>
-      </w:pPr>
-      <w:r>
-        <w:rPr>
-          <w:rFonts w:ascii="Times New Roman" w:hAnsi="Times New Roman" w:eastAsia="Times New Roman"/>
-          <w:b/>
-          <w:i w:val="0"/>
           <w:sz w:val="24"/>
         </w:rPr>
         <w:t xml:space="preserve">4.1. </w:t>
       </w:r>
       <w:r>
         <w:rPr>
-          <w:rFonts w:ascii="Times New Roman" w:hAnsi="Times New Roman" w:eastAsia="Times New Roman"/>
+          <w:rFonts w:ascii="Times New Roman" w:hAnsi="Times New Roman"/>
           <w:b w:val="0"/>
-          <w:i w:val="0"/>
           <w:sz w:val="24"/>
         </w:rPr>
-        <w:t>Development Environment</w:t>
-      </w:r>
-      <w:r>
-        <w:rPr>
-          <w:rFonts w:ascii="Times New Roman" w:hAnsi="Times New Roman" w:eastAsia="Times New Roman"/>
-          <w:b w:val="0"/>
-          <w:i w:val="0"/>
-          <w:sz w:val="24"/>
-        </w:rPr>
-        <w:tab/>
-        <w:t>36</w:t>
+        <w:t>Development Environment . . . . . . . . . . . . . . . . . . . . . . . . . . . . . . . . . . . . . . . . . . . . . . . . . . 36</w:t>
       </w:r>
     </w:p>
     <w:p>
       <w:pPr>
-        <w:tabs>
-          <w:tab w:pos="9184" w:val="right" w:leader="dot"/>
-        </w:tabs>
-        <w:spacing w:before="0" w:after="40" w:line="360" w:lineRule="exact"/>
+        <w:spacing w:before="20" w:after="20" w:line="259" w:lineRule="auto"/>
         <w:ind w:left="397"/>
-        <w:jc w:val="left"/>
       </w:pPr>
       <w:r>
         <w:rPr>
-          <w:rFonts w:ascii="Times New Roman" w:hAnsi="Times New Roman" w:eastAsia="Times New Roman"/>
+          <w:rFonts w:ascii="Times New Roman" w:hAnsi="Times New Roman"/>
           <w:b/>
-          <w:i w:val="0"/>
           <w:sz w:val="24"/>
         </w:rPr>
         <w:t xml:space="preserve">4.2. </w:t>
       </w:r>
       <w:r>
         <w:rPr>
-          <w:rFonts w:ascii="Times New Roman" w:hAnsi="Times New Roman" w:eastAsia="Times New Roman"/>
+          <w:rFonts w:ascii="Times New Roman" w:hAnsi="Times New Roman"/>
           <w:b w:val="0"/>
-          <w:i w:val="0"/>
           <w:sz w:val="24"/>
         </w:rPr>
-        <w:t>Implementation Approach</w:t>
-      </w:r>
-      <w:r>
-        <w:rPr>
-          <w:rFonts w:ascii="Times New Roman" w:hAnsi="Times New Roman" w:eastAsia="Times New Roman"/>
-          <w:b w:val="0"/>
-          <w:i w:val="0"/>
-          <w:sz w:val="24"/>
-        </w:rPr>
-        <w:tab/>
-        <w:t>36</w:t>
+        <w:t>Implementation Approach . . . . . . . . . . . . . . . . . . . . . . . . . . . . . . . . . . . . . . . . . . . . . . . . . . . 36</w:t>
       </w:r>
     </w:p>
     <w:p>
       <w:pPr>
-        <w:tabs>
-          <w:tab w:pos="9184" w:val="right" w:leader="dot"/>
-        </w:tabs>
-        <w:spacing w:before="0" w:after="40" w:line="360" w:lineRule="exact"/>
+        <w:spacing w:before="20" w:after="20" w:line="259" w:lineRule="auto"/>
         <w:ind w:left="397"/>
-        <w:jc w:val="left"/>
       </w:pPr>
       <w:r>
         <w:rPr>
-          <w:rFonts w:ascii="Times New Roman" w:hAnsi="Times New Roman" w:eastAsia="Times New Roman"/>
+          <w:rFonts w:ascii="Times New Roman" w:hAnsi="Times New Roman"/>
           <w:b/>
-          <w:i w:val="0"/>
           <w:sz w:val="24"/>
         </w:rPr>
         <w:t xml:space="preserve">4.3. </w:t>
       </w:r>
       <w:r>
         <w:rPr>
-          <w:rFonts w:ascii="Times New Roman" w:hAnsi="Times New Roman" w:eastAsia="Times New Roman"/>
+          <w:rFonts w:ascii="Times New Roman" w:hAnsi="Times New Roman"/>
           <w:b w:val="0"/>
-          <w:i w:val="0"/>
           <w:sz w:val="24"/>
         </w:rPr>
-        <w:t>Hardware Assembly</w:t>
-      </w:r>
-      <w:r>
-        <w:rPr>
-          <w:rFonts w:ascii="Times New Roman" w:hAnsi="Times New Roman" w:eastAsia="Times New Roman"/>
-          <w:b w:val="0"/>
-          <w:i w:val="0"/>
-          <w:sz w:val="24"/>
-        </w:rPr>
-        <w:tab/>
-        <w:t>38</w:t>
+        <w:t>Hardware Assembly . . . . . . . . . . . . . . . . . . . . . . . . . . . . . . . . . . . . . . . . . . . . . . . . . . . . . . . 38</w:t>
       </w:r>
     </w:p>
     <w:p>
       <w:pPr>
-        <w:tabs>
-          <w:tab w:pos="9184" w:val="right" w:leader="dot"/>
-        </w:tabs>
-        <w:spacing w:before="0" w:after="40" w:line="360" w:lineRule="exact"/>
+        <w:spacing w:before="20" w:after="20" w:line="259" w:lineRule="auto"/>
         <w:ind w:left="397"/>
-        <w:jc w:val="left"/>
       </w:pPr>
       <w:r>
         <w:rPr>
-          <w:rFonts w:ascii="Times New Roman" w:hAnsi="Times New Roman" w:eastAsia="Times New Roman"/>
+          <w:rFonts w:ascii="Times New Roman" w:hAnsi="Times New Roman"/>
           <w:b/>
-          <w:i w:val="0"/>
           <w:sz w:val="24"/>
         </w:rPr>
         <w:t xml:space="preserve">4.4. </w:t>
       </w:r>
       <w:r>
         <w:rPr>
-          <w:rFonts w:ascii="Times New Roman" w:hAnsi="Times New Roman" w:eastAsia="Times New Roman"/>
+          <w:rFonts w:ascii="Times New Roman" w:hAnsi="Times New Roman"/>
           <w:b w:val="0"/>
-          <w:i w:val="0"/>
           <w:sz w:val="24"/>
         </w:rPr>
-        <w:t>Firmware Development</w:t>
-      </w:r>
-      <w:r>
-        <w:rPr>
-          <w:rFonts w:ascii="Times New Roman" w:hAnsi="Times New Roman" w:eastAsia="Times New Roman"/>
-          <w:b w:val="0"/>
-          <w:i w:val="0"/>
-          <w:sz w:val="24"/>
-        </w:rPr>
-        <w:tab/>
-        <w:t>42</w:t>
+        <w:t>Firmware Development . . . . . . . . . . . . . . . . . . . . . . . . . . . . . . . . . . . . . . . . . . . . . . . . . . . . . 42</w:t>
       </w:r>
     </w:p>
     <w:p>
       <w:pPr>
-        <w:tabs>
-          <w:tab w:pos="9184" w:val="right" w:leader="dot"/>
-        </w:tabs>
-        <w:spacing w:before="0" w:after="40" w:line="360" w:lineRule="exact"/>
+        <w:spacing w:before="20" w:after="20" w:line="259" w:lineRule="auto"/>
         <w:ind w:left="397"/>
-        <w:jc w:val="left"/>
       </w:pPr>
       <w:r>
         <w:rPr>
-          <w:rFonts w:ascii="Times New Roman" w:hAnsi="Times New Roman" w:eastAsia="Times New Roman"/>
+          <w:rFonts w:ascii="Times New Roman" w:hAnsi="Times New Roman"/>
           <w:b/>
-          <w:i w:val="0"/>
           <w:sz w:val="24"/>
         </w:rPr>
         <w:t xml:space="preserve">4.5. </w:t>
       </w:r>
       <w:r>
         <w:rPr>
-          <w:rFonts w:ascii="Times New Roman" w:hAnsi="Times New Roman" w:eastAsia="Times New Roman"/>
+          <w:rFonts w:ascii="Times New Roman" w:hAnsi="Times New Roman"/>
           <w:b w:val="0"/>
-          <w:i w:val="0"/>
           <w:sz w:val="24"/>
         </w:rPr>
-        <w:t>Database/Cloud Integration</w:t>
-      </w:r>
-      <w:r>
-        <w:rPr>
-          <w:rFonts w:ascii="Times New Roman" w:hAnsi="Times New Roman" w:eastAsia="Times New Roman"/>
-          <w:b w:val="0"/>
-          <w:i w:val="0"/>
-          <w:sz w:val="24"/>
-        </w:rPr>
-        <w:tab/>
-        <w:t>44</w:t>
+        <w:t>Database/Cloud Integration . . . . . . . . . . . . . . . . . . . . . . . . . . . . . . . . . . . . . . . . . . . . . . . . . . 44</w:t>
       </w:r>
     </w:p>
     <w:p>
       <w:pPr>
-        <w:tabs>
-          <w:tab w:pos="9184" w:val="right" w:leader="dot"/>
-        </w:tabs>
-        <w:spacing w:before="0" w:after="40" w:line="360" w:lineRule="exact"/>
+        <w:spacing w:before="20" w:after="20" w:line="259" w:lineRule="auto"/>
         <w:ind w:left="397"/>
-        <w:jc w:val="left"/>
       </w:pPr>
       <w:r>
         <w:rPr>
-          <w:rFonts w:ascii="Times New Roman" w:hAnsi="Times New Roman" w:eastAsia="Times New Roman"/>
+          <w:rFonts w:ascii="Times New Roman" w:hAnsi="Times New Roman"/>
           <w:b/>
-          <w:i w:val="0"/>
           <w:sz w:val="24"/>
         </w:rPr>
         <w:t xml:space="preserve">4.6. </w:t>
       </w:r>
       <w:r>
         <w:rPr>
-          <w:rFonts w:ascii="Times New Roman" w:hAnsi="Times New Roman" w:eastAsia="Times New Roman"/>
+          <w:rFonts w:ascii="Times New Roman" w:hAnsi="Times New Roman"/>
           <w:b w:val="0"/>
-          <w:i w:val="0"/>
           <w:sz w:val="24"/>
         </w:rPr>
-        <w:t>Dashboard Development</w:t>
-      </w:r>
-      <w:r>
-        <w:rPr>
-          <w:rFonts w:ascii="Times New Roman" w:hAnsi="Times New Roman" w:eastAsia="Times New Roman"/>
-          <w:b w:val="0"/>
-          <w:i w:val="0"/>
-          <w:sz w:val="24"/>
-        </w:rPr>
-        <w:tab/>
-        <w:t>46</w:t>
+        <w:t>Dashboard Development . . . . . . . . . . . . . . . . . . . . . . . . . . . . . . . . . . . . . . . . . . . . . . . . . . . . 46</w:t>
       </w:r>
     </w:p>
     <w:p>
       <w:pPr>
-        <w:tabs>
-          <w:tab w:pos="9184" w:val="right" w:leader="dot"/>
-        </w:tabs>
-        <w:spacing w:before="0" w:after="40" w:line="360" w:lineRule="exact"/>
+        <w:spacing w:before="20" w:after="20" w:line="259" w:lineRule="auto"/>
         <w:ind w:left="397"/>
-        <w:jc w:val="left"/>
       </w:pPr>
       <w:r>
         <w:rPr>
-          <w:rFonts w:ascii="Times New Roman" w:hAnsi="Times New Roman" w:eastAsia="Times New Roman"/>
+          <w:rFonts w:ascii="Times New Roman" w:hAnsi="Times New Roman"/>
           <w:b/>
-          <w:i w:val="0"/>
           <w:sz w:val="24"/>
         </w:rPr>
         <w:t xml:space="preserve">4.7. </w:t>
       </w:r>
       <w:r>
         <w:rPr>
-          <w:rFonts w:ascii="Times New Roman" w:hAnsi="Times New Roman" w:eastAsia="Times New Roman"/>
+          <w:rFonts w:ascii="Times New Roman" w:hAnsi="Times New Roman"/>
           <w:b w:val="0"/>
-          <w:i w:val="0"/>
           <w:sz w:val="24"/>
         </w:rPr>
-        <w:t>Module-wise Implementation</w:t>
-      </w:r>
-      <w:r>
-        <w:rPr>
-          <w:rFonts w:ascii="Times New Roman" w:hAnsi="Times New Roman" w:eastAsia="Times New Roman"/>
-          <w:b w:val="0"/>
-          <w:i w:val="0"/>
-          <w:sz w:val="24"/>
-        </w:rPr>
-        <w:tab/>
-        <w:t>48</w:t>
+        <w:t>Module-wise Implementation . . . . . . . . . . . . . . . . . . . . . . . . . . . . . . . . . . . . . . . . . . . . . . . . 48</w:t>
       </w:r>
     </w:p>
     <w:p>
       <w:pPr>
-        <w:tabs>
-          <w:tab w:pos="9184" w:val="right" w:leader="dot"/>
-        </w:tabs>
-        <w:spacing w:before="0" w:after="40" w:line="360" w:lineRule="exact"/>
+        <w:spacing w:before="20" w:after="20" w:line="259" w:lineRule="auto"/>
         <w:ind w:left="397"/>
-        <w:jc w:val="left"/>
       </w:pPr>
       <w:r>
         <w:rPr>
-          <w:rFonts w:ascii="Times New Roman" w:hAnsi="Times New Roman" w:eastAsia="Times New Roman"/>
+          <w:rFonts w:ascii="Times New Roman" w:hAnsi="Times New Roman"/>
           <w:b/>
-          <w:i w:val="0"/>
           <w:sz w:val="24"/>
         </w:rPr>
         <w:t xml:space="preserve">4.8. </w:t>
       </w:r>
       <w:r>
         <w:rPr>
-          <w:rFonts w:ascii="Times New Roman" w:hAnsi="Times New Roman" w:eastAsia="Times New Roman"/>
+          <w:rFonts w:ascii="Times New Roman" w:hAnsi="Times New Roman"/>
           <w:b w:val="0"/>
-          <w:i w:val="0"/>
           <w:sz w:val="24"/>
         </w:rPr>
-        <w:t>Algorithms and Control Logic</w:t>
-      </w:r>
-      <w:r>
-        <w:rPr>
-          <w:rFonts w:ascii="Times New Roman" w:hAnsi="Times New Roman" w:eastAsia="Times New Roman"/>
-          <w:b w:val="0"/>
-          <w:i w:val="0"/>
-          <w:sz w:val="24"/>
-        </w:rPr>
-        <w:tab/>
-        <w:t>50</w:t>
+        <w:t>Algorithms and Control Logic . . . . . . . . . . . . . . . . . . . . . . . . . . . . . . . . . . . . . . . . . . . . . . . . 50</w:t>
       </w:r>
     </w:p>
     <w:p>
       <w:pPr>
-        <w:tabs>
-          <w:tab w:pos="9184" w:val="right" w:leader="dot"/>
-        </w:tabs>
-        <w:spacing w:before="0" w:after="40" w:line="360" w:lineRule="exact"/>
+        <w:spacing w:before="20" w:after="20" w:line="259" w:lineRule="auto"/>
         <w:ind w:left="397"/>
-        <w:jc w:val="left"/>
       </w:pPr>
       <w:r>
         <w:rPr>
-          <w:rFonts w:ascii="Times New Roman" w:hAnsi="Times New Roman" w:eastAsia="Times New Roman"/>
+          <w:rFonts w:ascii="Times New Roman" w:hAnsi="Times New Roman"/>
           <w:b/>
-          <w:i w:val="0"/>
           <w:sz w:val="24"/>
         </w:rPr>
         <w:t xml:space="preserve">4.9. </w:t>
       </w:r>
       <w:r>
         <w:rPr>
-          <w:rFonts w:ascii="Times New Roman" w:hAnsi="Times New Roman" w:eastAsia="Times New Roman"/>
+          <w:rFonts w:ascii="Times New Roman" w:hAnsi="Times New Roman"/>
           <w:b w:val="0"/>
-          <w:i w:val="0"/>
           <w:sz w:val="24"/>
         </w:rPr>
-        <w:t>Safety Features Implemented</w:t>
-      </w:r>
-      <w:r>
-        <w:rPr>
-          <w:rFonts w:ascii="Times New Roman" w:hAnsi="Times New Roman" w:eastAsia="Times New Roman"/>
-          <w:b w:val="0"/>
-          <w:i w:val="0"/>
-          <w:sz w:val="24"/>
-        </w:rPr>
-        <w:tab/>
-        <w:t>52</w:t>
+        <w:t>Safety Features Implemented . . . . . . . . . . . . . . . . . . . . . . . . . . . . . . . . . . . . . . . . . . . . . . . . 52</w:t>
       </w:r>
     </w:p>
     <w:p>
       <w:pPr>
-        <w:tabs>
-          <w:tab w:pos="9184" w:val="right" w:leader="dot"/>
-        </w:tabs>
-        <w:spacing w:before="0" w:after="40" w:line="360" w:lineRule="exact"/>
+        <w:spacing w:before="20" w:after="20" w:line="259" w:lineRule="auto"/>
         <w:ind w:left="397"/>
-        <w:jc w:val="left"/>
       </w:pPr>
       <w:r>
         <w:rPr>
-          <w:rFonts w:ascii="Times New Roman" w:hAnsi="Times New Roman" w:eastAsia="Times New Roman"/>
+          <w:rFonts w:ascii="Times New Roman" w:hAnsi="Times New Roman"/>
           <w:b/>
-          <w:i w:val="0"/>
           <w:sz w:val="24"/>
         </w:rPr>
         <w:t xml:space="preserve">4.10. </w:t>
       </w:r>
       <w:r>
         <w:rPr>
-          <w:rFonts w:ascii="Times New Roman" w:hAnsi="Times New Roman" w:eastAsia="Times New Roman"/>
+          <w:rFonts w:ascii="Times New Roman" w:hAnsi="Times New Roman"/>
           <w:b w:val="0"/>
-          <w:i w:val="0"/>
           <w:sz w:val="24"/>
         </w:rPr>
-        <w:t>Prototype Development</w:t>
-      </w:r>
-      <w:r>
-        <w:rPr>
-          <w:rFonts w:ascii="Times New Roman" w:hAnsi="Times New Roman" w:eastAsia="Times New Roman"/>
-          <w:b w:val="0"/>
-          <w:i w:val="0"/>
-          <w:sz w:val="24"/>
-        </w:rPr>
-        <w:tab/>
-        <w:t>53</w:t>
+        <w:t>Prototype Development . . . . . . . . . . . . . . . . . . . . . . . . . . . . . . . . . . . . . . . . . . . . . . . . . . . . 53</w:t>
       </w:r>
     </w:p>
     <w:p>
       <w:pPr>
-        <w:tabs>
-          <w:tab w:pos="9184" w:val="right" w:leader="dot"/>
-        </w:tabs>
-        <w:spacing w:before="0" w:after="40" w:line="360" w:lineRule="exact"/>
+        <w:spacing w:before="20" w:after="20" w:line="259" w:lineRule="auto"/>
         <w:ind w:left="397"/>
-        <w:jc w:val="left"/>
       </w:pPr>
       <w:r>
         <w:rPr>
-          <w:rFonts w:ascii="Times New Roman" w:hAnsi="Times New Roman" w:eastAsia="Times New Roman"/>
+          <w:rFonts w:ascii="Times New Roman" w:hAnsi="Times New Roman"/>
           <w:b/>
-          <w:i w:val="0"/>
           <w:sz w:val="24"/>
         </w:rPr>
         <w:t xml:space="preserve">4.11. </w:t>
       </w:r>
       <w:r>
         <w:rPr>
-          <w:rFonts w:ascii="Times New Roman" w:hAnsi="Times New Roman" w:eastAsia="Times New Roman"/>
+          <w:rFonts w:ascii="Times New Roman" w:hAnsi="Times New Roman"/>
           <w:b w:val="0"/>
-          <w:i w:val="0"/>
           <w:sz w:val="24"/>
         </w:rPr>
-        <w:t>Prototype Photos &amp; Demonstration</w:t>
-      </w:r>
-      <w:r>
-        <w:rPr>
-          <w:rFonts w:ascii="Times New Roman" w:hAnsi="Times New Roman" w:eastAsia="Times New Roman"/>
-          <w:b w:val="0"/>
-          <w:i w:val="0"/>
-          <w:sz w:val="24"/>
-        </w:rPr>
-        <w:tab/>
-        <w:t>54</w:t>
+        <w:t>Prototype Photos &amp; Demonstration . . . . . . . . . . . . . . . . . . . . . . . . . . . . . . . . . . . . . . . . . . . 54</w:t>
       </w:r>
     </w:p>
     <w:p>
       <w:pPr>
-        <w:spacing w:before="0" w:after="80" w:line="160" w:lineRule="exact"/>
-        <w:jc w:val="center"/>
-      </w:pPr>
-      <w:r>
-        <w:rPr>
-          <w:rFonts w:ascii="Times New Roman" w:hAnsi="Times New Roman" w:eastAsia="Times New Roman"/>
-          <w:b w:val="0"/>
-          <w:i w:val="0"/>
-          <w:sz w:val="12"/>
-        </w:rPr>
-      </w:r>
+        <w:spacing w:after="120"/>
+      </w:pPr>
     </w:p>
     <w:p>
       <w:r>
@@ -2649,1172 +1752,654 @@
     </w:p>
     <w:p>
       <w:pPr>
-        <w:tabs>
-          <w:tab w:pos="9184" w:val="right" w:leader="dot"/>
-        </w:tabs>
-        <w:spacing w:before="0" w:after="40" w:line="360" w:lineRule="exact"/>
-        <w:jc w:val="left"/>
+        <w:spacing w:before="20" w:after="20" w:line="259" w:lineRule="auto"/>
       </w:pPr>
       <w:r>
         <w:rPr>
-          <w:rFonts w:ascii="Times New Roman" w:hAnsi="Times New Roman" w:eastAsia="Times New Roman"/>
+          <w:rFonts w:ascii="Times New Roman" w:hAnsi="Times New Roman"/>
           <w:b/>
-          <w:i w:val="0"/>
           <w:sz w:val="24"/>
         </w:rPr>
-        <w:t>CHAPTER 5: TESTING, VALIDATION AND PERFORMANCE EVALUATION</w:t>
-      </w:r>
-      <w:r>
-        <w:rPr>
-          <w:rFonts w:ascii="Times New Roman" w:hAnsi="Times New Roman" w:eastAsia="Times New Roman"/>
-          <w:b/>
-          <w:i w:val="0"/>
-          <w:sz w:val="24"/>
-        </w:rPr>
-        <w:tab/>
-        <w:t>58</w:t>
+        <w:t>CHAPTER 5: TESTING, VALIDATION AND PERFORMANCE EVALUATION . . . . . . . . 58</w:t>
       </w:r>
     </w:p>
     <w:p>
       <w:pPr>
-        <w:tabs>
-          <w:tab w:pos="9184" w:val="right" w:leader="dot"/>
-        </w:tabs>
-        <w:spacing w:before="0" w:after="40" w:line="360" w:lineRule="exact"/>
+        <w:spacing w:before="20" w:after="20" w:line="259" w:lineRule="auto"/>
         <w:ind w:left="397"/>
-        <w:jc w:val="left"/>
       </w:pPr>
       <w:r>
         <w:rPr>
-          <w:rFonts w:ascii="Times New Roman" w:hAnsi="Times New Roman" w:eastAsia="Times New Roman"/>
+          <w:rFonts w:ascii="Times New Roman" w:hAnsi="Times New Roman"/>
           <w:b/>
-          <w:i w:val="0"/>
           <w:sz w:val="24"/>
         </w:rPr>
         <w:t xml:space="preserve">5.1. </w:t>
       </w:r>
       <w:r>
         <w:rPr>
-          <w:rFonts w:ascii="Times New Roman" w:hAnsi="Times New Roman" w:eastAsia="Times New Roman"/>
+          <w:rFonts w:ascii="Times New Roman" w:hAnsi="Times New Roman"/>
           <w:b w:val="0"/>
-          <w:i w:val="0"/>
           <w:sz w:val="24"/>
         </w:rPr>
-        <w:t>Testing Strategy</w:t>
-      </w:r>
-      <w:r>
-        <w:rPr>
-          <w:rFonts w:ascii="Times New Roman" w:hAnsi="Times New Roman" w:eastAsia="Times New Roman"/>
-          <w:b w:val="0"/>
-          <w:i w:val="0"/>
-          <w:sz w:val="24"/>
-        </w:rPr>
-        <w:tab/>
-        <w:t>58</w:t>
+        <w:t>Testing Strategy . . . . . . . . . . . . . . . . . . . . . . . . . . . . . . . . . . . . . . . . . . . . . . . . . . . . . . . . . . . 58</w:t>
       </w:r>
     </w:p>
     <w:p>
       <w:pPr>
-        <w:tabs>
-          <w:tab w:pos="9184" w:val="right" w:leader="dot"/>
-        </w:tabs>
-        <w:spacing w:before="0" w:after="40" w:line="360" w:lineRule="exact"/>
+        <w:spacing w:before="20" w:after="20" w:line="259" w:lineRule="auto"/>
         <w:ind w:left="397"/>
-        <w:jc w:val="left"/>
       </w:pPr>
       <w:r>
         <w:rPr>
-          <w:rFonts w:ascii="Times New Roman" w:hAnsi="Times New Roman" w:eastAsia="Times New Roman"/>
+          <w:rFonts w:ascii="Times New Roman" w:hAnsi="Times New Roman"/>
           <w:b/>
-          <w:i w:val="0"/>
           <w:sz w:val="24"/>
         </w:rPr>
         <w:t xml:space="preserve">5.2. </w:t>
       </w:r>
       <w:r>
         <w:rPr>
-          <w:rFonts w:ascii="Times New Roman" w:hAnsi="Times New Roman" w:eastAsia="Times New Roman"/>
+          <w:rFonts w:ascii="Times New Roman" w:hAnsi="Times New Roman"/>
           <w:b w:val="0"/>
-          <w:i w:val="0"/>
           <w:sz w:val="24"/>
         </w:rPr>
-        <w:t>Unit Testing</w:t>
-      </w:r>
-      <w:r>
-        <w:rPr>
-          <w:rFonts w:ascii="Times New Roman" w:hAnsi="Times New Roman" w:eastAsia="Times New Roman"/>
-          <w:b w:val="0"/>
-          <w:i w:val="0"/>
-          <w:sz w:val="24"/>
-        </w:rPr>
-        <w:tab/>
-        <w:t>58</w:t>
+        <w:t>Unit Testing . . . . . . . . . . . . . . . . . . . . . . . . . . . . . . . . . . . . . . . . . . . . . . . . . . . . . . . . . . . . . . 58</w:t>
       </w:r>
     </w:p>
     <w:p>
       <w:pPr>
-        <w:tabs>
-          <w:tab w:pos="9184" w:val="right" w:leader="dot"/>
-        </w:tabs>
-        <w:spacing w:before="0" w:after="40" w:line="360" w:lineRule="exact"/>
+        <w:spacing w:before="20" w:after="20" w:line="259" w:lineRule="auto"/>
         <w:ind w:left="397"/>
-        <w:jc w:val="left"/>
       </w:pPr>
       <w:r>
         <w:rPr>
-          <w:rFonts w:ascii="Times New Roman" w:hAnsi="Times New Roman" w:eastAsia="Times New Roman"/>
+          <w:rFonts w:ascii="Times New Roman" w:hAnsi="Times New Roman"/>
           <w:b/>
-          <w:i w:val="0"/>
           <w:sz w:val="24"/>
         </w:rPr>
         <w:t xml:space="preserve">5.3. </w:t>
       </w:r>
       <w:r>
         <w:rPr>
-          <w:rFonts w:ascii="Times New Roman" w:hAnsi="Times New Roman" w:eastAsia="Times New Roman"/>
+          <w:rFonts w:ascii="Times New Roman" w:hAnsi="Times New Roman"/>
           <w:b w:val="0"/>
-          <w:i w:val="0"/>
           <w:sz w:val="24"/>
         </w:rPr>
-        <w:t>Integration Testing</w:t>
-      </w:r>
-      <w:r>
-        <w:rPr>
-          <w:rFonts w:ascii="Times New Roman" w:hAnsi="Times New Roman" w:eastAsia="Times New Roman"/>
-          <w:b w:val="0"/>
-          <w:i w:val="0"/>
-          <w:sz w:val="24"/>
-        </w:rPr>
-        <w:tab/>
-        <w:t>60</w:t>
+        <w:t>Integration Testing . . . . . . . . . . . . . . . . . . . . . . . . . . . . . . . . . . . . . . . . . . . . . . . . . . . . . . . . . 60</w:t>
       </w:r>
     </w:p>
     <w:p>
       <w:pPr>
-        <w:tabs>
-          <w:tab w:pos="9184" w:val="right" w:leader="dot"/>
-        </w:tabs>
-        <w:spacing w:before="0" w:after="40" w:line="360" w:lineRule="exact"/>
+        <w:spacing w:before="20" w:after="20" w:line="259" w:lineRule="auto"/>
         <w:ind w:left="397"/>
-        <w:jc w:val="left"/>
       </w:pPr>
       <w:r>
         <w:rPr>
-          <w:rFonts w:ascii="Times New Roman" w:hAnsi="Times New Roman" w:eastAsia="Times New Roman"/>
+          <w:rFonts w:ascii="Times New Roman" w:hAnsi="Times New Roman"/>
           <w:b/>
-          <w:i w:val="0"/>
           <w:sz w:val="24"/>
         </w:rPr>
         <w:t xml:space="preserve">5.4. </w:t>
       </w:r>
       <w:r>
         <w:rPr>
-          <w:rFonts w:ascii="Times New Roman" w:hAnsi="Times New Roman" w:eastAsia="Times New Roman"/>
+          <w:rFonts w:ascii="Times New Roman" w:hAnsi="Times New Roman"/>
           <w:b w:val="0"/>
-          <w:i w:val="0"/>
           <w:sz w:val="24"/>
         </w:rPr>
-        <w:t>System Testing</w:t>
-      </w:r>
-      <w:r>
-        <w:rPr>
-          <w:rFonts w:ascii="Times New Roman" w:hAnsi="Times New Roman" w:eastAsia="Times New Roman"/>
-          <w:b w:val="0"/>
-          <w:i w:val="0"/>
-          <w:sz w:val="24"/>
-        </w:rPr>
-        <w:tab/>
-        <w:t>62</w:t>
+        <w:t>System Testing . . . . . . . . . . . . . . . . . . . . . . . . . . . . . . . . . . . . . . . . . . . . . . . . . . . . . . . . . . . 62</w:t>
       </w:r>
     </w:p>
     <w:p>
       <w:pPr>
-        <w:tabs>
-          <w:tab w:pos="9184" w:val="right" w:leader="dot"/>
-        </w:tabs>
-        <w:spacing w:before="0" w:after="40" w:line="360" w:lineRule="exact"/>
+        <w:spacing w:before="20" w:after="20" w:line="259" w:lineRule="auto"/>
         <w:ind w:left="397"/>
-        <w:jc w:val="left"/>
       </w:pPr>
       <w:r>
         <w:rPr>
-          <w:rFonts w:ascii="Times New Roman" w:hAnsi="Times New Roman" w:eastAsia="Times New Roman"/>
+          <w:rFonts w:ascii="Times New Roman" w:hAnsi="Times New Roman"/>
           <w:b/>
-          <w:i w:val="0"/>
           <w:sz w:val="24"/>
         </w:rPr>
         <w:t xml:space="preserve">5.5. </w:t>
       </w:r>
       <w:r>
         <w:rPr>
-          <w:rFonts w:ascii="Times New Roman" w:hAnsi="Times New Roman" w:eastAsia="Times New Roman"/>
+          <w:rFonts w:ascii="Times New Roman" w:hAnsi="Times New Roman"/>
           <w:b w:val="0"/>
-          <w:i w:val="0"/>
           <w:sz w:val="24"/>
         </w:rPr>
-        <w:t>User Acceptance Testing</w:t>
-      </w:r>
-      <w:r>
-        <w:rPr>
-          <w:rFonts w:ascii="Times New Roman" w:hAnsi="Times New Roman" w:eastAsia="Times New Roman"/>
-          <w:b w:val="0"/>
-          <w:i w:val="0"/>
-          <w:sz w:val="24"/>
-        </w:rPr>
-        <w:tab/>
-        <w:t>64</w:t>
+        <w:t>User Acceptance Testing . . . . . . . . . . . . . . . . . . . . . . . . . . . . . . . . . . . . . . . . . . . . . . . . . . . . 64</w:t>
       </w:r>
     </w:p>
     <w:p>
       <w:pPr>
-        <w:tabs>
-          <w:tab w:pos="9184" w:val="right" w:leader="dot"/>
-        </w:tabs>
-        <w:spacing w:before="0" w:after="40" w:line="360" w:lineRule="exact"/>
+        <w:spacing w:before="20" w:after="20" w:line="259" w:lineRule="auto"/>
         <w:ind w:left="397"/>
-        <w:jc w:val="left"/>
       </w:pPr>
       <w:r>
         <w:rPr>
-          <w:rFonts w:ascii="Times New Roman" w:hAnsi="Times New Roman" w:eastAsia="Times New Roman"/>
+          <w:rFonts w:ascii="Times New Roman" w:hAnsi="Times New Roman"/>
           <w:b/>
-          <w:i w:val="0"/>
           <w:sz w:val="24"/>
         </w:rPr>
         <w:t xml:space="preserve">5.6. </w:t>
       </w:r>
       <w:r>
         <w:rPr>
-          <w:rFonts w:ascii="Times New Roman" w:hAnsi="Times New Roman" w:eastAsia="Times New Roman"/>
+          <w:rFonts w:ascii="Times New Roman" w:hAnsi="Times New Roman"/>
           <w:b w:val="0"/>
-          <w:i w:val="0"/>
           <w:sz w:val="24"/>
         </w:rPr>
-        <w:t>Performance Evaluation</w:t>
-      </w:r>
-      <w:r>
-        <w:rPr>
-          <w:rFonts w:ascii="Times New Roman" w:hAnsi="Times New Roman" w:eastAsia="Times New Roman"/>
-          <w:b w:val="0"/>
-          <w:i w:val="0"/>
-          <w:sz w:val="24"/>
-        </w:rPr>
-        <w:tab/>
-        <w:t>65</w:t>
+        <w:t>Performance Evaluation . . . . . . . . . . . . . . . . . . . . . . . . . . . . . . . . . . . . . . . . . . . . . . . . . . . . 65</w:t>
       </w:r>
     </w:p>
     <w:p>
       <w:pPr>
-        <w:tabs>
-          <w:tab w:pos="9184" w:val="right" w:leader="dot"/>
-        </w:tabs>
-        <w:spacing w:before="0" w:after="40" w:line="360" w:lineRule="exact"/>
+        <w:spacing w:before="20" w:after="20" w:line="259" w:lineRule="auto"/>
         <w:ind w:left="397"/>
-        <w:jc w:val="left"/>
       </w:pPr>
       <w:r>
         <w:rPr>
-          <w:rFonts w:ascii="Times New Roman" w:hAnsi="Times New Roman" w:eastAsia="Times New Roman"/>
+          <w:rFonts w:ascii="Times New Roman" w:hAnsi="Times New Roman"/>
           <w:b/>
-          <w:i w:val="0"/>
           <w:sz w:val="24"/>
         </w:rPr>
         <w:t xml:space="preserve">5.7. </w:t>
       </w:r>
       <w:r>
         <w:rPr>
-          <w:rFonts w:ascii="Times New Roman" w:hAnsi="Times New Roman" w:eastAsia="Times New Roman"/>
+          <w:rFonts w:ascii="Times New Roman" w:hAnsi="Times New Roman"/>
           <w:b w:val="0"/>
-          <w:i w:val="0"/>
           <w:sz w:val="24"/>
         </w:rPr>
-        <w:t>Security Testing</w:t>
-      </w:r>
-      <w:r>
-        <w:rPr>
-          <w:rFonts w:ascii="Times New Roman" w:hAnsi="Times New Roman" w:eastAsia="Times New Roman"/>
-          <w:b w:val="0"/>
-          <w:i w:val="0"/>
-          <w:sz w:val="24"/>
-        </w:rPr>
-        <w:tab/>
-        <w:t>67</w:t>
+        <w:t>Security Testing . . . . . . . . . . . . . . . . . . . . . . . . . . . . . . . . . . . . . . . . . . . . . . . . . . . . . . . . . . . 67</w:t>
       </w:r>
     </w:p>
     <w:p>
       <w:pPr>
-        <w:tabs>
-          <w:tab w:pos="9184" w:val="right" w:leader="dot"/>
-        </w:tabs>
-        <w:spacing w:before="0" w:after="40" w:line="360" w:lineRule="exact"/>
+        <w:spacing w:before="20" w:after="20" w:line="259" w:lineRule="auto"/>
         <w:ind w:left="397"/>
-        <w:jc w:val="left"/>
       </w:pPr>
       <w:r>
         <w:rPr>
-          <w:rFonts w:ascii="Times New Roman" w:hAnsi="Times New Roman" w:eastAsia="Times New Roman"/>
+          <w:rFonts w:ascii="Times New Roman" w:hAnsi="Times New Roman"/>
           <w:b/>
-          <w:i w:val="0"/>
           <w:sz w:val="24"/>
         </w:rPr>
         <w:t xml:space="preserve">5.8. </w:t>
       </w:r>
       <w:r>
         <w:rPr>
-          <w:rFonts w:ascii="Times New Roman" w:hAnsi="Times New Roman" w:eastAsia="Times New Roman"/>
+          <w:rFonts w:ascii="Times New Roman" w:hAnsi="Times New Roman"/>
           <w:b w:val="0"/>
-          <w:i w:val="0"/>
           <w:sz w:val="24"/>
         </w:rPr>
-        <w:t>Validation Metrics</w:t>
-      </w:r>
-      <w:r>
-        <w:rPr>
-          <w:rFonts w:ascii="Times New Roman" w:hAnsi="Times New Roman" w:eastAsia="Times New Roman"/>
-          <w:b w:val="0"/>
-          <w:i w:val="0"/>
-          <w:sz w:val="24"/>
-        </w:rPr>
-        <w:tab/>
-        <w:t>68</w:t>
+        <w:t>Validation Metrics . . . . . . . . . . . . . . . . . . . . . . . . . . . . . . . . . . . . . . . . . . . . . . . . . . . . . . . . . 68</w:t>
       </w:r>
     </w:p>
     <w:p>
       <w:pPr>
-        <w:tabs>
-          <w:tab w:pos="9184" w:val="right" w:leader="dot"/>
-        </w:tabs>
-        <w:spacing w:before="0" w:after="40" w:line="360" w:lineRule="exact"/>
+        <w:spacing w:before="20" w:after="20" w:line="259" w:lineRule="auto"/>
         <w:ind w:left="397"/>
-        <w:jc w:val="left"/>
       </w:pPr>
       <w:r>
         <w:rPr>
-          <w:rFonts w:ascii="Times New Roman" w:hAnsi="Times New Roman" w:eastAsia="Times New Roman"/>
+          <w:rFonts w:ascii="Times New Roman" w:hAnsi="Times New Roman"/>
           <w:b/>
-          <w:i w:val="0"/>
           <w:sz w:val="24"/>
         </w:rPr>
         <w:t xml:space="preserve">5.9. </w:t>
       </w:r>
       <w:r>
         <w:rPr>
-          <w:rFonts w:ascii="Times New Roman" w:hAnsi="Times New Roman" w:eastAsia="Times New Roman"/>
+          <w:rFonts w:ascii="Times New Roman" w:hAnsi="Times New Roman"/>
           <w:b w:val="0"/>
-          <w:i w:val="0"/>
           <w:sz w:val="24"/>
         </w:rPr>
-        <w:t>Test Cases</w:t>
-      </w:r>
-      <w:r>
-        <w:rPr>
-          <w:rFonts w:ascii="Times New Roman" w:hAnsi="Times New Roman" w:eastAsia="Times New Roman"/>
-          <w:b w:val="0"/>
-          <w:i w:val="0"/>
-          <w:sz w:val="24"/>
-        </w:rPr>
-        <w:tab/>
-        <w:t>69</w:t>
+        <w:t>Test Cases . . . . . . . . . . . . . . . . . . . . . . . . . . . . . . . . . . . . . . . . . . . . . . . . . . . . . . . . . . . . . . . 69</w:t>
       </w:r>
     </w:p>
     <w:p>
       <w:pPr>
-        <w:tabs>
-          <w:tab w:pos="9184" w:val="right" w:leader="dot"/>
-        </w:tabs>
-        <w:spacing w:before="0" w:after="40" w:line="360" w:lineRule="exact"/>
+        <w:spacing w:before="20" w:after="20" w:line="259" w:lineRule="auto"/>
         <w:ind w:left="397"/>
-        <w:jc w:val="left"/>
       </w:pPr>
       <w:r>
         <w:rPr>
-          <w:rFonts w:ascii="Times New Roman" w:hAnsi="Times New Roman" w:eastAsia="Times New Roman"/>
+          <w:rFonts w:ascii="Times New Roman" w:hAnsi="Times New Roman"/>
           <w:b/>
-          <w:i w:val="0"/>
           <w:sz w:val="24"/>
         </w:rPr>
         <w:t xml:space="preserve">5.10. </w:t>
       </w:r>
       <w:r>
         <w:rPr>
-          <w:rFonts w:ascii="Times New Roman" w:hAnsi="Times New Roman" w:eastAsia="Times New Roman"/>
+          <w:rFonts w:ascii="Times New Roman" w:hAnsi="Times New Roman"/>
           <w:b w:val="0"/>
-          <w:i w:val="0"/>
           <w:sz w:val="24"/>
         </w:rPr>
-        <w:t>Defects Identified and corrections</w:t>
-      </w:r>
-      <w:r>
-        <w:rPr>
-          <w:rFonts w:ascii="Times New Roman" w:hAnsi="Times New Roman" w:eastAsia="Times New Roman"/>
-          <w:b w:val="0"/>
-          <w:i w:val="0"/>
-          <w:sz w:val="24"/>
-        </w:rPr>
-        <w:tab/>
-        <w:t>70</w:t>
+        <w:t>Defects Identified and corrections . . . . . . . . . . . . . . . . . . . . . . . . . . . . . . . . . . . . . . . . . . . . 70</w:t>
       </w:r>
     </w:p>
     <w:p>
       <w:pPr>
-        <w:tabs>
-          <w:tab w:pos="9184" w:val="right" w:leader="dot"/>
-        </w:tabs>
-        <w:spacing w:before="0" w:after="40" w:line="360" w:lineRule="exact"/>
+        <w:spacing w:before="20" w:after="20" w:line="259" w:lineRule="auto"/>
         <w:ind w:left="397"/>
-        <w:jc w:val="left"/>
       </w:pPr>
       <w:r>
         <w:rPr>
-          <w:rFonts w:ascii="Times New Roman" w:hAnsi="Times New Roman" w:eastAsia="Times New Roman"/>
+          <w:rFonts w:ascii="Times New Roman" w:hAnsi="Times New Roman"/>
           <w:b/>
-          <w:i w:val="0"/>
           <w:sz w:val="24"/>
         </w:rPr>
         <w:t xml:space="preserve">5.11. </w:t>
       </w:r>
       <w:r>
         <w:rPr>
-          <w:rFonts w:ascii="Times New Roman" w:hAnsi="Times New Roman" w:eastAsia="Times New Roman"/>
+          <w:rFonts w:ascii="Times New Roman" w:hAnsi="Times New Roman"/>
           <w:b w:val="0"/>
-          <w:i w:val="0"/>
           <w:sz w:val="24"/>
         </w:rPr>
-        <w:t>Chapter Summary</w:t>
-      </w:r>
-      <w:r>
-        <w:rPr>
-          <w:rFonts w:ascii="Times New Roman" w:hAnsi="Times New Roman" w:eastAsia="Times New Roman"/>
-          <w:b w:val="0"/>
-          <w:i w:val="0"/>
-          <w:sz w:val="24"/>
-        </w:rPr>
-        <w:tab/>
-        <w:t>71</w:t>
+        <w:t>Chapter Summary . . . . . . . . . . . . . . . . . . . . . . . . . . . . . . . . . . . . . . . . . . . . . . . . . . . . . . . . 71</w:t>
       </w:r>
     </w:p>
     <w:p>
       <w:pPr>
-        <w:spacing w:before="0" w:after="80" w:line="160" w:lineRule="exact"/>
-        <w:jc w:val="center"/>
+        <w:spacing w:after="120"/>
+      </w:pPr>
+    </w:p>
+    <w:p>
+      <w:pPr>
+        <w:spacing w:before="20" w:after="20" w:line="259" w:lineRule="auto"/>
       </w:pPr>
       <w:r>
         <w:rPr>
-          <w:rFonts w:ascii="Times New Roman" w:hAnsi="Times New Roman" w:eastAsia="Times New Roman"/>
-          <w:b w:val="0"/>
-          <w:i w:val="0"/>
-          <w:sz w:val="12"/>
+          <w:rFonts w:ascii="Times New Roman" w:hAnsi="Times New Roman"/>
+          <w:b/>
+          <w:sz w:val="24"/>
         </w:rPr>
+        <w:t>CHAPTER 6: COMMUNITY DEPLOYMENT AND IMPACT ASSESSMENT . . . . . . . . . . . 72</w:t>
       </w:r>
     </w:p>
     <w:p>
       <w:pPr>
-        <w:tabs>
-          <w:tab w:pos="9184" w:val="right" w:leader="dot"/>
-        </w:tabs>
-        <w:spacing w:before="0" w:after="40" w:line="360" w:lineRule="exact"/>
-        <w:jc w:val="left"/>
+        <w:spacing w:before="20" w:after="20" w:line="259" w:lineRule="auto"/>
+        <w:ind w:left="397"/>
       </w:pPr>
       <w:r>
         <w:rPr>
-          <w:rFonts w:ascii="Times New Roman" w:hAnsi="Times New Roman" w:eastAsia="Times New Roman"/>
+          <w:rFonts w:ascii="Times New Roman" w:hAnsi="Times New Roman"/>
           <w:b/>
-          <w:i w:val="0"/>
-          <w:sz w:val="24"/>
-        </w:rPr>
-        <w:t>CHAPTER 6: COMMUNITY DEPLOYMENT AND IMPACT ASSESSMENT</w:t>
-      </w:r>
-      <w:r>
-        <w:rPr>
-          <w:rFonts w:ascii="Times New Roman" w:hAnsi="Times New Roman" w:eastAsia="Times New Roman"/>
-          <w:b/>
-          <w:i w:val="0"/>
-          <w:sz w:val="24"/>
-        </w:rPr>
-        <w:tab/>
-        <w:t>72</w:t>
-      </w:r>
-    </w:p>
-    <w:p>
-      <w:pPr>
-        <w:tabs>
-          <w:tab w:pos="9184" w:val="right" w:leader="dot"/>
-        </w:tabs>
-        <w:spacing w:before="0" w:after="40" w:line="360" w:lineRule="exact"/>
-        <w:ind w:left="397"/>
-        <w:jc w:val="left"/>
-      </w:pPr>
-      <w:r>
-        <w:rPr>
-          <w:rFonts w:ascii="Times New Roman" w:hAnsi="Times New Roman" w:eastAsia="Times New Roman"/>
-          <w:b/>
-          <w:i w:val="0"/>
           <w:sz w:val="24"/>
         </w:rPr>
         <w:t xml:space="preserve">6.1. </w:t>
       </w:r>
       <w:r>
         <w:rPr>
-          <w:rFonts w:ascii="Times New Roman" w:hAnsi="Times New Roman" w:eastAsia="Times New Roman"/>
+          <w:rFonts w:ascii="Times New Roman" w:hAnsi="Times New Roman"/>
           <w:b w:val="0"/>
-          <w:i w:val="0"/>
           <w:sz w:val="24"/>
         </w:rPr>
-        <w:t>Beneficiary Profile</w:t>
-      </w:r>
-      <w:r>
-        <w:rPr>
-          <w:rFonts w:ascii="Times New Roman" w:hAnsi="Times New Roman" w:eastAsia="Times New Roman"/>
-          <w:b w:val="0"/>
-          <w:i w:val="0"/>
-          <w:sz w:val="24"/>
-        </w:rPr>
-        <w:tab/>
-        <w:t>72</w:t>
+        <w:t>Beneficiary Profile . . . . . . . . . . . . . . . . . . . . . . . . . . . . . . . . . . . . . . . . . . . . . . . . . . . . . . . . . 72</w:t>
       </w:r>
     </w:p>
     <w:p>
       <w:pPr>
-        <w:tabs>
-          <w:tab w:pos="9184" w:val="right" w:leader="dot"/>
-        </w:tabs>
-        <w:spacing w:before="0" w:after="40" w:line="360" w:lineRule="exact"/>
+        <w:spacing w:before="20" w:after="20" w:line="259" w:lineRule="auto"/>
         <w:ind w:left="397"/>
-        <w:jc w:val="left"/>
       </w:pPr>
       <w:r>
         <w:rPr>
-          <w:rFonts w:ascii="Times New Roman" w:hAnsi="Times New Roman" w:eastAsia="Times New Roman"/>
+          <w:rFonts w:ascii="Times New Roman" w:hAnsi="Times New Roman"/>
           <w:b/>
-          <w:i w:val="0"/>
           <w:sz w:val="24"/>
         </w:rPr>
         <w:t xml:space="preserve">6.2. </w:t>
       </w:r>
       <w:r>
         <w:rPr>
-          <w:rFonts w:ascii="Times New Roman" w:hAnsi="Times New Roman" w:eastAsia="Times New Roman"/>
+          <w:rFonts w:ascii="Times New Roman" w:hAnsi="Times New Roman"/>
           <w:b w:val="0"/>
-          <w:i w:val="0"/>
           <w:sz w:val="24"/>
         </w:rPr>
-        <w:t>Community Engagement Activities</w:t>
-      </w:r>
-      <w:r>
-        <w:rPr>
-          <w:rFonts w:ascii="Times New Roman" w:hAnsi="Times New Roman" w:eastAsia="Times New Roman"/>
-          <w:b w:val="0"/>
-          <w:i w:val="0"/>
-          <w:sz w:val="24"/>
-        </w:rPr>
-        <w:tab/>
-        <w:t>72</w:t>
+        <w:t>Community Engagement Activities . . . . . . . . . . . . . . . . . . . . . . . . . . . . . . . . . . . . . . . . . . . . 72</w:t>
       </w:r>
     </w:p>
     <w:p>
       <w:pPr>
-        <w:tabs>
-          <w:tab w:pos="9184" w:val="right" w:leader="dot"/>
-        </w:tabs>
-        <w:spacing w:before="0" w:after="40" w:line="360" w:lineRule="exact"/>
+        <w:spacing w:before="20" w:after="20" w:line="259" w:lineRule="auto"/>
         <w:ind w:left="397"/>
-        <w:jc w:val="left"/>
       </w:pPr>
       <w:r>
         <w:rPr>
-          <w:rFonts w:ascii="Times New Roman" w:hAnsi="Times New Roman" w:eastAsia="Times New Roman"/>
+          <w:rFonts w:ascii="Times New Roman" w:hAnsi="Times New Roman"/>
           <w:b/>
-          <w:i w:val="0"/>
           <w:sz w:val="24"/>
         </w:rPr>
         <w:t xml:space="preserve">6.3. </w:t>
       </w:r>
       <w:r>
         <w:rPr>
-          <w:rFonts w:ascii="Times New Roman" w:hAnsi="Times New Roman" w:eastAsia="Times New Roman"/>
+          <w:rFonts w:ascii="Times New Roman" w:hAnsi="Times New Roman"/>
           <w:b w:val="0"/>
-          <w:i w:val="0"/>
           <w:sz w:val="24"/>
         </w:rPr>
-        <w:t>Pilot Deployment</w:t>
-      </w:r>
-      <w:r>
-        <w:rPr>
-          <w:rFonts w:ascii="Times New Roman" w:hAnsi="Times New Roman" w:eastAsia="Times New Roman"/>
-          <w:b w:val="0"/>
-          <w:i w:val="0"/>
-          <w:sz w:val="24"/>
-        </w:rPr>
-        <w:tab/>
-        <w:t>73</w:t>
+        <w:t>Pilot Deployment . . . . . . . . . . . . . . . . . . . . . . . . . . . . . . . . . . . . . . . . . . . . . . . . . . . . . . . . . . 73</w:t>
       </w:r>
     </w:p>
     <w:p>
       <w:pPr>
-        <w:tabs>
-          <w:tab w:pos="9184" w:val="right" w:leader="dot"/>
-        </w:tabs>
-        <w:spacing w:before="0" w:after="40" w:line="360" w:lineRule="exact"/>
+        <w:spacing w:before="20" w:after="20" w:line="259" w:lineRule="auto"/>
         <w:ind w:left="397"/>
-        <w:jc w:val="left"/>
       </w:pPr>
       <w:r>
         <w:rPr>
-          <w:rFonts w:ascii="Times New Roman" w:hAnsi="Times New Roman" w:eastAsia="Times New Roman"/>
+          <w:rFonts w:ascii="Times New Roman" w:hAnsi="Times New Roman"/>
           <w:b/>
-          <w:i w:val="0"/>
           <w:sz w:val="24"/>
         </w:rPr>
         <w:t xml:space="preserve">6.4. </w:t>
       </w:r>
       <w:r>
         <w:rPr>
-          <w:rFonts w:ascii="Times New Roman" w:hAnsi="Times New Roman" w:eastAsia="Times New Roman"/>
+          <w:rFonts w:ascii="Times New Roman" w:hAnsi="Times New Roman"/>
           <w:b w:val="0"/>
-          <w:i w:val="0"/>
           <w:sz w:val="24"/>
         </w:rPr>
-        <w:t>User Training</w:t>
-      </w:r>
-      <w:r>
-        <w:rPr>
-          <w:rFonts w:ascii="Times New Roman" w:hAnsi="Times New Roman" w:eastAsia="Times New Roman"/>
-          <w:b w:val="0"/>
-          <w:i w:val="0"/>
-          <w:sz w:val="24"/>
-        </w:rPr>
-        <w:tab/>
-        <w:t>74</w:t>
+        <w:t>User Training . . . . . . . . . . . . . . . . . . . . . . . . . . . . . . . . . . . . . . . . . . . . . . . . . . . . . . . . . . . . . 74</w:t>
       </w:r>
     </w:p>
     <w:p>
       <w:pPr>
-        <w:tabs>
-          <w:tab w:pos="9184" w:val="right" w:leader="dot"/>
-        </w:tabs>
-        <w:spacing w:before="0" w:after="40" w:line="360" w:lineRule="exact"/>
+        <w:spacing w:before="20" w:after="20" w:line="259" w:lineRule="auto"/>
         <w:ind w:left="397"/>
-        <w:jc w:val="left"/>
       </w:pPr>
       <w:r>
         <w:rPr>
-          <w:rFonts w:ascii="Times New Roman" w:hAnsi="Times New Roman" w:eastAsia="Times New Roman"/>
+          <w:rFonts w:ascii="Times New Roman" w:hAnsi="Times New Roman"/>
           <w:b/>
-          <w:i w:val="0"/>
           <w:sz w:val="24"/>
         </w:rPr>
         <w:t xml:space="preserve">6.5. </w:t>
       </w:r>
       <w:r>
         <w:rPr>
-          <w:rFonts w:ascii="Times New Roman" w:hAnsi="Times New Roman" w:eastAsia="Times New Roman"/>
+          <w:rFonts w:ascii="Times New Roman" w:hAnsi="Times New Roman"/>
           <w:b w:val="0"/>
-          <w:i w:val="0"/>
           <w:sz w:val="24"/>
         </w:rPr>
-        <w:t>Feedback Collection</w:t>
-      </w:r>
-      <w:r>
-        <w:rPr>
-          <w:rFonts w:ascii="Times New Roman" w:hAnsi="Times New Roman" w:eastAsia="Times New Roman"/>
-          <w:b w:val="0"/>
-          <w:i w:val="0"/>
-          <w:sz w:val="24"/>
-        </w:rPr>
-        <w:tab/>
-        <w:t>75</w:t>
+        <w:t>Feedback Collection . . . . . . . . . . . . . . . . . . . . . . . . . . . . . . . . . . . . . . . . . . . . . . . . . . . . . . . 75</w:t>
       </w:r>
     </w:p>
     <w:p>
       <w:pPr>
-        <w:tabs>
-          <w:tab w:pos="9184" w:val="right" w:leader="dot"/>
-        </w:tabs>
-        <w:spacing w:before="0" w:after="40" w:line="360" w:lineRule="exact"/>
+        <w:spacing w:before="20" w:after="20" w:line="259" w:lineRule="auto"/>
         <w:ind w:left="397"/>
-        <w:jc w:val="left"/>
       </w:pPr>
       <w:r>
         <w:rPr>
-          <w:rFonts w:ascii="Times New Roman" w:hAnsi="Times New Roman" w:eastAsia="Times New Roman"/>
+          <w:rFonts w:ascii="Times New Roman" w:hAnsi="Times New Roman"/>
           <w:b/>
-          <w:i w:val="0"/>
           <w:sz w:val="24"/>
         </w:rPr>
         <w:t xml:space="preserve">6.6. </w:t>
       </w:r>
       <w:r>
         <w:rPr>
-          <w:rFonts w:ascii="Times New Roman" w:hAnsi="Times New Roman" w:eastAsia="Times New Roman"/>
+          <w:rFonts w:ascii="Times New Roman" w:hAnsi="Times New Roman"/>
           <w:b w:val="0"/>
-          <w:i w:val="0"/>
           <w:sz w:val="24"/>
         </w:rPr>
-        <w:t>Feedback Analysis</w:t>
-      </w:r>
-      <w:r>
-        <w:rPr>
-          <w:rFonts w:ascii="Times New Roman" w:hAnsi="Times New Roman" w:eastAsia="Times New Roman"/>
-          <w:b w:val="0"/>
-          <w:i w:val="0"/>
-          <w:sz w:val="24"/>
-        </w:rPr>
-        <w:tab/>
-        <w:t>75</w:t>
+        <w:t>Feedback Analysis . . . . . . . . . . . . . . . . . . . . . . . . . . . . . . . . . . . . . . . . . . . . . . . . . . . . . . . . . 75</w:t>
       </w:r>
     </w:p>
     <w:p>
       <w:pPr>
-        <w:tabs>
-          <w:tab w:pos="9184" w:val="right" w:leader="dot"/>
-        </w:tabs>
-        <w:spacing w:before="0" w:after="40" w:line="360" w:lineRule="exact"/>
+        <w:spacing w:before="20" w:after="20" w:line="259" w:lineRule="auto"/>
         <w:ind w:left="397"/>
-        <w:jc w:val="left"/>
       </w:pPr>
       <w:r>
         <w:rPr>
-          <w:rFonts w:ascii="Times New Roman" w:hAnsi="Times New Roman" w:eastAsia="Times New Roman"/>
+          <w:rFonts w:ascii="Times New Roman" w:hAnsi="Times New Roman"/>
           <w:b/>
-          <w:i w:val="0"/>
           <w:sz w:val="24"/>
         </w:rPr>
         <w:t xml:space="preserve">6.7. </w:t>
       </w:r>
       <w:r>
         <w:rPr>
-          <w:rFonts w:ascii="Times New Roman" w:hAnsi="Times New Roman" w:eastAsia="Times New Roman"/>
+          <w:rFonts w:ascii="Times New Roman" w:hAnsi="Times New Roman"/>
           <w:b w:val="0"/>
-          <w:i w:val="0"/>
           <w:sz w:val="24"/>
         </w:rPr>
-        <w:t>Impact Assessment</w:t>
-      </w:r>
-      <w:r>
-        <w:rPr>
-          <w:rFonts w:ascii="Times New Roman" w:hAnsi="Times New Roman" w:eastAsia="Times New Roman"/>
-          <w:b w:val="0"/>
-          <w:i w:val="0"/>
-          <w:sz w:val="24"/>
-        </w:rPr>
-        <w:tab/>
-        <w:t>77</w:t>
+        <w:t>Impact Assessment . . . . . . . . . . . . . . . . . . . . . . . . . . . . . . . . . . . . . . . . . . . . . . . . . . . . . . . . 77</w:t>
       </w:r>
     </w:p>
     <w:p>
       <w:pPr>
-        <w:tabs>
-          <w:tab w:pos="9184" w:val="right" w:leader="dot"/>
-        </w:tabs>
-        <w:spacing w:before="0" w:after="40" w:line="360" w:lineRule="exact"/>
+        <w:spacing w:before="20" w:after="20" w:line="259" w:lineRule="auto"/>
         <w:ind w:left="397"/>
-        <w:jc w:val="left"/>
       </w:pPr>
       <w:r>
         <w:rPr>
-          <w:rFonts w:ascii="Times New Roman" w:hAnsi="Times New Roman" w:eastAsia="Times New Roman"/>
+          <w:rFonts w:ascii="Times New Roman" w:hAnsi="Times New Roman"/>
           <w:b/>
-          <w:i w:val="0"/>
           <w:sz w:val="24"/>
         </w:rPr>
         <w:t xml:space="preserve">6.8. </w:t>
       </w:r>
       <w:r>
         <w:rPr>
-          <w:rFonts w:ascii="Times New Roman" w:hAnsi="Times New Roman" w:eastAsia="Times New Roman"/>
+          <w:rFonts w:ascii="Times New Roman" w:hAnsi="Times New Roman"/>
           <w:b w:val="0"/>
-          <w:i w:val="0"/>
           <w:sz w:val="24"/>
         </w:rPr>
-        <w:t>Outcome Achievement Matrix</w:t>
-      </w:r>
-      <w:r>
-        <w:rPr>
-          <w:rFonts w:ascii="Times New Roman" w:hAnsi="Times New Roman" w:eastAsia="Times New Roman"/>
-          <w:b w:val="0"/>
-          <w:i w:val="0"/>
-          <w:sz w:val="24"/>
-        </w:rPr>
-        <w:tab/>
-        <w:t>78</w:t>
+        <w:t>Outcome Achievement Matrix . . . . . . . . . . . . . . . . . . . . . . . . . . . . . . . . . . . . . . . . . . . . . . . 78</w:t>
       </w:r>
     </w:p>
     <w:p>
       <w:pPr>
-        <w:tabs>
-          <w:tab w:pos="9184" w:val="right" w:leader="dot"/>
-        </w:tabs>
-        <w:spacing w:before="0" w:after="40" w:line="360" w:lineRule="exact"/>
+        <w:spacing w:before="20" w:after="20" w:line="259" w:lineRule="auto"/>
         <w:ind w:left="397"/>
-        <w:jc w:val="left"/>
       </w:pPr>
       <w:r>
         <w:rPr>
-          <w:rFonts w:ascii="Times New Roman" w:hAnsi="Times New Roman" w:eastAsia="Times New Roman"/>
+          <w:rFonts w:ascii="Times New Roman" w:hAnsi="Times New Roman"/>
           <w:b/>
-          <w:i w:val="0"/>
           <w:sz w:val="24"/>
         </w:rPr>
         <w:t xml:space="preserve">6.9. </w:t>
       </w:r>
       <w:r>
         <w:rPr>
-          <w:rFonts w:ascii="Times New Roman" w:hAnsi="Times New Roman" w:eastAsia="Times New Roman"/>
+          <w:rFonts w:ascii="Times New Roman" w:hAnsi="Times New Roman"/>
           <w:b w:val="0"/>
-          <w:i w:val="0"/>
           <w:sz w:val="24"/>
         </w:rPr>
-        <w:t>Sustainability Plan</w:t>
-      </w:r>
-      <w:r>
-        <w:rPr>
-          <w:rFonts w:ascii="Times New Roman" w:hAnsi="Times New Roman" w:eastAsia="Times New Roman"/>
-          <w:b w:val="0"/>
-          <w:i w:val="0"/>
-          <w:sz w:val="24"/>
-        </w:rPr>
-        <w:tab/>
-        <w:t>79</w:t>
+        <w:t>Sustainability Plan . . . . . . . . . . . . . . . . . . . . . . . . . . . . . . . . . . . . . . . . . . . . . . . . . . . . . . . . . 79</w:t>
       </w:r>
     </w:p>
     <w:p>
       <w:pPr>
-        <w:spacing w:before="0" w:after="80" w:line="160" w:lineRule="exact"/>
-        <w:jc w:val="center"/>
+        <w:spacing w:after="120"/>
+      </w:pPr>
+    </w:p>
+    <w:p>
+      <w:pPr>
+        <w:spacing w:before="20" w:after="20" w:line="259" w:lineRule="auto"/>
       </w:pPr>
       <w:r>
         <w:rPr>
-          <w:rFonts w:ascii="Times New Roman" w:hAnsi="Times New Roman" w:eastAsia="Times New Roman"/>
-          <w:b w:val="0"/>
-          <w:i w:val="0"/>
-          <w:sz w:val="12"/>
+          <w:rFonts w:ascii="Times New Roman" w:hAnsi="Times New Roman"/>
+          <w:b/>
+          <w:sz w:val="24"/>
         </w:rPr>
+        <w:t>CHAPTER 7: RESULTS, DISCUSSION, CONCLUSION AND FUTURE SCOPE . . . . . . . . . 80</w:t>
       </w:r>
     </w:p>
     <w:p>
       <w:pPr>
-        <w:tabs>
-          <w:tab w:pos="9184" w:val="right" w:leader="dot"/>
-        </w:tabs>
-        <w:spacing w:before="0" w:after="40" w:line="360" w:lineRule="exact"/>
-        <w:jc w:val="left"/>
+        <w:spacing w:before="20" w:after="20" w:line="259" w:lineRule="auto"/>
+        <w:ind w:left="397"/>
       </w:pPr>
       <w:r>
         <w:rPr>
-          <w:rFonts w:ascii="Times New Roman" w:hAnsi="Times New Roman" w:eastAsia="Times New Roman"/>
+          <w:rFonts w:ascii="Times New Roman" w:hAnsi="Times New Roman"/>
           <w:b/>
-          <w:i w:val="0"/>
-          <w:sz w:val="24"/>
-        </w:rPr>
-        <w:t>CHAPTER 7: RESULTS, DISCUSSION, CONCLUSION AND FUTURE SCOPE</w:t>
-      </w:r>
-      <w:r>
-        <w:rPr>
-          <w:rFonts w:ascii="Times New Roman" w:hAnsi="Times New Roman" w:eastAsia="Times New Roman"/>
-          <w:b/>
-          <w:i w:val="0"/>
-          <w:sz w:val="24"/>
-        </w:rPr>
-        <w:tab/>
-        <w:t>80</w:t>
-      </w:r>
-    </w:p>
-    <w:p>
-      <w:pPr>
-        <w:tabs>
-          <w:tab w:pos="9184" w:val="right" w:leader="dot"/>
-        </w:tabs>
-        <w:spacing w:before="0" w:after="40" w:line="360" w:lineRule="exact"/>
-        <w:ind w:left="397"/>
-        <w:jc w:val="left"/>
-      </w:pPr>
-      <w:r>
-        <w:rPr>
-          <w:rFonts w:ascii="Times New Roman" w:hAnsi="Times New Roman" w:eastAsia="Times New Roman"/>
-          <w:b/>
-          <w:i w:val="0"/>
           <w:sz w:val="24"/>
         </w:rPr>
         <w:t xml:space="preserve">7.1. </w:t>
       </w:r>
       <w:r>
         <w:rPr>
-          <w:rFonts w:ascii="Times New Roman" w:hAnsi="Times New Roman" w:eastAsia="Times New Roman"/>
+          <w:rFonts w:ascii="Times New Roman" w:hAnsi="Times New Roman"/>
           <w:b w:val="0"/>
-          <w:i w:val="0"/>
           <w:sz w:val="24"/>
         </w:rPr>
-        <w:t>Results and Discussion</w:t>
-      </w:r>
-      <w:r>
-        <w:rPr>
-          <w:rFonts w:ascii="Times New Roman" w:hAnsi="Times New Roman" w:eastAsia="Times New Roman"/>
-          <w:b w:val="0"/>
-          <w:i w:val="0"/>
-          <w:sz w:val="24"/>
-        </w:rPr>
-        <w:tab/>
-        <w:t>80</w:t>
+        <w:t>Results and Discussion . . . . . . . . . . . . . . . . . . . . . . . . . . . . . . . . . . . . . . . . . . . . . . . . . . . . . 80</w:t>
       </w:r>
     </w:p>
     <w:p>
       <w:pPr>
-        <w:tabs>
-          <w:tab w:pos="9184" w:val="right" w:leader="dot"/>
-        </w:tabs>
-        <w:spacing w:before="0" w:after="40" w:line="360" w:lineRule="exact"/>
+        <w:spacing w:before="20" w:after="20" w:line="259" w:lineRule="auto"/>
         <w:ind w:left="397"/>
-        <w:jc w:val="left"/>
       </w:pPr>
       <w:r>
         <w:rPr>
-          <w:rFonts w:ascii="Times New Roman" w:hAnsi="Times New Roman" w:eastAsia="Times New Roman"/>
+          <w:rFonts w:ascii="Times New Roman" w:hAnsi="Times New Roman"/>
           <w:b/>
-          <w:i w:val="0"/>
           <w:sz w:val="24"/>
         </w:rPr>
         <w:t xml:space="preserve">7.2. </w:t>
       </w:r>
       <w:r>
         <w:rPr>
-          <w:rFonts w:ascii="Times New Roman" w:hAnsi="Times New Roman" w:eastAsia="Times New Roman"/>
+          <w:rFonts w:ascii="Times New Roman" w:hAnsi="Times New Roman"/>
           <w:b w:val="0"/>
-          <w:i w:val="0"/>
           <w:sz w:val="24"/>
         </w:rPr>
-        <w:t>Achievement of Objectives</w:t>
-      </w:r>
-      <w:r>
-        <w:rPr>
-          <w:rFonts w:ascii="Times New Roman" w:hAnsi="Times New Roman" w:eastAsia="Times New Roman"/>
-          <w:b w:val="0"/>
-          <w:i w:val="0"/>
-          <w:sz w:val="24"/>
-        </w:rPr>
-        <w:tab/>
-        <w:t>81</w:t>
+        <w:t>Achievement of Objectives . . . . . . . . . . . . . . . . . . . . . . . . . . . . . . . . . . . . . . . . . . . . . . . . . . 81</w:t>
       </w:r>
     </w:p>
     <w:p>
       <w:pPr>
-        <w:tabs>
-          <w:tab w:pos="9184" w:val="right" w:leader="dot"/>
-        </w:tabs>
-        <w:spacing w:before="0" w:after="40" w:line="360" w:lineRule="exact"/>
+        <w:spacing w:before="20" w:after="20" w:line="259" w:lineRule="auto"/>
         <w:ind w:left="397"/>
-        <w:jc w:val="left"/>
       </w:pPr>
       <w:r>
         <w:rPr>
-          <w:rFonts w:ascii="Times New Roman" w:hAnsi="Times New Roman" w:eastAsia="Times New Roman"/>
+          <w:rFonts w:ascii="Times New Roman" w:hAnsi="Times New Roman"/>
           <w:b/>
-          <w:i w:val="0"/>
           <w:sz w:val="24"/>
         </w:rPr>
         <w:t xml:space="preserve">7.3. </w:t>
       </w:r>
       <w:r>
         <w:rPr>
-          <w:rFonts w:ascii="Times New Roman" w:hAnsi="Times New Roman" w:eastAsia="Times New Roman"/>
+          <w:rFonts w:ascii="Times New Roman" w:hAnsi="Times New Roman"/>
           <w:b w:val="0"/>
-          <w:i w:val="0"/>
           <w:sz w:val="24"/>
         </w:rPr>
-        <w:t>Project Contributions</w:t>
-      </w:r>
-      <w:r>
-        <w:rPr>
-          <w:rFonts w:ascii="Times New Roman" w:hAnsi="Times New Roman" w:eastAsia="Times New Roman"/>
-          <w:b w:val="0"/>
-          <w:i w:val="0"/>
-          <w:sz w:val="24"/>
-        </w:rPr>
-        <w:tab/>
-        <w:t>82</w:t>
+        <w:t>Project Contributions . . . . . . . . . . . . . . . . . . . . . . . . . . . . . . . . . . . . . . . . . . . . . . . . . . . . . . . 82</w:t>
       </w:r>
     </w:p>
     <w:p>
       <w:pPr>
-        <w:tabs>
-          <w:tab w:pos="9184" w:val="right" w:leader="dot"/>
-        </w:tabs>
-        <w:spacing w:before="0" w:after="40" w:line="360" w:lineRule="exact"/>
+        <w:spacing w:before="20" w:after="20" w:line="259" w:lineRule="auto"/>
         <w:ind w:left="397"/>
-        <w:jc w:val="left"/>
       </w:pPr>
       <w:r>
         <w:rPr>
-          <w:rFonts w:ascii="Times New Roman" w:hAnsi="Times New Roman" w:eastAsia="Times New Roman"/>
+          <w:rFonts w:ascii="Times New Roman" w:hAnsi="Times New Roman"/>
           <w:b/>
-          <w:i w:val="0"/>
           <w:sz w:val="24"/>
         </w:rPr>
         <w:t xml:space="preserve">7.4. </w:t>
       </w:r>
       <w:r>
         <w:rPr>
-          <w:rFonts w:ascii="Times New Roman" w:hAnsi="Times New Roman" w:eastAsia="Times New Roman"/>
+          <w:rFonts w:ascii="Times New Roman" w:hAnsi="Times New Roman"/>
           <w:b w:val="0"/>
-          <w:i w:val="0"/>
           <w:sz w:val="24"/>
         </w:rPr>
-        <w:t>Limitations</w:t>
-      </w:r>
-      <w:r>
-        <w:rPr>
-          <w:rFonts w:ascii="Times New Roman" w:hAnsi="Times New Roman" w:eastAsia="Times New Roman"/>
-          <w:b w:val="0"/>
-          <w:i w:val="0"/>
-          <w:sz w:val="24"/>
-        </w:rPr>
-        <w:tab/>
-        <w:t>83</w:t>
+        <w:t>Limitations . . . . . . . . . . . . . . . . . . . . . . . . . . . . . . . . . . . . . . . . . . . . . . . . . . . . . . . . . . . . . . . 83</w:t>
       </w:r>
     </w:p>
     <w:p>
       <w:pPr>
-        <w:tabs>
-          <w:tab w:pos="9184" w:val="right" w:leader="dot"/>
-        </w:tabs>
-        <w:spacing w:before="0" w:after="40" w:line="360" w:lineRule="exact"/>
+        <w:spacing w:before="20" w:after="20" w:line="259" w:lineRule="auto"/>
         <w:ind w:left="397"/>
-        <w:jc w:val="left"/>
       </w:pPr>
       <w:r>
         <w:rPr>
-          <w:rFonts w:ascii="Times New Roman" w:hAnsi="Times New Roman" w:eastAsia="Times New Roman"/>
+          <w:rFonts w:ascii="Times New Roman" w:hAnsi="Times New Roman"/>
           <w:b/>
-          <w:i w:val="0"/>
           <w:sz w:val="24"/>
         </w:rPr>
         <w:t xml:space="preserve">7.5. </w:t>
       </w:r>
       <w:r>
         <w:rPr>
-          <w:rFonts w:ascii="Times New Roman" w:hAnsi="Times New Roman" w:eastAsia="Times New Roman"/>
+          <w:rFonts w:ascii="Times New Roman" w:hAnsi="Times New Roman"/>
           <w:b w:val="0"/>
-          <w:i w:val="0"/>
           <w:sz w:val="24"/>
         </w:rPr>
-        <w:t>Future Enhancements</w:t>
-      </w:r>
-      <w:r>
-        <w:rPr>
-          <w:rFonts w:ascii="Times New Roman" w:hAnsi="Times New Roman" w:eastAsia="Times New Roman"/>
-          <w:b w:val="0"/>
-          <w:i w:val="0"/>
-          <w:sz w:val="24"/>
-        </w:rPr>
-        <w:tab/>
-        <w:t>84</w:t>
+        <w:t>Future Enhancements . . . . . . . . . . . . . . . . . . . . . . . . . . . . . . . . . . . . . . . . . . . . . . . . . . . . . . 84</w:t>
       </w:r>
     </w:p>
     <w:p>
       <w:pPr>
-        <w:tabs>
-          <w:tab w:pos="9184" w:val="right" w:leader="dot"/>
-        </w:tabs>
-        <w:spacing w:before="0" w:after="40" w:line="360" w:lineRule="exact"/>
+        <w:spacing w:before="20" w:after="20" w:line="259" w:lineRule="auto"/>
         <w:ind w:left="397"/>
-        <w:jc w:val="left"/>
       </w:pPr>
       <w:r>
         <w:rPr>
-          <w:rFonts w:ascii="Times New Roman" w:hAnsi="Times New Roman" w:eastAsia="Times New Roman"/>
+          <w:rFonts w:ascii="Times New Roman" w:hAnsi="Times New Roman"/>
           <w:b/>
-          <w:i w:val="0"/>
           <w:sz w:val="24"/>
         </w:rPr>
         <w:t xml:space="preserve">7.6. </w:t>
       </w:r>
       <w:r>
         <w:rPr>
-          <w:rFonts w:ascii="Times New Roman" w:hAnsi="Times New Roman" w:eastAsia="Times New Roman"/>
+          <w:rFonts w:ascii="Times New Roman" w:hAnsi="Times New Roman"/>
           <w:b w:val="0"/>
-          <w:i w:val="0"/>
           <w:sz w:val="24"/>
         </w:rPr>
-        <w:t>Conclusion</w:t>
-      </w:r>
-      <w:r>
-        <w:rPr>
-          <w:rFonts w:ascii="Times New Roman" w:hAnsi="Times New Roman" w:eastAsia="Times New Roman"/>
-          <w:b w:val="0"/>
-          <w:i w:val="0"/>
-          <w:sz w:val="24"/>
-        </w:rPr>
-        <w:tab/>
-        <w:t>85</w:t>
+        <w:t>Conclusion . . . . . . . . . . . . . . . . . . . . . . . . . . . . . . . . . . . . . . . . . . . . . . . . . . . . . . . . . . . . . . . 85</w:t>
       </w:r>
     </w:p>
     <w:p>
       <w:pPr>
-        <w:spacing w:before="0" w:after="80" w:line="160" w:lineRule="exact"/>
-        <w:jc w:val="center"/>
+        <w:spacing w:after="120"/>
+      </w:pPr>
+    </w:p>
+    <w:p>
+      <w:pPr>
+        <w:spacing w:before="20" w:after="20" w:line="259" w:lineRule="auto"/>
       </w:pPr>
       <w:r>
         <w:rPr>
-          <w:rFonts w:ascii="Times New Roman" w:hAnsi="Times New Roman" w:eastAsia="Times New Roman"/>
-          <w:b w:val="0"/>
-          <w:i w:val="0"/>
-          <w:sz w:val="12"/>
+          <w:rFonts w:ascii="Times New Roman" w:hAnsi="Times New Roman"/>
+          <w:b/>
+          <w:sz w:val="24"/>
         </w:rPr>
+        <w:t>REFERENCES . . . . . . . . . . . . . . . . . . . . . . . . . . . . . . . . . . . . . . . . . . . . . . . . . . . . . . . . . . . . . . . . . 86</w:t>
       </w:r>
     </w:p>
     <w:p>
       <w:pPr>
-        <w:tabs>
-          <w:tab w:pos="9184" w:val="right" w:leader="dot"/>
-        </w:tabs>
-        <w:spacing w:before="0" w:after="40" w:line="360" w:lineRule="exact"/>
-        <w:jc w:val="left"/>
+        <w:spacing w:before="20" w:after="20" w:line="259" w:lineRule="auto"/>
       </w:pPr>
       <w:r>
         <w:rPr>
-          <w:rFonts w:ascii="Times New Roman" w:hAnsi="Times New Roman" w:eastAsia="Times New Roman"/>
+          <w:rFonts w:ascii="Times New Roman" w:hAnsi="Times New Roman"/>
           <w:b/>
-          <w:i w:val="0"/>
           <w:sz w:val="24"/>
         </w:rPr>
-        <w:t>REFERENCES</w:t>
-      </w:r>
-      <w:r>
-        <w:rPr>
-          <w:rFonts w:ascii="Times New Roman" w:hAnsi="Times New Roman" w:eastAsia="Times New Roman"/>
-          <w:b/>
-          <w:i w:val="0"/>
-          <w:sz w:val="24"/>
-        </w:rPr>
-        <w:tab/>
-        <w:t>86</w:t>
-      </w:r>
-    </w:p>
-    <w:p>
-      <w:pPr>
-        <w:tabs>
-          <w:tab w:pos="9184" w:val="right" w:leader="dot"/>
-        </w:tabs>
-        <w:spacing w:before="0" w:after="40" w:line="360" w:lineRule="exact"/>
-        <w:jc w:val="left"/>
-      </w:pPr>
-      <w:r>
-        <w:rPr>
-          <w:rFonts w:ascii="Times New Roman" w:hAnsi="Times New Roman" w:eastAsia="Times New Roman"/>
-          <w:b/>
-          <w:i w:val="0"/>
-          <w:sz w:val="24"/>
-        </w:rPr>
-        <w:t>ANNEXURES</w:t>
-      </w:r>
-      <w:r>
-        <w:rPr>
-          <w:rFonts w:ascii="Times New Roman" w:hAnsi="Times New Roman" w:eastAsia="Times New Roman"/>
-          <w:b/>
-          <w:i w:val="0"/>
-          <w:sz w:val="24"/>
-        </w:rPr>
-        <w:tab/>
-        <w:t>89 onwards</w:t>
+        <w:t>ANNEXURES . . . . . . . . . . . . . . . . . . . . . . . . . . . . . . . . . . . . . . . . . . . . . . . . . . . . . . . . . . 89 onwards</w:t>
       </w:r>
     </w:p>
     <w:sectPr>

</xml_diff>